<commit_message>
Create 10 intake-pending client profiles from Jason Bethea's SOAP notes; add Siobhan Hansen left hip tendinitis flag
</commit_message>
<xml_diff>
--- a/clients/siobhan_hansen/Siobhan_Hansen_3Day_Training_Plan.docx
+++ b/clients/siobhan_hansen/Siobhan_Hansen_3Day_Training_Plan.docx
@@ -3016,6 +3016,31 @@
     </w:p>
     <w:p>
       <w:pPr>
+        <w:spacing w:after="100"/>
+      </w:pPr>
+      <w:r>
+        <w:rPr>
+          <w:rFonts w:ascii="Arial" w:cs="Arial" w:eastAsia="Arial" w:hAnsi="Arial"/>
+          <w:b/>
+          <w:bCs/>
+          <w:color w:val="E53935"/>
+          <w:sz w:val="17"/>
+          <w:szCs w:val="17"/>
+        </w:rPr>
+        <w:t xml:space="preserve">Left Hip — Overuse/Chronic Tendinitis, Active Rehab Stage (Coordinated with Jason Bethea):  </w:t>
+      </w:r>
+      <w:r>
+        <w:rPr>
+          <w:rFonts w:ascii="Arial" w:cs="Arial" w:eastAsia="Arial" w:hAnsi="Arial"/>
+          <w:color w:val="2C2C2C"/>
+          <w:sz w:val="17"/>
+          <w:szCs w:val="17"/>
+        </w:rPr>
+        <w:t xml:space="preserve">New finding (SOAP note dated 8/6/2026, not previously documented anywhere in this program): "Hip &amp; Pelvis — Overuse/Chronic · Left · Severity 4 · Tendinitis," with the note "Still in the rehab stage for left hip." Coordinated with Jason Bethea, Brace Life's in-house Trainer/Physical Therapist. This is an active, currently-rehabbing finding, not a historical footnote — it directly overlaps with real left-side hip-loading content already in this program: left leg leads every unilateral leg exercise on Day 2 (Squat, Single-Leg Stance Squat, Single-Leg RDL) and Day 3's hip-dominant work (Hex Bar Deadlift, DB Hip Thrust, Box Step-Up Jump). None of that content is removed — per this system's "strengthen with precautions, not restrictions" principle, the hip stays trained, but every set of that loaded work now carries explicit pain-monitoring language: sharp, pinching, or catching pain anywhere in the front/side of the left hip is the stop signal — regress load, range, or substitute the exercise and flag Jason Bethea; ordinary muscular fatigue or normal training soreness is not a stop signal. Hip activation work in Day 2 Block A and Day 3 Block A (banded clamshell, hip abduction, bird dog) is unaffected — light, controlled activation work is generally well-tolerated in a rehabbing-tendinitis presentation and is not restricted here.</w:t>
+      </w:r>
+    </w:p>
+    <w:p>
+      <w:pPr>
         <w:spacing w:after="80"/>
       </w:pPr>
     </w:p>
@@ -8740,7 +8765,7 @@
           <w:sz w:val="17"/>
           <w:szCs w:val="17"/>
         </w:rPr>
-        <w:t xml:space="preserve">Primes glute medius and hip stabilizers ahead of the loaded single-leg work below — left leg leads throughout given the segmental LST gap.</w:t>
+        <w:t xml:space="preserve">Primes glute medius and hip stabilizers ahead of the loaded single-leg work below — left leg leads throughout given the segmental LST gap. Left hip is in active rehab for overuse tendinitis (coordinated with Jason Bethea) — this activation work is well-tolerated, but every loaded exercise below is pain-monitored: sharp/pinching/catching hip pain is the stop signal, ordinary fatigue is not.</w:t>
       </w:r>
     </w:p>
     <w:tbl>
@@ -9816,6 +9841,19 @@
               <w:t xml:space="preserve">Squat</w:t>
             </w:r>
           </w:p>
+          <w:p>
+            <w:r>
+              <w:rPr>
+                <w:rFonts w:ascii="Arial" w:cs="Arial" w:eastAsia="Arial" w:hAnsi="Arial"/>
+                <w:i/>
+                <w:iCs/>
+                <w:color w:val="B71C1C"/>
+                <w:sz w:val="14"/>
+                <w:szCs w:val="14"/>
+              </w:rPr>
+              <w:t xml:space="preserve">Left hip — active tendinitis rehab; stop at sharp/pinching pain, not fatigue</w:t>
+            </w:r>
+          </w:p>
         </w:tc>
         <w:tc>
           <w:tcPr>
@@ -10066,7 +10104,7 @@
                 <w:sz w:val="14"/>
                 <w:szCs w:val="14"/>
               </w:rPr>
-              <w:t xml:space="preserve">Left leg weaker (Styku) — leads every set</w:t>
+              <w:t xml:space="preserve">Left leg weaker (Styku) — leads every set; left hip in active tendinitis rehab, stop at sharp/pinching pain</w:t>
             </w:r>
           </w:p>
         </w:tc>
@@ -10634,7 +10672,7 @@
                 <w:sz w:val="14"/>
                 <w:szCs w:val="14"/>
               </w:rPr>
-              <w:t xml:space="preserve">Left leg weaker (Styku) — leads every set</w:t>
+              <w:t xml:space="preserve">Left leg weaker (Styku) — leads every set; left hip in active tendinitis rehab, stop at sharp/pinching pain</w:t>
             </w:r>
           </w:p>
         </w:tc>
@@ -11442,7 +11480,7 @@
           <w:sz w:val="17"/>
           <w:szCs w:val="17"/>
         </w:rPr>
-        <w:t xml:space="preserve">Left leg leads every unilateral set this session — Styku shows a 0.8 lb segmental gap (12.7 vs 13.5 lbs). Track the gap at the 8-week rescan. Muscle-building remains the session's primary goal given ALST At-Risk status — no set here is filler.</w:t>
+        <w:t xml:space="preserve">Left leg leads every unilateral set this session — Styku shows a 0.8 lb segmental gap (12.7 vs 13.5 lbs). Track the gap at the 8-week rescan. Muscle-building remains the session's primary goal given ALST At-Risk status — no set here is filler. Left hip is in active tendinitis rehab (coordinated with Jason Bethea) — every loaded lower-body set today is pain-monitored; sharp or pinching hip pain stops the set, ordinary fatigue does not.</w:t>
       </w:r>
     </w:p>
     <w:p>
@@ -11804,7 +11842,7 @@
           <w:sz w:val="17"/>
           <w:szCs w:val="17"/>
         </w:rPr>
-        <w:t xml:space="preserve">Same hip-activation priority carried forward from Day 2, condensed here to prime glute medius and hip external rotators before the heavy hinge work below.</w:t>
+        <w:t xml:space="preserve">Same hip-activation priority carried forward from Day 2, condensed here to prime glute medius and hip external rotators before the heavy hinge work below. Left hip remains in active tendinitis rehab (coordinated with Jason Bethea) — every loaded exercise in this session is pain-monitored: sharp/pinching/catching hip pain is the stop signal, ordinary fatigue is not.</w:t>
       </w:r>
     </w:p>
     <w:tbl>
@@ -12880,6 +12918,19 @@
               <w:t xml:space="preserve">Hex Bar Deadlift</w:t>
             </w:r>
           </w:p>
+          <w:p>
+            <w:r>
+              <w:rPr>
+                <w:rFonts w:ascii="Arial" w:cs="Arial" w:eastAsia="Arial" w:hAnsi="Arial"/>
+                <w:i/>
+                <w:iCs/>
+                <w:color w:val="B71C1C"/>
+                <w:sz w:val="14"/>
+                <w:szCs w:val="14"/>
+              </w:rPr>
+              <w:t xml:space="preserve">Left hip — active tendinitis rehab; stop at sharp/pinching pain, not fatigue</w:t>
+            </w:r>
+          </w:p>
         </w:tc>
         <w:tc>
           <w:tcPr>
@@ -13118,6 +13169,19 @@
                 <w:szCs w:val="18"/>
               </w:rPr>
               <w:t xml:space="preserve">DB Hip Thrust</w:t>
+            </w:r>
+          </w:p>
+          <w:p>
+            <w:r>
+              <w:rPr>
+                <w:rFonts w:ascii="Arial" w:cs="Arial" w:eastAsia="Arial" w:hAnsi="Arial"/>
+                <w:i/>
+                <w:iCs/>
+                <w:color w:val="B71C1C"/>
+                <w:sz w:val="14"/>
+                <w:szCs w:val="14"/>
+              </w:rPr>
+              <w:t xml:space="preserve">Left hip — active tendinitis rehab; stop at sharp/pinching pain, not fatigue</w:t>
             </w:r>
           </w:p>
         </w:tc>
@@ -16042,6 +16106,19 @@
               <w:t xml:space="preserve">Box Step-Up Jump (Submaximal, Full Recovery)</w:t>
             </w:r>
           </w:p>
+          <w:p>
+            <w:r>
+              <w:rPr>
+                <w:rFonts w:ascii="Arial" w:cs="Arial" w:eastAsia="Arial" w:hAnsi="Arial"/>
+                <w:i/>
+                <w:iCs/>
+                <w:color w:val="B71C1C"/>
+                <w:sz w:val="14"/>
+                <w:szCs w:val="14"/>
+              </w:rPr>
+              <w:t xml:space="preserve">Left hip — active tendinitis rehab; stop at sharp/pinching pain, not fatigue</w:t>
+            </w:r>
+          </w:p>
         </w:tc>
         <w:tc>
           <w:tcPr>
@@ -16836,7 +16913,7 @@
           <w:sz w:val="17"/>
           <w:szCs w:val="17"/>
         </w:rPr>
-        <w:t xml:space="preserve">Left leg leads every unilateral leg set, right hand leads the suitcase carry — both per Styku's 0.8 lb segmental gaps. Shoulder and pull work continue their pain-free progression from Day 1; sharp or pinching pain is still the stop signal, ordinary fatigue is not. Muscle-building stays the top priority — every block here is real progressive resistance.</w:t>
+        <w:t xml:space="preserve">Left leg leads every unilateral leg set, right hand leads the suitcase carry — both per Styku's 0.8 lb segmental gaps. Shoulder and pull work continue their pain-free progression from Day 1; sharp or pinching pain is still the stop signal, ordinary fatigue is not. Muscle-building stays the top priority — every block here is real progressive resistance. Left hip remains in active tendinitis rehab (coordinated with Jason Bethea) — the Hex Bar Deadlift, DB Hip Thrust, and Box Step-Up Jump above are the day's heaviest hip-loading content and are pain-monitored the same way: sharp/pinching/catching hip pain stops the set.</w:t>
       </w:r>
     </w:p>
     <w:p>

</xml_diff>

<commit_message>
Pilot the ICONS Block Method on Siobhan Hansen (independent audit in progress)
</commit_message>
<xml_diff>
--- a/clients/siobhan_hansen/Siobhan_Hansen_3Day_Training_Plan.docx
+++ b/clients/siobhan_hansen/Siobhan_Hansen_3Day_Training_Plan.docx
@@ -2118,7 +2118,7 @@
                 <w:sz w:val="16"/>
                 <w:szCs w:val="16"/>
               </w:rPr>
-              <w:t xml:space="preserve">Build progressively at 1-2 RIR — right arm leads (weaker side)</w:t>
+              <w:t xml:space="preserve">Build progressively at 2 RIR — right arm leads (weaker side)</w:t>
             </w:r>
           </w:p>
         </w:tc>
@@ -3011,7 +3011,7 @@
           <w:sz w:val="17"/>
           <w:szCs w:val="17"/>
         </w:rPr>
-        <w:t xml:space="preserve">CLAUDE.md's Power Training section places sub-maximal-load, maximal-intent power work in the 55-65 bracket already, not just 65+ — power output declines before strength does, so waiting until 65 is a real cost. Day 3, Block F now includes a Box Step-Up Jump: bodyweight, full recovery between sets, and deliberately a lower-body movement — no overhead component, given the left shoulder reintroduction still underway in Blocks A and C. Full recovery between sets is the defining design feature of power work, distinct from a metabolic stimulus, so it does not compete with the deliberately brief metabolic finishers used elsewhere in this program, which stay short specifically to protect recovery capacity for the ALST At-Risk/Underweight resistance-training priority named above.</w:t>
+        <w:t xml:space="preserve">CLAUDE.md's Power Training section places sub-maximal-load, maximal-intent power work in the 55-65 bracket already, not just 65+ — power output declines before strength does, so waiting until 65 is a real cost. Day 3, Block H (relettered from F in the 8/18/2026 Block Method restructure) includes a Box Step-Up Jump: bodyweight, full recovery between sets, and deliberately a lower-body movement — no overhead component, given the left shoulder reintroduction still underway on Days 1 and 3. Full recovery between sets is the defining design feature of power work, distinct from a metabolic stimulus, so it does not compete with the deliberately brief metabolic finishers used elsewhere in this program, which stay short specifically to protect recovery capacity for the ALST At-Risk/Underweight resistance-training priority named above.</w:t>
       </w:r>
     </w:p>
     <w:p>
@@ -3087,6 +3087,31 @@
           <w:szCs w:val="17"/>
         </w:rPr>
         <w:t xml:space="preserve">The same SOAP note above (SOAP_SiobhanHansen_2026-08-06.pdf) documented a fuller PT-led warm-up and activation circuit covering both her left shoulder and left hip findings. Folded in this update: (1) a full-body PVC-stick mobility routine (shoulder passovers, overhead squat with stick, hip openers) used as her actual session opener, added to Day 1's warm-up, with a hip-opener line also added to Day 2's warm-up given the active hip rehab there; (2) Crab Walk (Static Elvis Knee/Internal Rotation — her actual performed modification, not the standard walking version) and Glute Kickback (Total Gym Level 10, 50 lbs) added to the existing hip-activation blocks on Day 2 and Day 3, directly reinforcing the left-hip tendinitis rehab; (3) Floor Row on Foam Roller, I's-T's-W's (Prone, with her documented modification — 5 lb DBs, one arm in a hinge stance, reduced ROM on the W/Y sweep), and Quadruped Shoulder Press added to Day 1's existing shoulder corrective block, directly reinforcing the left-shoulder postural-dysfunction finding.</w:t>
+      </w:r>
+    </w:p>
+    <w:p>
+      <w:pPr>
+        <w:spacing w:after="100"/>
+      </w:pPr>
+      <w:r>
+        <w:rPr>
+          <w:rFonts w:ascii="Arial" w:cs="Arial" w:eastAsia="Arial" w:hAnsi="Arial"/>
+          <w:b/>
+          <w:bCs/>
+          <w:color w:val="C9A227"/>
+          <w:sz w:val="17"/>
+          <w:szCs w:val="17"/>
+        </w:rPr>
+        <w:t xml:space="preserve">Session Architecture — ICONS Block Method Pilot (8/18/2026):  </w:t>
+      </w:r>
+      <w:r>
+        <w:rPr>
+          <w:rFonts w:ascii="Arial" w:cs="Arial" w:eastAsia="Arial" w:hAnsi="Arial"/>
+          <w:color w:val="2C2C2C"/>
+          <w:sz w:val="17"/>
+          <w:szCs w:val="17"/>
+        </w:rPr>
+        <w:t xml:space="preserve">This document is the roster pilot for the ICONS Block Method standing session architecture (Corrective → Primary Compound → Accessory → Jason's Exercise → Secondary Compound; see CLAUDE.md). Restructure is organizational only — every clinical element (left-hip tendinitis flags on all 6 hip-loaded exercises, shoulder reintroduction protocol, scapular gate, both asymmetry leads, pelvic-floor auto-fire on Days 2-3, protein bar on all days) and every Wk1→Wk4 load survives verbatim. What moved: Day 1 — Incline Push-Up promoted to the accessory slot ahead of the pull block (1 RIR per corrected accessory tier); slot 4 omitted (all Jason content consumed by the corrective slot; a slot-4 Floor Row would stack 3 consecutive pulls, and adding hip-side Jason work to Day 1 would raise rehab-exercise frequency to 3x/week — Jason's call, not ours). Day 2 — Squat/SL Stance Squat split into primary/accessory blocks; Floor Row on Foam Roller added as the Jason slot (2nd weekly touch of the postural finding, antagonist break between squat and hinge patterns). Day 3 — Hex DL/Hip Thrust split into primary/accessory blocks (Hex DL RIR aligned to 2 RIR primary default); I's-T's-W's added as the Jason slot priming the check-in; check-in reframed as the secondary compound; carries/core/power/finisher retained as post-architecture standing blocks (no named slot in the five-slot format — a pilot friction finding). Accessory-slot RIR held at 2 (not the 1-RIR default) on both hip-flagged accessories (SL Stance Squat, Hip Thrust) as a deliberate clinical override during active tendinitis rehab.</w:t>
       </w:r>
     </w:p>
     <w:p>
@@ -7219,11 +7244,566 @@
           <w:rFonts w:ascii="Arial" w:cs="Arial" w:eastAsia="Arial" w:hAnsi="Arial"/>
           <w:b/>
           <w:bCs/>
+          <w:color w:val="43A047"/>
+          <w:sz w:val="17"/>
+          <w:szCs w:val="17"/>
+        </w:rPr>
+        <w:t xml:space="preserve">D — ACCESSORY — INCLINE PUSH-UP PROTOCOL</w:t>
+      </w:r>
+    </w:p>
+    <w:p>
+      <w:pPr>
+        <w:spacing w:after="80"/>
+      </w:pPr>
+      <w:r>
+        <w:rPr>
+          <w:rFonts w:ascii="Arial" w:cs="Arial" w:eastAsia="Arial" w:hAnsi="Arial"/>
+          <w:b/>
+          <w:bCs/>
+          <w:color w:val="43A047"/>
+          <w:sz w:val="17"/>
+          <w:szCs w:val="17"/>
+        </w:rPr>
+        <w:t xml:space="preserve">Load Target:  </w:t>
+      </w:r>
+      <w:r>
+        <w:rPr>
+          <w:rFonts w:ascii="Arial" w:cs="Arial" w:eastAsia="Arial" w:hAnsi="Arial"/>
+          <w:color w:val="2C2C2C"/>
+          <w:sz w:val="17"/>
+          <w:szCs w:val="17"/>
+        </w:rPr>
+        <w:t xml:space="preserve">Baseline 10 reps, bodyweight — the muscle-building accessory behind today's pressing work, in a controlled, non-overhead range that is well-tolerated alongside the shoulder reintroduction above. Worked hard: this is a hypertrophy-priority set, taken to 1 rep in reserve.</w:t>
+      </w:r>
+    </w:p>
+    <w:tbl>
+      <w:tblPr>
+        <w:tblW w:type="dxa" w:w="10440"/>
+        <w:tblBorders>
+          <w:top w:val="none" w:color="FFFFFF" w:sz="0"/>
+          <w:left w:val="none" w:color="FFFFFF" w:sz="0"/>
+          <w:bottom w:val="none" w:color="FFFFFF" w:sz="0"/>
+          <w:right w:val="none" w:color="FFFFFF" w:sz="0"/>
+          <w:insideH w:val="single" w:color="auto" w:sz="4"/>
+          <w:insideV w:val="single" w:color="auto" w:sz="4"/>
+        </w:tblBorders>
+      </w:tblPr>
+      <w:tblGrid>
+        <w:gridCol w:w="2400"/>
+        <w:gridCol w:w="380"/>
+        <w:gridCol w:w="420"/>
+        <w:gridCol w:w="680"/>
+        <w:gridCol w:w="540"/>
+        <w:gridCol w:w="440"/>
+        <w:gridCol w:w="5580"/>
+      </w:tblGrid>
+      <w:tr>
+        <w:tc>
+          <w:tcPr>
+            <w:tcW w:type="dxa" w:w="2400"/>
+            <w:tcBorders>
+              <w:top w:val="none" w:color="FFFFFF" w:sz="0"/>
+              <w:left w:val="none" w:color="FFFFFF" w:sz="0"/>
+              <w:bottom w:val="none" w:color="FFFFFF" w:sz="0"/>
+              <w:right w:val="none" w:color="FFFFFF" w:sz="0"/>
+            </w:tcBorders>
+            <w:shd w:fill="E8F5E9" w:color="auto" w:val="clear"/>
+            <w:tcMar>
+              <w:top w:type="dxa" w:w="40"/>
+              <w:left w:type="dxa" w:w="80"/>
+              <w:bottom w:type="dxa" w:w="40"/>
+              <w:right w:type="dxa" w:w="80"/>
+            </w:tcMar>
+            <w:vAlign w:val="center"/>
+          </w:tcPr>
+          <w:p>
+            <w:pPr>
+              <w:jc w:val="left"/>
+            </w:pPr>
+            <w:r>
+              <w:rPr>
+                <w:rFonts w:ascii="Arial" w:cs="Arial" w:eastAsia="Arial" w:hAnsi="Arial"/>
+                <w:b/>
+                <w:bCs/>
+                <w:color w:val="43A047"/>
+                <w:sz w:val="15"/>
+                <w:szCs w:val="15"/>
+              </w:rPr>
+              <w:t xml:space="preserve">EXERCISE</w:t>
+            </w:r>
+          </w:p>
+        </w:tc>
+        <w:tc>
+          <w:tcPr>
+            <w:tcW w:type="dxa" w:w="380"/>
+            <w:tcBorders>
+              <w:top w:val="none" w:color="FFFFFF" w:sz="0"/>
+              <w:left w:val="none" w:color="FFFFFF" w:sz="0"/>
+              <w:bottom w:val="none" w:color="FFFFFF" w:sz="0"/>
+              <w:right w:val="none" w:color="FFFFFF" w:sz="0"/>
+            </w:tcBorders>
+            <w:shd w:fill="E8F5E9" w:color="auto" w:val="clear"/>
+            <w:tcMar>
+              <w:top w:type="dxa" w:w="40"/>
+              <w:left w:type="dxa" w:w="80"/>
+              <w:bottom w:type="dxa" w:w="40"/>
+              <w:right w:type="dxa" w:w="80"/>
+            </w:tcMar>
+            <w:vAlign w:val="center"/>
+          </w:tcPr>
+          <w:p>
+            <w:pPr>
+              <w:jc w:val="center"/>
+            </w:pPr>
+            <w:r>
+              <w:rPr>
+                <w:rFonts w:ascii="Arial" w:cs="Arial" w:eastAsia="Arial" w:hAnsi="Arial"/>
+                <w:b/>
+                <w:bCs/>
+                <w:color w:val="43A047"/>
+                <w:sz w:val="13"/>
+                <w:szCs w:val="13"/>
+              </w:rPr>
+              <w:t xml:space="preserve">SETS</w:t>
+            </w:r>
+          </w:p>
+        </w:tc>
+        <w:tc>
+          <w:tcPr>
+            <w:tcW w:type="dxa" w:w="420"/>
+            <w:tcBorders>
+              <w:top w:val="none" w:color="FFFFFF" w:sz="0"/>
+              <w:left w:val="none" w:color="FFFFFF" w:sz="0"/>
+              <w:bottom w:val="none" w:color="FFFFFF" w:sz="0"/>
+              <w:right w:val="none" w:color="FFFFFF" w:sz="0"/>
+            </w:tcBorders>
+            <w:shd w:fill="E8F5E9" w:color="auto" w:val="clear"/>
+            <w:tcMar>
+              <w:top w:type="dxa" w:w="40"/>
+              <w:left w:type="dxa" w:w="80"/>
+              <w:bottom w:type="dxa" w:w="40"/>
+              <w:right w:type="dxa" w:w="80"/>
+            </w:tcMar>
+            <w:vAlign w:val="center"/>
+          </w:tcPr>
+          <w:p>
+            <w:pPr>
+              <w:jc w:val="center"/>
+            </w:pPr>
+            <w:r>
+              <w:rPr>
+                <w:rFonts w:ascii="Arial" w:cs="Arial" w:eastAsia="Arial" w:hAnsi="Arial"/>
+                <w:b/>
+                <w:bCs/>
+                <w:color w:val="43A047"/>
+                <w:sz w:val="13"/>
+                <w:szCs w:val="13"/>
+              </w:rPr>
+              <w:t xml:space="preserve">REPS</w:t>
+            </w:r>
+          </w:p>
+        </w:tc>
+        <w:tc>
+          <w:tcPr>
+            <w:tcW w:type="dxa" w:w="680"/>
+            <w:tcBorders>
+              <w:top w:val="none" w:color="FFFFFF" w:sz="0"/>
+              <w:left w:val="none" w:color="FFFFFF" w:sz="0"/>
+              <w:bottom w:val="none" w:color="FFFFFF" w:sz="0"/>
+              <w:right w:val="none" w:color="FFFFFF" w:sz="0"/>
+            </w:tcBorders>
+            <w:shd w:fill="E8F5E9" w:color="auto" w:val="clear"/>
+            <w:tcMar>
+              <w:top w:type="dxa" w:w="40"/>
+              <w:left w:type="dxa" w:w="80"/>
+              <w:bottom w:type="dxa" w:w="40"/>
+              <w:right w:type="dxa" w:w="80"/>
+            </w:tcMar>
+            <w:vAlign w:val="center"/>
+          </w:tcPr>
+          <w:p>
+            <w:pPr>
+              <w:jc w:val="center"/>
+            </w:pPr>
+            <w:r>
+              <w:rPr>
+                <w:rFonts w:ascii="Arial" w:cs="Arial" w:eastAsia="Arial" w:hAnsi="Arial"/>
+                <w:b/>
+                <w:bCs/>
+                <w:color w:val="43A047"/>
+                <w:sz w:val="13"/>
+                <w:szCs w:val="13"/>
+              </w:rPr>
+              <w:t xml:space="preserve">LOAD</w:t>
+            </w:r>
+          </w:p>
+        </w:tc>
+        <w:tc>
+          <w:tcPr>
+            <w:tcW w:type="dxa" w:w="540"/>
+            <w:tcBorders>
+              <w:top w:val="none" w:color="FFFFFF" w:sz="0"/>
+              <w:left w:val="none" w:color="FFFFFF" w:sz="0"/>
+              <w:bottom w:val="none" w:color="FFFFFF" w:sz="0"/>
+              <w:right w:val="none" w:color="FFFFFF" w:sz="0"/>
+            </w:tcBorders>
+            <w:shd w:fill="E8F5E9" w:color="auto" w:val="clear"/>
+            <w:tcMar>
+              <w:top w:type="dxa" w:w="40"/>
+              <w:left w:type="dxa" w:w="80"/>
+              <w:bottom w:type="dxa" w:w="40"/>
+              <w:right w:type="dxa" w:w="80"/>
+            </w:tcMar>
+            <w:vAlign w:val="center"/>
+          </w:tcPr>
+          <w:p>
+            <w:pPr>
+              <w:jc w:val="center"/>
+            </w:pPr>
+            <w:r>
+              <w:rPr>
+                <w:rFonts w:ascii="Arial" w:cs="Arial" w:eastAsia="Arial" w:hAnsi="Arial"/>
+                <w:b/>
+                <w:bCs/>
+                <w:color w:val="43A047"/>
+                <w:sz w:val="13"/>
+                <w:szCs w:val="13"/>
+              </w:rPr>
+              <w:t xml:space="preserve">TEMPO</w:t>
+            </w:r>
+          </w:p>
+        </w:tc>
+        <w:tc>
+          <w:tcPr>
+            <w:tcW w:type="dxa" w:w="440"/>
+            <w:tcBorders>
+              <w:top w:val="none" w:color="FFFFFF" w:sz="0"/>
+              <w:left w:val="none" w:color="FFFFFF" w:sz="0"/>
+              <w:bottom w:val="none" w:color="FFFFFF" w:sz="0"/>
+              <w:right w:val="none" w:color="FFFFFF" w:sz="0"/>
+            </w:tcBorders>
+            <w:shd w:fill="E8F5E9" w:color="auto" w:val="clear"/>
+            <w:tcMar>
+              <w:top w:type="dxa" w:w="40"/>
+              <w:left w:type="dxa" w:w="80"/>
+              <w:bottom w:type="dxa" w:w="40"/>
+              <w:right w:type="dxa" w:w="80"/>
+            </w:tcMar>
+            <w:vAlign w:val="center"/>
+          </w:tcPr>
+          <w:p>
+            <w:pPr>
+              <w:jc w:val="center"/>
+            </w:pPr>
+            <w:r>
+              <w:rPr>
+                <w:rFonts w:ascii="Arial" w:cs="Arial" w:eastAsia="Arial" w:hAnsi="Arial"/>
+                <w:b/>
+                <w:bCs/>
+                <w:color w:val="43A047"/>
+                <w:sz w:val="13"/>
+                <w:szCs w:val="13"/>
+              </w:rPr>
+              <w:t xml:space="preserve">REST</w:t>
+            </w:r>
+          </w:p>
+        </w:tc>
+        <w:tc>
+          <w:tcPr>
+            <w:tcW w:type="dxa" w:w="5580"/>
+            <w:tcBorders>
+              <w:top w:val="none" w:color="FFFFFF" w:sz="0"/>
+              <w:left w:val="none" w:color="FFFFFF" w:sz="0"/>
+              <w:bottom w:val="none" w:color="FFFFFF" w:sz="0"/>
+              <w:right w:val="none" w:color="FFFFFF" w:sz="0"/>
+            </w:tcBorders>
+            <w:shd w:fill="E8F5E9" w:color="auto" w:val="clear"/>
+            <w:tcMar>
+              <w:top w:type="dxa" w:w="40"/>
+              <w:left w:type="dxa" w:w="80"/>
+              <w:bottom w:type="dxa" w:w="40"/>
+              <w:right w:type="dxa" w:w="80"/>
+            </w:tcMar>
+            <w:vAlign w:val="center"/>
+          </w:tcPr>
+          <w:p>
+            <w:pPr>
+              <w:jc w:val="left"/>
+            </w:pPr>
+            <w:r>
+              <w:rPr>
+                <w:rFonts w:ascii="Arial" w:cs="Arial" w:eastAsia="Arial" w:hAnsi="Arial"/>
+                <w:b/>
+                <w:bCs/>
+                <w:color w:val="43A047"/>
+                <w:sz w:val="15"/>
+                <w:szCs w:val="15"/>
+              </w:rPr>
+              <w:t xml:space="preserve">COACHING CUE</w:t>
+            </w:r>
+          </w:p>
+        </w:tc>
+      </w:tr>
+      <w:tr>
+        <w:tc>
+          <w:tcPr>
+            <w:tcW w:type="dxa" w:w="2400"/>
+            <w:tcBorders>
+              <w:top w:val="none" w:color="FFFFFF" w:sz="0"/>
+              <w:left w:val="none" w:color="FFFFFF" w:sz="0"/>
+              <w:bottom w:val="none" w:color="FFFFFF" w:sz="0"/>
+              <w:right w:val="none" w:color="FFFFFF" w:sz="0"/>
+            </w:tcBorders>
+            <w:shd w:fill="F1F8F2" w:color="auto" w:val="clear"/>
+            <w:tcMar>
+              <w:top w:type="dxa" w:w="40"/>
+              <w:left w:type="dxa" w:w="80"/>
+              <w:bottom w:type="dxa" w:w="40"/>
+              <w:right w:type="dxa" w:w="80"/>
+            </w:tcMar>
+            <w:vAlign w:val="center"/>
+          </w:tcPr>
+          <w:p>
+            <w:r>
+              <w:rPr>
+                <w:rFonts w:ascii="Arial" w:cs="Arial" w:eastAsia="Arial" w:hAnsi="Arial"/>
+                <w:b/>
+                <w:bCs/>
+                <w:color w:val="2C2C2C"/>
+                <w:sz w:val="18"/>
+                <w:szCs w:val="18"/>
+              </w:rPr>
+              <w:t xml:space="preserve">Incline Push-Up</w:t>
+            </w:r>
+          </w:p>
+        </w:tc>
+        <w:tc>
+          <w:tcPr>
+            <w:tcW w:type="dxa" w:w="380"/>
+            <w:tcBorders>
+              <w:top w:val="none" w:color="FFFFFF" w:sz="0"/>
+              <w:left w:val="none" w:color="FFFFFF" w:sz="0"/>
+              <w:bottom w:val="none" w:color="FFFFFF" w:sz="0"/>
+              <w:right w:val="none" w:color="FFFFFF" w:sz="0"/>
+            </w:tcBorders>
+            <w:shd w:fill="F1F8F2" w:color="auto" w:val="clear"/>
+            <w:tcMar>
+              <w:top w:type="dxa" w:w="40"/>
+              <w:left w:type="dxa" w:w="80"/>
+              <w:bottom w:type="dxa" w:w="40"/>
+              <w:right w:type="dxa" w:w="80"/>
+            </w:tcMar>
+            <w:vAlign w:val="center"/>
+          </w:tcPr>
+          <w:p>
+            <w:pPr>
+              <w:jc w:val="center"/>
+            </w:pPr>
+            <w:r>
+              <w:rPr>
+                <w:rFonts w:ascii="Arial" w:cs="Arial" w:eastAsia="Arial" w:hAnsi="Arial"/>
+                <w:color w:val="6B6B6B"/>
+                <w:sz w:val="15"/>
+                <w:szCs w:val="15"/>
+              </w:rPr>
+              <w:t xml:space="preserve">3</w:t>
+            </w:r>
+          </w:p>
+        </w:tc>
+        <w:tc>
+          <w:tcPr>
+            <w:tcW w:type="dxa" w:w="420"/>
+            <w:tcBorders>
+              <w:top w:val="none" w:color="FFFFFF" w:sz="0"/>
+              <w:left w:val="none" w:color="FFFFFF" w:sz="0"/>
+              <w:bottom w:val="none" w:color="FFFFFF" w:sz="0"/>
+              <w:right w:val="none" w:color="FFFFFF" w:sz="0"/>
+            </w:tcBorders>
+            <w:shd w:fill="F1F8F2" w:color="auto" w:val="clear"/>
+            <w:tcMar>
+              <w:top w:type="dxa" w:w="40"/>
+              <w:left w:type="dxa" w:w="80"/>
+              <w:bottom w:type="dxa" w:w="40"/>
+              <w:right w:type="dxa" w:w="80"/>
+            </w:tcMar>
+            <w:vAlign w:val="center"/>
+          </w:tcPr>
+          <w:p>
+            <w:pPr>
+              <w:jc w:val="center"/>
+            </w:pPr>
+            <w:r>
+              <w:rPr>
+                <w:rFonts w:ascii="Arial" w:cs="Arial" w:eastAsia="Arial" w:hAnsi="Arial"/>
+                <w:color w:val="6B6B6B"/>
+                <w:sz w:val="15"/>
+                <w:szCs w:val="15"/>
+              </w:rPr>
+              <w:t xml:space="preserve">8-10</w:t>
+            </w:r>
+          </w:p>
+        </w:tc>
+        <w:tc>
+          <w:tcPr>
+            <w:tcW w:type="dxa" w:w="680"/>
+            <w:tcBorders>
+              <w:top w:val="none" w:color="FFFFFF" w:sz="0"/>
+              <w:left w:val="none" w:color="FFFFFF" w:sz="0"/>
+              <w:bottom w:val="none" w:color="FFFFFF" w:sz="0"/>
+              <w:right w:val="none" w:color="FFFFFF" w:sz="0"/>
+            </w:tcBorders>
+            <w:shd w:fill="F1F8F2" w:color="auto" w:val="clear"/>
+            <w:tcMar>
+              <w:top w:type="dxa" w:w="40"/>
+              <w:left w:type="dxa" w:w="80"/>
+              <w:bottom w:type="dxa" w:w="40"/>
+              <w:right w:type="dxa" w:w="80"/>
+            </w:tcMar>
+            <w:vAlign w:val="center"/>
+          </w:tcPr>
+          <w:p>
+            <w:pPr>
+              <w:jc w:val="center"/>
+            </w:pPr>
+            <w:r>
+              <w:rPr>
+                <w:rFonts w:ascii="Arial" w:cs="Arial" w:eastAsia="Arial" w:hAnsi="Arial"/>
+                <w:color w:val="6B6B6B"/>
+                <w:sz w:val="15"/>
+                <w:szCs w:val="15"/>
+              </w:rPr>
+              <w:t xml:space="preserve">bodyweight (bench)</w:t>
+            </w:r>
+          </w:p>
+        </w:tc>
+        <w:tc>
+          <w:tcPr>
+            <w:tcW w:type="dxa" w:w="540"/>
+            <w:tcBorders>
+              <w:top w:val="none" w:color="FFFFFF" w:sz="0"/>
+              <w:left w:val="none" w:color="FFFFFF" w:sz="0"/>
+              <w:bottom w:val="none" w:color="FFFFFF" w:sz="0"/>
+              <w:right w:val="none" w:color="FFFFFF" w:sz="0"/>
+            </w:tcBorders>
+            <w:shd w:fill="F1F8F2" w:color="auto" w:val="clear"/>
+            <w:tcMar>
+              <w:top w:type="dxa" w:w="40"/>
+              <w:left w:type="dxa" w:w="80"/>
+              <w:bottom w:type="dxa" w:w="40"/>
+              <w:right w:type="dxa" w:w="80"/>
+            </w:tcMar>
+            <w:vAlign w:val="center"/>
+          </w:tcPr>
+          <w:p>
+            <w:pPr>
+              <w:jc w:val="center"/>
+            </w:pPr>
+            <w:r>
+              <w:rPr>
+                <w:rFonts w:ascii="Arial" w:cs="Arial" w:eastAsia="Arial" w:hAnsi="Arial"/>
+                <w:color w:val="6B6B6B"/>
+                <w:sz w:val="15"/>
+                <w:szCs w:val="15"/>
+              </w:rPr>
+              <w:t xml:space="preserve">3-1-1</w:t>
+            </w:r>
+          </w:p>
+        </w:tc>
+        <w:tc>
+          <w:tcPr>
+            <w:tcW w:type="dxa" w:w="440"/>
+            <w:tcBorders>
+              <w:top w:val="none" w:color="FFFFFF" w:sz="0"/>
+              <w:left w:val="none" w:color="FFFFFF" w:sz="0"/>
+              <w:bottom w:val="none" w:color="FFFFFF" w:sz="0"/>
+              <w:right w:val="none" w:color="FFFFFF" w:sz="0"/>
+            </w:tcBorders>
+            <w:shd w:fill="F1F8F2" w:color="auto" w:val="clear"/>
+            <w:tcMar>
+              <w:top w:type="dxa" w:w="40"/>
+              <w:left w:type="dxa" w:w="80"/>
+              <w:bottom w:type="dxa" w:w="40"/>
+              <w:right w:type="dxa" w:w="80"/>
+            </w:tcMar>
+            <w:vAlign w:val="center"/>
+          </w:tcPr>
+          <w:p>
+            <w:pPr>
+              <w:jc w:val="center"/>
+            </w:pPr>
+            <w:r>
+              <w:rPr>
+                <w:rFonts w:ascii="Arial" w:cs="Arial" w:eastAsia="Arial" w:hAnsi="Arial"/>
+                <w:color w:val="6B6B6B"/>
+                <w:sz w:val="15"/>
+                <w:szCs w:val="15"/>
+              </w:rPr>
+              <w:t xml:space="preserve">60s</w:t>
+            </w:r>
+          </w:p>
+        </w:tc>
+        <w:tc>
+          <w:tcPr>
+            <w:tcW w:type="dxa" w:w="5580"/>
+            <w:tcBorders>
+              <w:top w:val="none" w:color="FFFFFF" w:sz="0"/>
+              <w:left w:val="none" w:color="FFFFFF" w:sz="0"/>
+              <w:bottom w:val="none" w:color="FFFFFF" w:sz="0"/>
+              <w:right w:val="none" w:color="FFFFFF" w:sz="0"/>
+            </w:tcBorders>
+            <w:shd w:fill="F1F8F2" w:color="auto" w:val="clear"/>
+            <w:tcMar>
+              <w:top w:type="dxa" w:w="40"/>
+              <w:left w:type="dxa" w:w="80"/>
+              <w:bottom w:type="dxa" w:w="40"/>
+              <w:right w:type="dxa" w:w="80"/>
+            </w:tcMar>
+            <w:vAlign w:val="center"/>
+          </w:tcPr>
+          <w:p>
+            <w:r>
+              <w:rPr>
+                <w:rFonts w:ascii="Arial" w:cs="Arial" w:eastAsia="Arial" w:hAnsi="Arial"/>
+                <w:color w:val="6B6B6B"/>
+                <w:sz w:val="17"/>
+                <w:szCs w:val="17"/>
+              </w:rPr>
+              <w:t xml:space="preserve">Baseline 10 reps. Hands under shoulders, chest to bench, brace.</w:t>
+            </w:r>
+            <w:r>
+              <w:rPr>
+                <w:rFonts w:ascii="Arial" w:cs="Arial" w:eastAsia="Arial" w:hAnsi="Arial"/>
+                <w:i/>
+                <w:iCs/>
+                <w:color w:val="00695C"/>
+                <w:sz w:val="14"/>
+                <w:szCs w:val="14"/>
+              </w:rPr>
+              <w:t xml:space="preserve">  1 RIR</w:t>
+            </w:r>
+          </w:p>
+        </w:tc>
+      </w:tr>
+    </w:tbl>
+    <w:p>
+      <w:pPr>
+        <w:spacing w:after="100"/>
+      </w:pPr>
+    </w:p>
+    <w:p>
+      <w:pPr>
+        <w:spacing w:after="60" w:before="120"/>
+      </w:pPr>
+      <w:r>
+        <w:rPr>
+          <w:rFonts w:ascii="Arial" w:cs="Arial" w:eastAsia="Arial" w:hAnsi="Arial"/>
+          <w:b/>
+          <w:bCs/>
           <w:color w:val="6A1B9A"/>
           <w:sz w:val="17"/>
           <w:szCs w:val="17"/>
         </w:rPr>
-        <w:t xml:space="preserve">D — PULL STRENGTH — RIGHT ARM LEADS</w:t>
+        <w:t xml:space="preserve">E — SECONDARY COMPOUND — PULL STRENGTH (RIGHT ARM LEADS)</w:t>
       </w:r>
     </w:p>
     <w:p>
@@ -7248,7 +7828,7 @@
           <w:sz w:val="17"/>
           <w:szCs w:val="17"/>
         </w:rPr>
-        <w:t xml:space="preserve">Kieser Pulldown is her active pull-strength pathway exercise while pull-up loading stays gated — track progression in Kieser units on the same machine, not converted to a free-weight number. Single-Arm Row is led by the right arm (weaker side, per Styku LST).</w:t>
+        <w:t xml:space="preserve">The day's second compound pattern — pulling, rotating away from the pressing work above. Kieser Pulldown is her active pull-strength pathway exercise while pull-up loading stays gated — track progression in Kieser units on the same machine, not converted to a free-weight number. Single-Arm Row is led by the right arm (weaker side, per Styku LST).</w:t>
       </w:r>
     </w:p>
     <w:tbl>
@@ -7986,561 +8566,6 @@
                 <w:szCs w:val="17"/>
               </w:rPr>
               <w:t xml:space="preserve">Right arm first. Flat back, pull to hip, squeeze at top.</w:t>
-            </w:r>
-            <w:r>
-              <w:rPr>
-                <w:rFonts w:ascii="Arial" w:cs="Arial" w:eastAsia="Arial" w:hAnsi="Arial"/>
-                <w:i/>
-                <w:iCs/>
-                <w:color w:val="00695C"/>
-                <w:sz w:val="14"/>
-                <w:szCs w:val="14"/>
-              </w:rPr>
-              <w:t xml:space="preserve">  2 RIR</w:t>
-            </w:r>
-          </w:p>
-        </w:tc>
-      </w:tr>
-    </w:tbl>
-    <w:p>
-      <w:pPr>
-        <w:spacing w:after="100"/>
-      </w:pPr>
-    </w:p>
-    <w:p>
-      <w:pPr>
-        <w:spacing w:after="60" w:before="120"/>
-      </w:pPr>
-      <w:r>
-        <w:rPr>
-          <w:rFonts w:ascii="Arial" w:cs="Arial" w:eastAsia="Arial" w:hAnsi="Arial"/>
-          <w:b/>
-          <w:bCs/>
-          <w:color w:val="43A047"/>
-          <w:sz w:val="17"/>
-          <w:szCs w:val="17"/>
-        </w:rPr>
-        <w:t xml:space="preserve">E — PUSH ACCESSORY — INCLINE PUSH-UP PROTOCOL</w:t>
-      </w:r>
-    </w:p>
-    <w:p>
-      <w:pPr>
-        <w:spacing w:after="80"/>
-      </w:pPr>
-      <w:r>
-        <w:rPr>
-          <w:rFonts w:ascii="Arial" w:cs="Arial" w:eastAsia="Arial" w:hAnsi="Arial"/>
-          <w:b/>
-          <w:bCs/>
-          <w:color w:val="43A047"/>
-          <w:sz w:val="17"/>
-          <w:szCs w:val="17"/>
-        </w:rPr>
-        <w:t xml:space="preserve">Load Target:  </w:t>
-      </w:r>
-      <w:r>
-        <w:rPr>
-          <w:rFonts w:ascii="Arial" w:cs="Arial" w:eastAsia="Arial" w:hAnsi="Arial"/>
-          <w:color w:val="2C2C2C"/>
-          <w:sz w:val="17"/>
-          <w:szCs w:val="17"/>
-        </w:rPr>
-        <w:t xml:space="preserve">Baseline 10 reps, bodyweight — controlled, non-overhead pressing range that is well-tolerated alongside the shoulder reintroduction work above.</w:t>
-      </w:r>
-    </w:p>
-    <w:tbl>
-      <w:tblPr>
-        <w:tblW w:type="dxa" w:w="10440"/>
-        <w:tblBorders>
-          <w:top w:val="none" w:color="FFFFFF" w:sz="0"/>
-          <w:left w:val="none" w:color="FFFFFF" w:sz="0"/>
-          <w:bottom w:val="none" w:color="FFFFFF" w:sz="0"/>
-          <w:right w:val="none" w:color="FFFFFF" w:sz="0"/>
-          <w:insideH w:val="single" w:color="auto" w:sz="4"/>
-          <w:insideV w:val="single" w:color="auto" w:sz="4"/>
-        </w:tblBorders>
-      </w:tblPr>
-      <w:tblGrid>
-        <w:gridCol w:w="2400"/>
-        <w:gridCol w:w="380"/>
-        <w:gridCol w:w="420"/>
-        <w:gridCol w:w="680"/>
-        <w:gridCol w:w="540"/>
-        <w:gridCol w:w="440"/>
-        <w:gridCol w:w="5580"/>
-      </w:tblGrid>
-      <w:tr>
-        <w:tc>
-          <w:tcPr>
-            <w:tcW w:type="dxa" w:w="2400"/>
-            <w:tcBorders>
-              <w:top w:val="none" w:color="FFFFFF" w:sz="0"/>
-              <w:left w:val="none" w:color="FFFFFF" w:sz="0"/>
-              <w:bottom w:val="none" w:color="FFFFFF" w:sz="0"/>
-              <w:right w:val="none" w:color="FFFFFF" w:sz="0"/>
-            </w:tcBorders>
-            <w:shd w:fill="E8F5E9" w:color="auto" w:val="clear"/>
-            <w:tcMar>
-              <w:top w:type="dxa" w:w="40"/>
-              <w:left w:type="dxa" w:w="80"/>
-              <w:bottom w:type="dxa" w:w="40"/>
-              <w:right w:type="dxa" w:w="80"/>
-            </w:tcMar>
-            <w:vAlign w:val="center"/>
-          </w:tcPr>
-          <w:p>
-            <w:pPr>
-              <w:jc w:val="left"/>
-            </w:pPr>
-            <w:r>
-              <w:rPr>
-                <w:rFonts w:ascii="Arial" w:cs="Arial" w:eastAsia="Arial" w:hAnsi="Arial"/>
-                <w:b/>
-                <w:bCs/>
-                <w:color w:val="43A047"/>
-                <w:sz w:val="15"/>
-                <w:szCs w:val="15"/>
-              </w:rPr>
-              <w:t xml:space="preserve">EXERCISE</w:t>
-            </w:r>
-          </w:p>
-        </w:tc>
-        <w:tc>
-          <w:tcPr>
-            <w:tcW w:type="dxa" w:w="380"/>
-            <w:tcBorders>
-              <w:top w:val="none" w:color="FFFFFF" w:sz="0"/>
-              <w:left w:val="none" w:color="FFFFFF" w:sz="0"/>
-              <w:bottom w:val="none" w:color="FFFFFF" w:sz="0"/>
-              <w:right w:val="none" w:color="FFFFFF" w:sz="0"/>
-            </w:tcBorders>
-            <w:shd w:fill="E8F5E9" w:color="auto" w:val="clear"/>
-            <w:tcMar>
-              <w:top w:type="dxa" w:w="40"/>
-              <w:left w:type="dxa" w:w="80"/>
-              <w:bottom w:type="dxa" w:w="40"/>
-              <w:right w:type="dxa" w:w="80"/>
-            </w:tcMar>
-            <w:vAlign w:val="center"/>
-          </w:tcPr>
-          <w:p>
-            <w:pPr>
-              <w:jc w:val="center"/>
-            </w:pPr>
-            <w:r>
-              <w:rPr>
-                <w:rFonts w:ascii="Arial" w:cs="Arial" w:eastAsia="Arial" w:hAnsi="Arial"/>
-                <w:b/>
-                <w:bCs/>
-                <w:color w:val="43A047"/>
-                <w:sz w:val="13"/>
-                <w:szCs w:val="13"/>
-              </w:rPr>
-              <w:t xml:space="preserve">SETS</w:t>
-            </w:r>
-          </w:p>
-        </w:tc>
-        <w:tc>
-          <w:tcPr>
-            <w:tcW w:type="dxa" w:w="420"/>
-            <w:tcBorders>
-              <w:top w:val="none" w:color="FFFFFF" w:sz="0"/>
-              <w:left w:val="none" w:color="FFFFFF" w:sz="0"/>
-              <w:bottom w:val="none" w:color="FFFFFF" w:sz="0"/>
-              <w:right w:val="none" w:color="FFFFFF" w:sz="0"/>
-            </w:tcBorders>
-            <w:shd w:fill="E8F5E9" w:color="auto" w:val="clear"/>
-            <w:tcMar>
-              <w:top w:type="dxa" w:w="40"/>
-              <w:left w:type="dxa" w:w="80"/>
-              <w:bottom w:type="dxa" w:w="40"/>
-              <w:right w:type="dxa" w:w="80"/>
-            </w:tcMar>
-            <w:vAlign w:val="center"/>
-          </w:tcPr>
-          <w:p>
-            <w:pPr>
-              <w:jc w:val="center"/>
-            </w:pPr>
-            <w:r>
-              <w:rPr>
-                <w:rFonts w:ascii="Arial" w:cs="Arial" w:eastAsia="Arial" w:hAnsi="Arial"/>
-                <w:b/>
-                <w:bCs/>
-                <w:color w:val="43A047"/>
-                <w:sz w:val="13"/>
-                <w:szCs w:val="13"/>
-              </w:rPr>
-              <w:t xml:space="preserve">REPS</w:t>
-            </w:r>
-          </w:p>
-        </w:tc>
-        <w:tc>
-          <w:tcPr>
-            <w:tcW w:type="dxa" w:w="680"/>
-            <w:tcBorders>
-              <w:top w:val="none" w:color="FFFFFF" w:sz="0"/>
-              <w:left w:val="none" w:color="FFFFFF" w:sz="0"/>
-              <w:bottom w:val="none" w:color="FFFFFF" w:sz="0"/>
-              <w:right w:val="none" w:color="FFFFFF" w:sz="0"/>
-            </w:tcBorders>
-            <w:shd w:fill="E8F5E9" w:color="auto" w:val="clear"/>
-            <w:tcMar>
-              <w:top w:type="dxa" w:w="40"/>
-              <w:left w:type="dxa" w:w="80"/>
-              <w:bottom w:type="dxa" w:w="40"/>
-              <w:right w:type="dxa" w:w="80"/>
-            </w:tcMar>
-            <w:vAlign w:val="center"/>
-          </w:tcPr>
-          <w:p>
-            <w:pPr>
-              <w:jc w:val="center"/>
-            </w:pPr>
-            <w:r>
-              <w:rPr>
-                <w:rFonts w:ascii="Arial" w:cs="Arial" w:eastAsia="Arial" w:hAnsi="Arial"/>
-                <w:b/>
-                <w:bCs/>
-                <w:color w:val="43A047"/>
-                <w:sz w:val="13"/>
-                <w:szCs w:val="13"/>
-              </w:rPr>
-              <w:t xml:space="preserve">LOAD</w:t>
-            </w:r>
-          </w:p>
-        </w:tc>
-        <w:tc>
-          <w:tcPr>
-            <w:tcW w:type="dxa" w:w="540"/>
-            <w:tcBorders>
-              <w:top w:val="none" w:color="FFFFFF" w:sz="0"/>
-              <w:left w:val="none" w:color="FFFFFF" w:sz="0"/>
-              <w:bottom w:val="none" w:color="FFFFFF" w:sz="0"/>
-              <w:right w:val="none" w:color="FFFFFF" w:sz="0"/>
-            </w:tcBorders>
-            <w:shd w:fill="E8F5E9" w:color="auto" w:val="clear"/>
-            <w:tcMar>
-              <w:top w:type="dxa" w:w="40"/>
-              <w:left w:type="dxa" w:w="80"/>
-              <w:bottom w:type="dxa" w:w="40"/>
-              <w:right w:type="dxa" w:w="80"/>
-            </w:tcMar>
-            <w:vAlign w:val="center"/>
-          </w:tcPr>
-          <w:p>
-            <w:pPr>
-              <w:jc w:val="center"/>
-            </w:pPr>
-            <w:r>
-              <w:rPr>
-                <w:rFonts w:ascii="Arial" w:cs="Arial" w:eastAsia="Arial" w:hAnsi="Arial"/>
-                <w:b/>
-                <w:bCs/>
-                <w:color w:val="43A047"/>
-                <w:sz w:val="13"/>
-                <w:szCs w:val="13"/>
-              </w:rPr>
-              <w:t xml:space="preserve">TEMPO</w:t>
-            </w:r>
-          </w:p>
-        </w:tc>
-        <w:tc>
-          <w:tcPr>
-            <w:tcW w:type="dxa" w:w="440"/>
-            <w:tcBorders>
-              <w:top w:val="none" w:color="FFFFFF" w:sz="0"/>
-              <w:left w:val="none" w:color="FFFFFF" w:sz="0"/>
-              <w:bottom w:val="none" w:color="FFFFFF" w:sz="0"/>
-              <w:right w:val="none" w:color="FFFFFF" w:sz="0"/>
-            </w:tcBorders>
-            <w:shd w:fill="E8F5E9" w:color="auto" w:val="clear"/>
-            <w:tcMar>
-              <w:top w:type="dxa" w:w="40"/>
-              <w:left w:type="dxa" w:w="80"/>
-              <w:bottom w:type="dxa" w:w="40"/>
-              <w:right w:type="dxa" w:w="80"/>
-            </w:tcMar>
-            <w:vAlign w:val="center"/>
-          </w:tcPr>
-          <w:p>
-            <w:pPr>
-              <w:jc w:val="center"/>
-            </w:pPr>
-            <w:r>
-              <w:rPr>
-                <w:rFonts w:ascii="Arial" w:cs="Arial" w:eastAsia="Arial" w:hAnsi="Arial"/>
-                <w:b/>
-                <w:bCs/>
-                <w:color w:val="43A047"/>
-                <w:sz w:val="13"/>
-                <w:szCs w:val="13"/>
-              </w:rPr>
-              <w:t xml:space="preserve">REST</w:t>
-            </w:r>
-          </w:p>
-        </w:tc>
-        <w:tc>
-          <w:tcPr>
-            <w:tcW w:type="dxa" w:w="5580"/>
-            <w:tcBorders>
-              <w:top w:val="none" w:color="FFFFFF" w:sz="0"/>
-              <w:left w:val="none" w:color="FFFFFF" w:sz="0"/>
-              <w:bottom w:val="none" w:color="FFFFFF" w:sz="0"/>
-              <w:right w:val="none" w:color="FFFFFF" w:sz="0"/>
-            </w:tcBorders>
-            <w:shd w:fill="E8F5E9" w:color="auto" w:val="clear"/>
-            <w:tcMar>
-              <w:top w:type="dxa" w:w="40"/>
-              <w:left w:type="dxa" w:w="80"/>
-              <w:bottom w:type="dxa" w:w="40"/>
-              <w:right w:type="dxa" w:w="80"/>
-            </w:tcMar>
-            <w:vAlign w:val="center"/>
-          </w:tcPr>
-          <w:p>
-            <w:pPr>
-              <w:jc w:val="left"/>
-            </w:pPr>
-            <w:r>
-              <w:rPr>
-                <w:rFonts w:ascii="Arial" w:cs="Arial" w:eastAsia="Arial" w:hAnsi="Arial"/>
-                <w:b/>
-                <w:bCs/>
-                <w:color w:val="43A047"/>
-                <w:sz w:val="15"/>
-                <w:szCs w:val="15"/>
-              </w:rPr>
-              <w:t xml:space="preserve">COACHING CUE</w:t>
-            </w:r>
-          </w:p>
-        </w:tc>
-      </w:tr>
-      <w:tr>
-        <w:tc>
-          <w:tcPr>
-            <w:tcW w:type="dxa" w:w="2400"/>
-            <w:tcBorders>
-              <w:top w:val="none" w:color="FFFFFF" w:sz="0"/>
-              <w:left w:val="none" w:color="FFFFFF" w:sz="0"/>
-              <w:bottom w:val="none" w:color="FFFFFF" w:sz="0"/>
-              <w:right w:val="none" w:color="FFFFFF" w:sz="0"/>
-            </w:tcBorders>
-            <w:shd w:fill="F1F8F2" w:color="auto" w:val="clear"/>
-            <w:tcMar>
-              <w:top w:type="dxa" w:w="40"/>
-              <w:left w:type="dxa" w:w="80"/>
-              <w:bottom w:type="dxa" w:w="40"/>
-              <w:right w:type="dxa" w:w="80"/>
-            </w:tcMar>
-            <w:vAlign w:val="center"/>
-          </w:tcPr>
-          <w:p>
-            <w:r>
-              <w:rPr>
-                <w:rFonts w:ascii="Arial" w:cs="Arial" w:eastAsia="Arial" w:hAnsi="Arial"/>
-                <w:b/>
-                <w:bCs/>
-                <w:color w:val="2C2C2C"/>
-                <w:sz w:val="18"/>
-                <w:szCs w:val="18"/>
-              </w:rPr>
-              <w:t xml:space="preserve">Incline Push-Up</w:t>
-            </w:r>
-          </w:p>
-        </w:tc>
-        <w:tc>
-          <w:tcPr>
-            <w:tcW w:type="dxa" w:w="380"/>
-            <w:tcBorders>
-              <w:top w:val="none" w:color="FFFFFF" w:sz="0"/>
-              <w:left w:val="none" w:color="FFFFFF" w:sz="0"/>
-              <w:bottom w:val="none" w:color="FFFFFF" w:sz="0"/>
-              <w:right w:val="none" w:color="FFFFFF" w:sz="0"/>
-            </w:tcBorders>
-            <w:shd w:fill="F1F8F2" w:color="auto" w:val="clear"/>
-            <w:tcMar>
-              <w:top w:type="dxa" w:w="40"/>
-              <w:left w:type="dxa" w:w="80"/>
-              <w:bottom w:type="dxa" w:w="40"/>
-              <w:right w:type="dxa" w:w="80"/>
-            </w:tcMar>
-            <w:vAlign w:val="center"/>
-          </w:tcPr>
-          <w:p>
-            <w:pPr>
-              <w:jc w:val="center"/>
-            </w:pPr>
-            <w:r>
-              <w:rPr>
-                <w:rFonts w:ascii="Arial" w:cs="Arial" w:eastAsia="Arial" w:hAnsi="Arial"/>
-                <w:color w:val="6B6B6B"/>
-                <w:sz w:val="15"/>
-                <w:szCs w:val="15"/>
-              </w:rPr>
-              <w:t xml:space="preserve">3</w:t>
-            </w:r>
-          </w:p>
-        </w:tc>
-        <w:tc>
-          <w:tcPr>
-            <w:tcW w:type="dxa" w:w="420"/>
-            <w:tcBorders>
-              <w:top w:val="none" w:color="FFFFFF" w:sz="0"/>
-              <w:left w:val="none" w:color="FFFFFF" w:sz="0"/>
-              <w:bottom w:val="none" w:color="FFFFFF" w:sz="0"/>
-              <w:right w:val="none" w:color="FFFFFF" w:sz="0"/>
-            </w:tcBorders>
-            <w:shd w:fill="F1F8F2" w:color="auto" w:val="clear"/>
-            <w:tcMar>
-              <w:top w:type="dxa" w:w="40"/>
-              <w:left w:type="dxa" w:w="80"/>
-              <w:bottom w:type="dxa" w:w="40"/>
-              <w:right w:type="dxa" w:w="80"/>
-            </w:tcMar>
-            <w:vAlign w:val="center"/>
-          </w:tcPr>
-          <w:p>
-            <w:pPr>
-              <w:jc w:val="center"/>
-            </w:pPr>
-            <w:r>
-              <w:rPr>
-                <w:rFonts w:ascii="Arial" w:cs="Arial" w:eastAsia="Arial" w:hAnsi="Arial"/>
-                <w:color w:val="6B6B6B"/>
-                <w:sz w:val="15"/>
-                <w:szCs w:val="15"/>
-              </w:rPr>
-              <w:t xml:space="preserve">8-10</w:t>
-            </w:r>
-          </w:p>
-        </w:tc>
-        <w:tc>
-          <w:tcPr>
-            <w:tcW w:type="dxa" w:w="680"/>
-            <w:tcBorders>
-              <w:top w:val="none" w:color="FFFFFF" w:sz="0"/>
-              <w:left w:val="none" w:color="FFFFFF" w:sz="0"/>
-              <w:bottom w:val="none" w:color="FFFFFF" w:sz="0"/>
-              <w:right w:val="none" w:color="FFFFFF" w:sz="0"/>
-            </w:tcBorders>
-            <w:shd w:fill="F1F8F2" w:color="auto" w:val="clear"/>
-            <w:tcMar>
-              <w:top w:type="dxa" w:w="40"/>
-              <w:left w:type="dxa" w:w="80"/>
-              <w:bottom w:type="dxa" w:w="40"/>
-              <w:right w:type="dxa" w:w="80"/>
-            </w:tcMar>
-            <w:vAlign w:val="center"/>
-          </w:tcPr>
-          <w:p>
-            <w:pPr>
-              <w:jc w:val="center"/>
-            </w:pPr>
-            <w:r>
-              <w:rPr>
-                <w:rFonts w:ascii="Arial" w:cs="Arial" w:eastAsia="Arial" w:hAnsi="Arial"/>
-                <w:color w:val="6B6B6B"/>
-                <w:sz w:val="15"/>
-                <w:szCs w:val="15"/>
-              </w:rPr>
-              <w:t xml:space="preserve">bodyweight (bench)</w:t>
-            </w:r>
-          </w:p>
-        </w:tc>
-        <w:tc>
-          <w:tcPr>
-            <w:tcW w:type="dxa" w:w="540"/>
-            <w:tcBorders>
-              <w:top w:val="none" w:color="FFFFFF" w:sz="0"/>
-              <w:left w:val="none" w:color="FFFFFF" w:sz="0"/>
-              <w:bottom w:val="none" w:color="FFFFFF" w:sz="0"/>
-              <w:right w:val="none" w:color="FFFFFF" w:sz="0"/>
-            </w:tcBorders>
-            <w:shd w:fill="F1F8F2" w:color="auto" w:val="clear"/>
-            <w:tcMar>
-              <w:top w:type="dxa" w:w="40"/>
-              <w:left w:type="dxa" w:w="80"/>
-              <w:bottom w:type="dxa" w:w="40"/>
-              <w:right w:type="dxa" w:w="80"/>
-            </w:tcMar>
-            <w:vAlign w:val="center"/>
-          </w:tcPr>
-          <w:p>
-            <w:pPr>
-              <w:jc w:val="center"/>
-            </w:pPr>
-            <w:r>
-              <w:rPr>
-                <w:rFonts w:ascii="Arial" w:cs="Arial" w:eastAsia="Arial" w:hAnsi="Arial"/>
-                <w:color w:val="6B6B6B"/>
-                <w:sz w:val="15"/>
-                <w:szCs w:val="15"/>
-              </w:rPr>
-              <w:t xml:space="preserve">3-1-1</w:t>
-            </w:r>
-          </w:p>
-        </w:tc>
-        <w:tc>
-          <w:tcPr>
-            <w:tcW w:type="dxa" w:w="440"/>
-            <w:tcBorders>
-              <w:top w:val="none" w:color="FFFFFF" w:sz="0"/>
-              <w:left w:val="none" w:color="FFFFFF" w:sz="0"/>
-              <w:bottom w:val="none" w:color="FFFFFF" w:sz="0"/>
-              <w:right w:val="none" w:color="FFFFFF" w:sz="0"/>
-            </w:tcBorders>
-            <w:shd w:fill="F1F8F2" w:color="auto" w:val="clear"/>
-            <w:tcMar>
-              <w:top w:type="dxa" w:w="40"/>
-              <w:left w:type="dxa" w:w="80"/>
-              <w:bottom w:type="dxa" w:w="40"/>
-              <w:right w:type="dxa" w:w="80"/>
-            </w:tcMar>
-            <w:vAlign w:val="center"/>
-          </w:tcPr>
-          <w:p>
-            <w:pPr>
-              <w:jc w:val="center"/>
-            </w:pPr>
-            <w:r>
-              <w:rPr>
-                <w:rFonts w:ascii="Arial" w:cs="Arial" w:eastAsia="Arial" w:hAnsi="Arial"/>
-                <w:color w:val="6B6B6B"/>
-                <w:sz w:val="15"/>
-                <w:szCs w:val="15"/>
-              </w:rPr>
-              <w:t xml:space="preserve">60s</w:t>
-            </w:r>
-          </w:p>
-        </w:tc>
-        <w:tc>
-          <w:tcPr>
-            <w:tcW w:type="dxa" w:w="5580"/>
-            <w:tcBorders>
-              <w:top w:val="none" w:color="FFFFFF" w:sz="0"/>
-              <w:left w:val="none" w:color="FFFFFF" w:sz="0"/>
-              <w:bottom w:val="none" w:color="FFFFFF" w:sz="0"/>
-              <w:right w:val="none" w:color="FFFFFF" w:sz="0"/>
-            </w:tcBorders>
-            <w:shd w:fill="F1F8F2" w:color="auto" w:val="clear"/>
-            <w:tcMar>
-              <w:top w:type="dxa" w:w="40"/>
-              <w:left w:type="dxa" w:w="80"/>
-              <w:bottom w:type="dxa" w:w="40"/>
-              <w:right w:type="dxa" w:w="80"/>
-            </w:tcMar>
-            <w:vAlign w:val="center"/>
-          </w:tcPr>
-          <w:p>
-            <w:r>
-              <w:rPr>
-                <w:rFonts w:ascii="Arial" w:cs="Arial" w:eastAsia="Arial" w:hAnsi="Arial"/>
-                <w:color w:val="6B6B6B"/>
-                <w:sz w:val="17"/>
-                <w:szCs w:val="17"/>
-              </w:rPr>
-              <w:t xml:space="preserve">Baseline 10 reps. Hands under shoulders, chest to bench, brace.</w:t>
             </w:r>
             <w:r>
               <w:rPr>
@@ -10734,7 +10759,7 @@
           <w:sz w:val="17"/>
           <w:szCs w:val="17"/>
         </w:rPr>
-        <w:t xml:space="preserve">B — PRIMARY STRENGTH — SQUAT &amp; SINGLE-LEG STANCE SQUAT (LEFT-LED)</w:t>
+        <w:t xml:space="preserve">B — PRIMARY STRENGTH — SQUAT</w:t>
       </w:r>
     </w:p>
     <w:p>
@@ -10759,7 +10784,7 @@
           <w:sz w:val="17"/>
           <w:szCs w:val="17"/>
         </w:rPr>
-        <w:t xml:space="preserve">Squat tested at 25 lbs x5 (Epley 1RM ≈29 lbs) — Week 1 trains at 20 lbs, climbing to 25 lbs by Week 4. Single-Leg Stance Squat tested at 12 lbs x5 (Epley 1RM ≈14 lbs) — Week 1 trains at 10 lbs, climbing to 12.5 lbs — left leg leads every set.</w:t>
+        <w:t xml:space="preserve">Tested at 25 lbs x5 (Epley 1RM ≈29 lbs) — Week 1 trains at 20 lbs, climbing to 25 lbs by Week 4.</w:t>
       </w:r>
     </w:p>
     <w:tbl>
@@ -11283,259 +11308,6 @@
           </w:p>
         </w:tc>
       </w:tr>
-      <w:tr>
-        <w:tc>
-          <w:tcPr>
-            <w:tcW w:type="dxa" w:w="2400"/>
-            <w:tcBorders>
-              <w:top w:val="none" w:color="FFFFFF" w:sz="0"/>
-              <w:left w:val="none" w:color="FFFFFF" w:sz="0"/>
-              <w:bottom w:val="none" w:color="FFFFFF" w:sz="0"/>
-              <w:right w:val="none" w:color="FFFFFF" w:sz="0"/>
-            </w:tcBorders>
-            <w:shd w:fill="FFFFFF" w:color="auto" w:val="clear"/>
-            <w:tcMar>
-              <w:top w:type="dxa" w:w="40"/>
-              <w:left w:type="dxa" w:w="80"/>
-              <w:bottom w:type="dxa" w:w="40"/>
-              <w:right w:type="dxa" w:w="80"/>
-            </w:tcMar>
-            <w:vAlign w:val="center"/>
-          </w:tcPr>
-          <w:p>
-            <w:r>
-              <w:rPr>
-                <w:rFonts w:ascii="Arial" w:cs="Arial" w:eastAsia="Arial" w:hAnsi="Arial"/>
-                <w:b/>
-                <w:bCs/>
-                <w:color w:val="2C2C2C"/>
-                <w:sz w:val="18"/>
-                <w:szCs w:val="18"/>
-              </w:rPr>
-              <w:t xml:space="preserve">Single-Leg Stance Squat (Left-Led)</w:t>
-            </w:r>
-          </w:p>
-          <w:p>
-            <w:r>
-              <w:rPr>
-                <w:rFonts w:ascii="Arial" w:cs="Arial" w:eastAsia="Arial" w:hAnsi="Arial"/>
-                <w:i/>
-                <w:iCs/>
-                <w:color w:val="B71C1C"/>
-                <w:sz w:val="14"/>
-                <w:szCs w:val="14"/>
-              </w:rPr>
-              <w:t xml:space="preserve">Left leg weaker (Styku) — leads every set; left hip in active tendinitis rehab, stop at sharp/pinching pain</w:t>
-            </w:r>
-          </w:p>
-        </w:tc>
-        <w:tc>
-          <w:tcPr>
-            <w:tcW w:type="dxa" w:w="380"/>
-            <w:tcBorders>
-              <w:top w:val="none" w:color="FFFFFF" w:sz="0"/>
-              <w:left w:val="none" w:color="FFFFFF" w:sz="0"/>
-              <w:bottom w:val="none" w:color="FFFFFF" w:sz="0"/>
-              <w:right w:val="none" w:color="FFFFFF" w:sz="0"/>
-            </w:tcBorders>
-            <w:shd w:fill="FFFFFF" w:color="auto" w:val="clear"/>
-            <w:tcMar>
-              <w:top w:type="dxa" w:w="40"/>
-              <w:left w:type="dxa" w:w="80"/>
-              <w:bottom w:type="dxa" w:w="40"/>
-              <w:right w:type="dxa" w:w="80"/>
-            </w:tcMar>
-            <w:vAlign w:val="center"/>
-          </w:tcPr>
-          <w:p>
-            <w:pPr>
-              <w:jc w:val="center"/>
-            </w:pPr>
-            <w:r>
-              <w:rPr>
-                <w:rFonts w:ascii="Arial" w:cs="Arial" w:eastAsia="Arial" w:hAnsi="Arial"/>
-                <w:color w:val="6B6B6B"/>
-                <w:sz w:val="15"/>
-                <w:szCs w:val="15"/>
-              </w:rPr>
-              <w:t xml:space="preserve">3</w:t>
-            </w:r>
-          </w:p>
-        </w:tc>
-        <w:tc>
-          <w:tcPr>
-            <w:tcW w:type="dxa" w:w="420"/>
-            <w:tcBorders>
-              <w:top w:val="none" w:color="FFFFFF" w:sz="0"/>
-              <w:left w:val="none" w:color="FFFFFF" w:sz="0"/>
-              <w:bottom w:val="none" w:color="FFFFFF" w:sz="0"/>
-              <w:right w:val="none" w:color="FFFFFF" w:sz="0"/>
-            </w:tcBorders>
-            <w:shd w:fill="FFFFFF" w:color="auto" w:val="clear"/>
-            <w:tcMar>
-              <w:top w:type="dxa" w:w="40"/>
-              <w:left w:type="dxa" w:w="80"/>
-              <w:bottom w:type="dxa" w:w="40"/>
-              <w:right w:type="dxa" w:w="80"/>
-            </w:tcMar>
-            <w:vAlign w:val="center"/>
-          </w:tcPr>
-          <w:p>
-            <w:pPr>
-              <w:jc w:val="center"/>
-            </w:pPr>
-            <w:r>
-              <w:rPr>
-                <w:rFonts w:ascii="Arial" w:cs="Arial" w:eastAsia="Arial" w:hAnsi="Arial"/>
-                <w:color w:val="6B6B6B"/>
-                <w:sz w:val="15"/>
-                <w:szCs w:val="15"/>
-              </w:rPr>
-              <w:t xml:space="preserve">6/side</w:t>
-            </w:r>
-          </w:p>
-        </w:tc>
-        <w:tc>
-          <w:tcPr>
-            <w:tcW w:type="dxa" w:w="680"/>
-            <w:tcBorders>
-              <w:top w:val="none" w:color="FFFFFF" w:sz="0"/>
-              <w:left w:val="none" w:color="FFFFFF" w:sz="0"/>
-              <w:bottom w:val="none" w:color="FFFFFF" w:sz="0"/>
-              <w:right w:val="none" w:color="FFFFFF" w:sz="0"/>
-            </w:tcBorders>
-            <w:shd w:fill="FFFFFF" w:color="auto" w:val="clear"/>
-            <w:tcMar>
-              <w:top w:type="dxa" w:w="40"/>
-              <w:left w:type="dxa" w:w="80"/>
-              <w:bottom w:type="dxa" w:w="40"/>
-              <w:right w:type="dxa" w:w="80"/>
-            </w:tcMar>
-            <w:vAlign w:val="center"/>
-          </w:tcPr>
-          <w:p>
-            <w:pPr>
-              <w:jc w:val="center"/>
-            </w:pPr>
-            <w:r>
-              <w:rPr>
-                <w:rFonts w:ascii="Arial" w:cs="Arial" w:eastAsia="Arial" w:hAnsi="Arial"/>
-                <w:color w:val="6B6B6B"/>
-                <w:sz w:val="15"/>
-                <w:szCs w:val="15"/>
-              </w:rPr>
-              <w:t xml:space="preserve">Wk1: 10 lbs → Wk4: 12.5 lbs</w:t>
-            </w:r>
-          </w:p>
-        </w:tc>
-        <w:tc>
-          <w:tcPr>
-            <w:tcW w:type="dxa" w:w="540"/>
-            <w:tcBorders>
-              <w:top w:val="none" w:color="FFFFFF" w:sz="0"/>
-              <w:left w:val="none" w:color="FFFFFF" w:sz="0"/>
-              <w:bottom w:val="none" w:color="FFFFFF" w:sz="0"/>
-              <w:right w:val="none" w:color="FFFFFF" w:sz="0"/>
-            </w:tcBorders>
-            <w:shd w:fill="FFFFFF" w:color="auto" w:val="clear"/>
-            <w:tcMar>
-              <w:top w:type="dxa" w:w="40"/>
-              <w:left w:type="dxa" w:w="80"/>
-              <w:bottom w:type="dxa" w:w="40"/>
-              <w:right w:type="dxa" w:w="80"/>
-            </w:tcMar>
-            <w:vAlign w:val="center"/>
-          </w:tcPr>
-          <w:p>
-            <w:pPr>
-              <w:jc w:val="center"/>
-            </w:pPr>
-            <w:r>
-              <w:rPr>
-                <w:rFonts w:ascii="Arial" w:cs="Arial" w:eastAsia="Arial" w:hAnsi="Arial"/>
-                <w:color w:val="6B6B6B"/>
-                <w:sz w:val="15"/>
-                <w:szCs w:val="15"/>
-              </w:rPr>
-              <w:t xml:space="preserve">3-1-1</w:t>
-            </w:r>
-          </w:p>
-        </w:tc>
-        <w:tc>
-          <w:tcPr>
-            <w:tcW w:type="dxa" w:w="440"/>
-            <w:tcBorders>
-              <w:top w:val="none" w:color="FFFFFF" w:sz="0"/>
-              <w:left w:val="none" w:color="FFFFFF" w:sz="0"/>
-              <w:bottom w:val="none" w:color="FFFFFF" w:sz="0"/>
-              <w:right w:val="none" w:color="FFFFFF" w:sz="0"/>
-            </w:tcBorders>
-            <w:shd w:fill="FFFFFF" w:color="auto" w:val="clear"/>
-            <w:tcMar>
-              <w:top w:type="dxa" w:w="40"/>
-              <w:left w:type="dxa" w:w="80"/>
-              <w:bottom w:type="dxa" w:w="40"/>
-              <w:right w:type="dxa" w:w="80"/>
-            </w:tcMar>
-            <w:vAlign w:val="center"/>
-          </w:tcPr>
-          <w:p>
-            <w:pPr>
-              <w:jc w:val="center"/>
-            </w:pPr>
-            <w:r>
-              <w:rPr>
-                <w:rFonts w:ascii="Arial" w:cs="Arial" w:eastAsia="Arial" w:hAnsi="Arial"/>
-                <w:color w:val="6B6B6B"/>
-                <w:sz w:val="15"/>
-                <w:szCs w:val="15"/>
-              </w:rPr>
-              <w:t xml:space="preserve">75s</w:t>
-            </w:r>
-          </w:p>
-        </w:tc>
-        <w:tc>
-          <w:tcPr>
-            <w:tcW w:type="dxa" w:w="5580"/>
-            <w:tcBorders>
-              <w:top w:val="none" w:color="FFFFFF" w:sz="0"/>
-              <w:left w:val="none" w:color="FFFFFF" w:sz="0"/>
-              <w:bottom w:val="none" w:color="FFFFFF" w:sz="0"/>
-              <w:right w:val="none" w:color="FFFFFF" w:sz="0"/>
-            </w:tcBorders>
-            <w:shd w:fill="FFFFFF" w:color="auto" w:val="clear"/>
-            <w:tcMar>
-              <w:top w:type="dxa" w:w="40"/>
-              <w:left w:type="dxa" w:w="80"/>
-              <w:bottom w:type="dxa" w:w="40"/>
-              <w:right w:type="dxa" w:w="80"/>
-            </w:tcMar>
-            <w:vAlign w:val="center"/>
-          </w:tcPr>
-          <w:p>
-            <w:r>
-              <w:rPr>
-                <w:rFonts w:ascii="Arial" w:cs="Arial" w:eastAsia="Arial" w:hAnsi="Arial"/>
-                <w:color w:val="6B6B6B"/>
-                <w:sz w:val="17"/>
-                <w:szCs w:val="17"/>
-              </w:rPr>
-              <w:t xml:space="preserve">Left leg first. Slow controlled descent, knee tracks mid-foot.</w:t>
-            </w:r>
-            <w:r>
-              <w:rPr>
-                <w:rFonts w:ascii="Arial" w:cs="Arial" w:eastAsia="Arial" w:hAnsi="Arial"/>
-                <w:i/>
-                <w:iCs/>
-                <w:color w:val="00695C"/>
-                <w:sz w:val="14"/>
-                <w:szCs w:val="14"/>
-              </w:rPr>
-              <w:t xml:space="preserve">  2 RIR</w:t>
-            </w:r>
-          </w:p>
-        </w:tc>
-      </w:tr>
     </w:tbl>
     <w:p>
       <w:pPr>
@@ -11555,7 +11327,7 @@
           <w:sz w:val="17"/>
           <w:szCs w:val="17"/>
         </w:rPr>
-        <w:t xml:space="preserve">C — SECONDARY COMPOUND — SINGLE-LEG RDL (LEFT-LED)</w:t>
+        <w:t xml:space="preserve">C — ACCESSORY — SINGLE-LEG STANCE SQUAT (LEFT-LED)</w:t>
       </w:r>
     </w:p>
     <w:p>
@@ -11580,7 +11352,7 @@
           <w:sz w:val="17"/>
           <w:szCs w:val="17"/>
         </w:rPr>
-        <w:t xml:space="preserve">Tested at 25 lbs x5 (Epley 1RM ≈29 lbs) — Week 1 trains at 22.5 lbs/side, climbing to 25 lbs/side by Week 4. Left leg leads every set.</w:t>
+        <w:t xml:space="preserve">The unilateral accessory directly behind today's squat — same knee-dominant pattern, worked one leg at a time with the left leading. Tested at 12 lbs x5 (Epley 1RM ≈14 lbs) — Week 1 trains at 10 lbs, climbing to 12.5 lbs by Week 4. Held at 2 reps in reserve — the left-hip rehab governs how hard this is pushed, not a hypertrophy default.</w:t>
       </w:r>
     </w:p>
     <w:tbl>
@@ -11880,6 +11652,1118 @@
                 <w:sz w:val="18"/>
                 <w:szCs w:val="18"/>
               </w:rPr>
+              <w:t xml:space="preserve">Single-Leg Stance Squat (Left-Led)</w:t>
+            </w:r>
+          </w:p>
+          <w:p>
+            <w:r>
+              <w:rPr>
+                <w:rFonts w:ascii="Arial" w:cs="Arial" w:eastAsia="Arial" w:hAnsi="Arial"/>
+                <w:i/>
+                <w:iCs/>
+                <w:color w:val="B71C1C"/>
+                <w:sz w:val="14"/>
+                <w:szCs w:val="14"/>
+              </w:rPr>
+              <w:t xml:space="preserve">Left leg weaker (Styku) — leads every set; left hip in active tendinitis rehab, stop at sharp/pinching pain</w:t>
+            </w:r>
+          </w:p>
+        </w:tc>
+        <w:tc>
+          <w:tcPr>
+            <w:tcW w:type="dxa" w:w="380"/>
+            <w:tcBorders>
+              <w:top w:val="none" w:color="FFFFFF" w:sz="0"/>
+              <w:left w:val="none" w:color="FFFFFF" w:sz="0"/>
+              <w:bottom w:val="none" w:color="FFFFFF" w:sz="0"/>
+              <w:right w:val="none" w:color="FFFFFF" w:sz="0"/>
+            </w:tcBorders>
+            <w:shd w:fill="F1F8F2" w:color="auto" w:val="clear"/>
+            <w:tcMar>
+              <w:top w:type="dxa" w:w="40"/>
+              <w:left w:type="dxa" w:w="80"/>
+              <w:bottom w:type="dxa" w:w="40"/>
+              <w:right w:type="dxa" w:w="80"/>
+            </w:tcMar>
+            <w:vAlign w:val="center"/>
+          </w:tcPr>
+          <w:p>
+            <w:pPr>
+              <w:jc w:val="center"/>
+            </w:pPr>
+            <w:r>
+              <w:rPr>
+                <w:rFonts w:ascii="Arial" w:cs="Arial" w:eastAsia="Arial" w:hAnsi="Arial"/>
+                <w:color w:val="6B6B6B"/>
+                <w:sz w:val="15"/>
+                <w:szCs w:val="15"/>
+              </w:rPr>
+              <w:t xml:space="preserve">3</w:t>
+            </w:r>
+          </w:p>
+        </w:tc>
+        <w:tc>
+          <w:tcPr>
+            <w:tcW w:type="dxa" w:w="420"/>
+            <w:tcBorders>
+              <w:top w:val="none" w:color="FFFFFF" w:sz="0"/>
+              <w:left w:val="none" w:color="FFFFFF" w:sz="0"/>
+              <w:bottom w:val="none" w:color="FFFFFF" w:sz="0"/>
+              <w:right w:val="none" w:color="FFFFFF" w:sz="0"/>
+            </w:tcBorders>
+            <w:shd w:fill="F1F8F2" w:color="auto" w:val="clear"/>
+            <w:tcMar>
+              <w:top w:type="dxa" w:w="40"/>
+              <w:left w:type="dxa" w:w="80"/>
+              <w:bottom w:type="dxa" w:w="40"/>
+              <w:right w:type="dxa" w:w="80"/>
+            </w:tcMar>
+            <w:vAlign w:val="center"/>
+          </w:tcPr>
+          <w:p>
+            <w:pPr>
+              <w:jc w:val="center"/>
+            </w:pPr>
+            <w:r>
+              <w:rPr>
+                <w:rFonts w:ascii="Arial" w:cs="Arial" w:eastAsia="Arial" w:hAnsi="Arial"/>
+                <w:color w:val="6B6B6B"/>
+                <w:sz w:val="15"/>
+                <w:szCs w:val="15"/>
+              </w:rPr>
+              <w:t xml:space="preserve">6/side</w:t>
+            </w:r>
+          </w:p>
+        </w:tc>
+        <w:tc>
+          <w:tcPr>
+            <w:tcW w:type="dxa" w:w="680"/>
+            <w:tcBorders>
+              <w:top w:val="none" w:color="FFFFFF" w:sz="0"/>
+              <w:left w:val="none" w:color="FFFFFF" w:sz="0"/>
+              <w:bottom w:val="none" w:color="FFFFFF" w:sz="0"/>
+              <w:right w:val="none" w:color="FFFFFF" w:sz="0"/>
+            </w:tcBorders>
+            <w:shd w:fill="F1F8F2" w:color="auto" w:val="clear"/>
+            <w:tcMar>
+              <w:top w:type="dxa" w:w="40"/>
+              <w:left w:type="dxa" w:w="80"/>
+              <w:bottom w:type="dxa" w:w="40"/>
+              <w:right w:type="dxa" w:w="80"/>
+            </w:tcMar>
+            <w:vAlign w:val="center"/>
+          </w:tcPr>
+          <w:p>
+            <w:pPr>
+              <w:jc w:val="center"/>
+            </w:pPr>
+            <w:r>
+              <w:rPr>
+                <w:rFonts w:ascii="Arial" w:cs="Arial" w:eastAsia="Arial" w:hAnsi="Arial"/>
+                <w:color w:val="6B6B6B"/>
+                <w:sz w:val="15"/>
+                <w:szCs w:val="15"/>
+              </w:rPr>
+              <w:t xml:space="preserve">Wk1: 10 lbs → Wk4: 12.5 lbs</w:t>
+            </w:r>
+          </w:p>
+        </w:tc>
+        <w:tc>
+          <w:tcPr>
+            <w:tcW w:type="dxa" w:w="540"/>
+            <w:tcBorders>
+              <w:top w:val="none" w:color="FFFFFF" w:sz="0"/>
+              <w:left w:val="none" w:color="FFFFFF" w:sz="0"/>
+              <w:bottom w:val="none" w:color="FFFFFF" w:sz="0"/>
+              <w:right w:val="none" w:color="FFFFFF" w:sz="0"/>
+            </w:tcBorders>
+            <w:shd w:fill="F1F8F2" w:color="auto" w:val="clear"/>
+            <w:tcMar>
+              <w:top w:type="dxa" w:w="40"/>
+              <w:left w:type="dxa" w:w="80"/>
+              <w:bottom w:type="dxa" w:w="40"/>
+              <w:right w:type="dxa" w:w="80"/>
+            </w:tcMar>
+            <w:vAlign w:val="center"/>
+          </w:tcPr>
+          <w:p>
+            <w:pPr>
+              <w:jc w:val="center"/>
+            </w:pPr>
+            <w:r>
+              <w:rPr>
+                <w:rFonts w:ascii="Arial" w:cs="Arial" w:eastAsia="Arial" w:hAnsi="Arial"/>
+                <w:color w:val="6B6B6B"/>
+                <w:sz w:val="15"/>
+                <w:szCs w:val="15"/>
+              </w:rPr>
+              <w:t xml:space="preserve">3-1-1</w:t>
+            </w:r>
+          </w:p>
+        </w:tc>
+        <w:tc>
+          <w:tcPr>
+            <w:tcW w:type="dxa" w:w="440"/>
+            <w:tcBorders>
+              <w:top w:val="none" w:color="FFFFFF" w:sz="0"/>
+              <w:left w:val="none" w:color="FFFFFF" w:sz="0"/>
+              <w:bottom w:val="none" w:color="FFFFFF" w:sz="0"/>
+              <w:right w:val="none" w:color="FFFFFF" w:sz="0"/>
+            </w:tcBorders>
+            <w:shd w:fill="F1F8F2" w:color="auto" w:val="clear"/>
+            <w:tcMar>
+              <w:top w:type="dxa" w:w="40"/>
+              <w:left w:type="dxa" w:w="80"/>
+              <w:bottom w:type="dxa" w:w="40"/>
+              <w:right w:type="dxa" w:w="80"/>
+            </w:tcMar>
+            <w:vAlign w:val="center"/>
+          </w:tcPr>
+          <w:p>
+            <w:pPr>
+              <w:jc w:val="center"/>
+            </w:pPr>
+            <w:r>
+              <w:rPr>
+                <w:rFonts w:ascii="Arial" w:cs="Arial" w:eastAsia="Arial" w:hAnsi="Arial"/>
+                <w:color w:val="6B6B6B"/>
+                <w:sz w:val="15"/>
+                <w:szCs w:val="15"/>
+              </w:rPr>
+              <w:t xml:space="preserve">75s</w:t>
+            </w:r>
+          </w:p>
+        </w:tc>
+        <w:tc>
+          <w:tcPr>
+            <w:tcW w:type="dxa" w:w="5580"/>
+            <w:tcBorders>
+              <w:top w:val="none" w:color="FFFFFF" w:sz="0"/>
+              <w:left w:val="none" w:color="FFFFFF" w:sz="0"/>
+              <w:bottom w:val="none" w:color="FFFFFF" w:sz="0"/>
+              <w:right w:val="none" w:color="FFFFFF" w:sz="0"/>
+            </w:tcBorders>
+            <w:shd w:fill="F1F8F2" w:color="auto" w:val="clear"/>
+            <w:tcMar>
+              <w:top w:type="dxa" w:w="40"/>
+              <w:left w:type="dxa" w:w="80"/>
+              <w:bottom w:type="dxa" w:w="40"/>
+              <w:right w:type="dxa" w:w="80"/>
+            </w:tcMar>
+            <w:vAlign w:val="center"/>
+          </w:tcPr>
+          <w:p>
+            <w:r>
+              <w:rPr>
+                <w:rFonts w:ascii="Arial" w:cs="Arial" w:eastAsia="Arial" w:hAnsi="Arial"/>
+                <w:color w:val="6B6B6B"/>
+                <w:sz w:val="17"/>
+                <w:szCs w:val="17"/>
+              </w:rPr>
+              <w:t xml:space="preserve">Left leg first. Slow controlled descent, knee tracks mid-foot.</w:t>
+            </w:r>
+            <w:r>
+              <w:rPr>
+                <w:rFonts w:ascii="Arial" w:cs="Arial" w:eastAsia="Arial" w:hAnsi="Arial"/>
+                <w:i/>
+                <w:iCs/>
+                <w:color w:val="00695C"/>
+                <w:sz w:val="14"/>
+                <w:szCs w:val="14"/>
+              </w:rPr>
+              <w:t xml:space="preserve">  2 RIR</w:t>
+            </w:r>
+          </w:p>
+        </w:tc>
+      </w:tr>
+    </w:tbl>
+    <w:p>
+      <w:pPr>
+        <w:spacing w:after="100"/>
+      </w:pPr>
+    </w:p>
+    <w:p>
+      <w:pPr>
+        <w:spacing w:after="60" w:before="120"/>
+      </w:pPr>
+      <w:r>
+        <w:rPr>
+          <w:rFonts w:ascii="Arial" w:cs="Arial" w:eastAsia="Arial" w:hAnsi="Arial"/>
+          <w:b/>
+          <w:bCs/>
+          <w:color w:val="E53935"/>
+          <w:sz w:val="17"/>
+          <w:szCs w:val="17"/>
+        </w:rPr>
+        <w:t xml:space="preserve">D — PT-LED POSTURAL PULL — FLOOR ROW ON FOAM ROLLER</w:t>
+      </w:r>
+    </w:p>
+    <w:p>
+      <w:pPr>
+        <w:spacing w:after="80"/>
+      </w:pPr>
+      <w:r>
+        <w:rPr>
+          <w:rFonts w:ascii="Arial" w:cs="Arial" w:eastAsia="Arial" w:hAnsi="Arial"/>
+          <w:b/>
+          <w:bCs/>
+          <w:color w:val="E53935"/>
+          <w:sz w:val="17"/>
+          <w:szCs w:val="17"/>
+        </w:rPr>
+        <w:t xml:space="preserve">Why:  </w:t>
+      </w:r>
+      <w:r>
+        <w:rPr>
+          <w:rFonts w:ascii="Arial" w:cs="Arial" w:eastAsia="Arial" w:hAnsi="Arial"/>
+          <w:color w:val="2C2C2C"/>
+          <w:sz w:val="17"/>
+          <w:szCs w:val="17"/>
+        </w:rPr>
+        <w:t xml:space="preserve">Carried into this session from her PT-led work with Jason Bethea, Brace Life's in-house Trainer/Physical Therapist — an unstable-surface, core-integrated pulling accessory supporting the documented left-shoulder postural work. It gives this lower-body day its one upper-back touch, and deliberately rotates the movement pattern between the squat work above and the hinge work below.</w:t>
+      </w:r>
+    </w:p>
+    <w:tbl>
+      <w:tblPr>
+        <w:tblW w:type="dxa" w:w="10440"/>
+        <w:tblBorders>
+          <w:top w:val="none" w:color="FFFFFF" w:sz="0"/>
+          <w:left w:val="none" w:color="FFFFFF" w:sz="0"/>
+          <w:bottom w:val="none" w:color="FFFFFF" w:sz="0"/>
+          <w:right w:val="none" w:color="FFFFFF" w:sz="0"/>
+          <w:insideH w:val="single" w:color="auto" w:sz="4"/>
+          <w:insideV w:val="single" w:color="auto" w:sz="4"/>
+        </w:tblBorders>
+      </w:tblPr>
+      <w:tblGrid>
+        <w:gridCol w:w="2400"/>
+        <w:gridCol w:w="380"/>
+        <w:gridCol w:w="420"/>
+        <w:gridCol w:w="680"/>
+        <w:gridCol w:w="540"/>
+        <w:gridCol w:w="440"/>
+        <w:gridCol w:w="5580"/>
+      </w:tblGrid>
+      <w:tr>
+        <w:tc>
+          <w:tcPr>
+            <w:tcW w:type="dxa" w:w="2400"/>
+            <w:tcBorders>
+              <w:top w:val="none" w:color="FFFFFF" w:sz="0"/>
+              <w:left w:val="none" w:color="FFFFFF" w:sz="0"/>
+              <w:bottom w:val="none" w:color="FFFFFF" w:sz="0"/>
+              <w:right w:val="none" w:color="FFFFFF" w:sz="0"/>
+            </w:tcBorders>
+            <w:shd w:fill="FFEBEE" w:color="auto" w:val="clear"/>
+            <w:tcMar>
+              <w:top w:type="dxa" w:w="40"/>
+              <w:left w:type="dxa" w:w="80"/>
+              <w:bottom w:type="dxa" w:w="40"/>
+              <w:right w:type="dxa" w:w="80"/>
+            </w:tcMar>
+            <w:vAlign w:val="center"/>
+          </w:tcPr>
+          <w:p>
+            <w:pPr>
+              <w:jc w:val="left"/>
+            </w:pPr>
+            <w:r>
+              <w:rPr>
+                <w:rFonts w:ascii="Arial" w:cs="Arial" w:eastAsia="Arial" w:hAnsi="Arial"/>
+                <w:b/>
+                <w:bCs/>
+                <w:color w:val="E53935"/>
+                <w:sz w:val="15"/>
+                <w:szCs w:val="15"/>
+              </w:rPr>
+              <w:t xml:space="preserve">EXERCISE</w:t>
+            </w:r>
+          </w:p>
+        </w:tc>
+        <w:tc>
+          <w:tcPr>
+            <w:tcW w:type="dxa" w:w="380"/>
+            <w:tcBorders>
+              <w:top w:val="none" w:color="FFFFFF" w:sz="0"/>
+              <w:left w:val="none" w:color="FFFFFF" w:sz="0"/>
+              <w:bottom w:val="none" w:color="FFFFFF" w:sz="0"/>
+              <w:right w:val="none" w:color="FFFFFF" w:sz="0"/>
+            </w:tcBorders>
+            <w:shd w:fill="FFEBEE" w:color="auto" w:val="clear"/>
+            <w:tcMar>
+              <w:top w:type="dxa" w:w="40"/>
+              <w:left w:type="dxa" w:w="80"/>
+              <w:bottom w:type="dxa" w:w="40"/>
+              <w:right w:type="dxa" w:w="80"/>
+            </w:tcMar>
+            <w:vAlign w:val="center"/>
+          </w:tcPr>
+          <w:p>
+            <w:pPr>
+              <w:jc w:val="center"/>
+            </w:pPr>
+            <w:r>
+              <w:rPr>
+                <w:rFonts w:ascii="Arial" w:cs="Arial" w:eastAsia="Arial" w:hAnsi="Arial"/>
+                <w:b/>
+                <w:bCs/>
+                <w:color w:val="E53935"/>
+                <w:sz w:val="13"/>
+                <w:szCs w:val="13"/>
+              </w:rPr>
+              <w:t xml:space="preserve">SETS</w:t>
+            </w:r>
+          </w:p>
+        </w:tc>
+        <w:tc>
+          <w:tcPr>
+            <w:tcW w:type="dxa" w:w="420"/>
+            <w:tcBorders>
+              <w:top w:val="none" w:color="FFFFFF" w:sz="0"/>
+              <w:left w:val="none" w:color="FFFFFF" w:sz="0"/>
+              <w:bottom w:val="none" w:color="FFFFFF" w:sz="0"/>
+              <w:right w:val="none" w:color="FFFFFF" w:sz="0"/>
+            </w:tcBorders>
+            <w:shd w:fill="FFEBEE" w:color="auto" w:val="clear"/>
+            <w:tcMar>
+              <w:top w:type="dxa" w:w="40"/>
+              <w:left w:type="dxa" w:w="80"/>
+              <w:bottom w:type="dxa" w:w="40"/>
+              <w:right w:type="dxa" w:w="80"/>
+            </w:tcMar>
+            <w:vAlign w:val="center"/>
+          </w:tcPr>
+          <w:p>
+            <w:pPr>
+              <w:jc w:val="center"/>
+            </w:pPr>
+            <w:r>
+              <w:rPr>
+                <w:rFonts w:ascii="Arial" w:cs="Arial" w:eastAsia="Arial" w:hAnsi="Arial"/>
+                <w:b/>
+                <w:bCs/>
+                <w:color w:val="E53935"/>
+                <w:sz w:val="13"/>
+                <w:szCs w:val="13"/>
+              </w:rPr>
+              <w:t xml:space="preserve">REPS</w:t>
+            </w:r>
+          </w:p>
+        </w:tc>
+        <w:tc>
+          <w:tcPr>
+            <w:tcW w:type="dxa" w:w="680"/>
+            <w:tcBorders>
+              <w:top w:val="none" w:color="FFFFFF" w:sz="0"/>
+              <w:left w:val="none" w:color="FFFFFF" w:sz="0"/>
+              <w:bottom w:val="none" w:color="FFFFFF" w:sz="0"/>
+              <w:right w:val="none" w:color="FFFFFF" w:sz="0"/>
+            </w:tcBorders>
+            <w:shd w:fill="FFEBEE" w:color="auto" w:val="clear"/>
+            <w:tcMar>
+              <w:top w:type="dxa" w:w="40"/>
+              <w:left w:type="dxa" w:w="80"/>
+              <w:bottom w:type="dxa" w:w="40"/>
+              <w:right w:type="dxa" w:w="80"/>
+            </w:tcMar>
+            <w:vAlign w:val="center"/>
+          </w:tcPr>
+          <w:p>
+            <w:pPr>
+              <w:jc w:val="center"/>
+            </w:pPr>
+            <w:r>
+              <w:rPr>
+                <w:rFonts w:ascii="Arial" w:cs="Arial" w:eastAsia="Arial" w:hAnsi="Arial"/>
+                <w:b/>
+                <w:bCs/>
+                <w:color w:val="E53935"/>
+                <w:sz w:val="13"/>
+                <w:szCs w:val="13"/>
+              </w:rPr>
+              <w:t xml:space="preserve">LOAD</w:t>
+            </w:r>
+          </w:p>
+        </w:tc>
+        <w:tc>
+          <w:tcPr>
+            <w:tcW w:type="dxa" w:w="540"/>
+            <w:tcBorders>
+              <w:top w:val="none" w:color="FFFFFF" w:sz="0"/>
+              <w:left w:val="none" w:color="FFFFFF" w:sz="0"/>
+              <w:bottom w:val="none" w:color="FFFFFF" w:sz="0"/>
+              <w:right w:val="none" w:color="FFFFFF" w:sz="0"/>
+            </w:tcBorders>
+            <w:shd w:fill="FFEBEE" w:color="auto" w:val="clear"/>
+            <w:tcMar>
+              <w:top w:type="dxa" w:w="40"/>
+              <w:left w:type="dxa" w:w="80"/>
+              <w:bottom w:type="dxa" w:w="40"/>
+              <w:right w:type="dxa" w:w="80"/>
+            </w:tcMar>
+            <w:vAlign w:val="center"/>
+          </w:tcPr>
+          <w:p>
+            <w:pPr>
+              <w:jc w:val="center"/>
+            </w:pPr>
+            <w:r>
+              <w:rPr>
+                <w:rFonts w:ascii="Arial" w:cs="Arial" w:eastAsia="Arial" w:hAnsi="Arial"/>
+                <w:b/>
+                <w:bCs/>
+                <w:color w:val="E53935"/>
+                <w:sz w:val="13"/>
+                <w:szCs w:val="13"/>
+              </w:rPr>
+              <w:t xml:space="preserve">TEMPO</w:t>
+            </w:r>
+          </w:p>
+        </w:tc>
+        <w:tc>
+          <w:tcPr>
+            <w:tcW w:type="dxa" w:w="440"/>
+            <w:tcBorders>
+              <w:top w:val="none" w:color="FFFFFF" w:sz="0"/>
+              <w:left w:val="none" w:color="FFFFFF" w:sz="0"/>
+              <w:bottom w:val="none" w:color="FFFFFF" w:sz="0"/>
+              <w:right w:val="none" w:color="FFFFFF" w:sz="0"/>
+            </w:tcBorders>
+            <w:shd w:fill="FFEBEE" w:color="auto" w:val="clear"/>
+            <w:tcMar>
+              <w:top w:type="dxa" w:w="40"/>
+              <w:left w:type="dxa" w:w="80"/>
+              <w:bottom w:type="dxa" w:w="40"/>
+              <w:right w:type="dxa" w:w="80"/>
+            </w:tcMar>
+            <w:vAlign w:val="center"/>
+          </w:tcPr>
+          <w:p>
+            <w:pPr>
+              <w:jc w:val="center"/>
+            </w:pPr>
+            <w:r>
+              <w:rPr>
+                <w:rFonts w:ascii="Arial" w:cs="Arial" w:eastAsia="Arial" w:hAnsi="Arial"/>
+                <w:b/>
+                <w:bCs/>
+                <w:color w:val="E53935"/>
+                <w:sz w:val="13"/>
+                <w:szCs w:val="13"/>
+              </w:rPr>
+              <w:t xml:space="preserve">REST</w:t>
+            </w:r>
+          </w:p>
+        </w:tc>
+        <w:tc>
+          <w:tcPr>
+            <w:tcW w:type="dxa" w:w="5580"/>
+            <w:tcBorders>
+              <w:top w:val="none" w:color="FFFFFF" w:sz="0"/>
+              <w:left w:val="none" w:color="FFFFFF" w:sz="0"/>
+              <w:bottom w:val="none" w:color="FFFFFF" w:sz="0"/>
+              <w:right w:val="none" w:color="FFFFFF" w:sz="0"/>
+            </w:tcBorders>
+            <w:shd w:fill="FFEBEE" w:color="auto" w:val="clear"/>
+            <w:tcMar>
+              <w:top w:type="dxa" w:w="40"/>
+              <w:left w:type="dxa" w:w="80"/>
+              <w:bottom w:type="dxa" w:w="40"/>
+              <w:right w:type="dxa" w:w="80"/>
+            </w:tcMar>
+            <w:vAlign w:val="center"/>
+          </w:tcPr>
+          <w:p>
+            <w:pPr>
+              <w:jc w:val="left"/>
+            </w:pPr>
+            <w:r>
+              <w:rPr>
+                <w:rFonts w:ascii="Arial" w:cs="Arial" w:eastAsia="Arial" w:hAnsi="Arial"/>
+                <w:b/>
+                <w:bCs/>
+                <w:color w:val="E53935"/>
+                <w:sz w:val="15"/>
+                <w:szCs w:val="15"/>
+              </w:rPr>
+              <w:t xml:space="preserve">COACHING CUE</w:t>
+            </w:r>
+          </w:p>
+        </w:tc>
+      </w:tr>
+      <w:tr>
+        <w:tc>
+          <w:tcPr>
+            <w:tcW w:type="dxa" w:w="2400"/>
+            <w:tcBorders>
+              <w:top w:val="none" w:color="FFFFFF" w:sz="0"/>
+              <w:left w:val="none" w:color="FFFFFF" w:sz="0"/>
+              <w:bottom w:val="none" w:color="FFFFFF" w:sz="0"/>
+              <w:right w:val="none" w:color="FFFFFF" w:sz="0"/>
+            </w:tcBorders>
+            <w:shd w:fill="FFF5F5" w:color="auto" w:val="clear"/>
+            <w:tcMar>
+              <w:top w:type="dxa" w:w="40"/>
+              <w:left w:type="dxa" w:w="80"/>
+              <w:bottom w:type="dxa" w:w="40"/>
+              <w:right w:type="dxa" w:w="80"/>
+            </w:tcMar>
+            <w:vAlign w:val="center"/>
+          </w:tcPr>
+          <w:p>
+            <w:r>
+              <w:rPr>
+                <w:rFonts w:ascii="Arial" w:cs="Arial" w:eastAsia="Arial" w:hAnsi="Arial"/>
+                <w:b/>
+                <w:bCs/>
+                <w:color w:val="2C2C2C"/>
+                <w:sz w:val="18"/>
+                <w:szCs w:val="18"/>
+              </w:rPr>
+              <w:t xml:space="preserve">Floor Row on Foam Roller</w:t>
+            </w:r>
+          </w:p>
+        </w:tc>
+        <w:tc>
+          <w:tcPr>
+            <w:tcW w:type="dxa" w:w="380"/>
+            <w:tcBorders>
+              <w:top w:val="none" w:color="FFFFFF" w:sz="0"/>
+              <w:left w:val="none" w:color="FFFFFF" w:sz="0"/>
+              <w:bottom w:val="none" w:color="FFFFFF" w:sz="0"/>
+              <w:right w:val="none" w:color="FFFFFF" w:sz="0"/>
+            </w:tcBorders>
+            <w:shd w:fill="FFF5F5" w:color="auto" w:val="clear"/>
+            <w:tcMar>
+              <w:top w:type="dxa" w:w="40"/>
+              <w:left w:type="dxa" w:w="80"/>
+              <w:bottom w:type="dxa" w:w="40"/>
+              <w:right w:type="dxa" w:w="80"/>
+            </w:tcMar>
+            <w:vAlign w:val="center"/>
+          </w:tcPr>
+          <w:p>
+            <w:pPr>
+              <w:jc w:val="center"/>
+            </w:pPr>
+            <w:r>
+              <w:rPr>
+                <w:rFonts w:ascii="Arial" w:cs="Arial" w:eastAsia="Arial" w:hAnsi="Arial"/>
+                <w:color w:val="6B6B6B"/>
+                <w:sz w:val="15"/>
+                <w:szCs w:val="15"/>
+              </w:rPr>
+              <w:t xml:space="preserve">2</w:t>
+            </w:r>
+          </w:p>
+        </w:tc>
+        <w:tc>
+          <w:tcPr>
+            <w:tcW w:type="dxa" w:w="420"/>
+            <w:tcBorders>
+              <w:top w:val="none" w:color="FFFFFF" w:sz="0"/>
+              <w:left w:val="none" w:color="FFFFFF" w:sz="0"/>
+              <w:bottom w:val="none" w:color="FFFFFF" w:sz="0"/>
+              <w:right w:val="none" w:color="FFFFFF" w:sz="0"/>
+            </w:tcBorders>
+            <w:shd w:fill="FFF5F5" w:color="auto" w:val="clear"/>
+            <w:tcMar>
+              <w:top w:type="dxa" w:w="40"/>
+              <w:left w:type="dxa" w:w="80"/>
+              <w:bottom w:type="dxa" w:w="40"/>
+              <w:right w:type="dxa" w:w="80"/>
+            </w:tcMar>
+            <w:vAlign w:val="center"/>
+          </w:tcPr>
+          <w:p>
+            <w:pPr>
+              <w:jc w:val="center"/>
+            </w:pPr>
+            <w:r>
+              <w:rPr>
+                <w:rFonts w:ascii="Arial" w:cs="Arial" w:eastAsia="Arial" w:hAnsi="Arial"/>
+                <w:color w:val="6B6B6B"/>
+                <w:sz w:val="15"/>
+                <w:szCs w:val="15"/>
+              </w:rPr>
+              <w:t xml:space="preserve">10-12</w:t>
+            </w:r>
+          </w:p>
+        </w:tc>
+        <w:tc>
+          <w:tcPr>
+            <w:tcW w:type="dxa" w:w="680"/>
+            <w:tcBorders>
+              <w:top w:val="none" w:color="FFFFFF" w:sz="0"/>
+              <w:left w:val="none" w:color="FFFFFF" w:sz="0"/>
+              <w:bottom w:val="none" w:color="FFFFFF" w:sz="0"/>
+              <w:right w:val="none" w:color="FFFFFF" w:sz="0"/>
+            </w:tcBorders>
+            <w:shd w:fill="FFF5F5" w:color="auto" w:val="clear"/>
+            <w:tcMar>
+              <w:top w:type="dxa" w:w="40"/>
+              <w:left w:type="dxa" w:w="80"/>
+              <w:bottom w:type="dxa" w:w="40"/>
+              <w:right w:type="dxa" w:w="80"/>
+            </w:tcMar>
+            <w:vAlign w:val="center"/>
+          </w:tcPr>
+          <w:p>
+            <w:pPr>
+              <w:jc w:val="center"/>
+            </w:pPr>
+            <w:r>
+              <w:rPr>
+                <w:rFonts w:ascii="Arial" w:cs="Arial" w:eastAsia="Arial" w:hAnsi="Arial"/>
+                <w:color w:val="6B6B6B"/>
+                <w:sz w:val="15"/>
+                <w:szCs w:val="15"/>
+              </w:rPr>
+              <w:t xml:space="preserve">light band or DB</w:t>
+            </w:r>
+          </w:p>
+        </w:tc>
+        <w:tc>
+          <w:tcPr>
+            <w:tcW w:type="dxa" w:w="540"/>
+            <w:tcBorders>
+              <w:top w:val="none" w:color="FFFFFF" w:sz="0"/>
+              <w:left w:val="none" w:color="FFFFFF" w:sz="0"/>
+              <w:bottom w:val="none" w:color="FFFFFF" w:sz="0"/>
+              <w:right w:val="none" w:color="FFFFFF" w:sz="0"/>
+            </w:tcBorders>
+            <w:shd w:fill="FFF5F5" w:color="auto" w:val="clear"/>
+            <w:tcMar>
+              <w:top w:type="dxa" w:w="40"/>
+              <w:left w:type="dxa" w:w="80"/>
+              <w:bottom w:type="dxa" w:w="40"/>
+              <w:right w:type="dxa" w:w="80"/>
+            </w:tcMar>
+            <w:vAlign w:val="center"/>
+          </w:tcPr>
+          <w:p>
+            <w:pPr>
+              <w:jc w:val="center"/>
+            </w:pPr>
+            <w:r>
+              <w:rPr>
+                <w:rFonts w:ascii="Arial" w:cs="Arial" w:eastAsia="Arial" w:hAnsi="Arial"/>
+                <w:color w:val="6B6B6B"/>
+                <w:sz w:val="15"/>
+                <w:szCs w:val="15"/>
+              </w:rPr>
+              <w:t xml:space="preserve">2-1-2</w:t>
+            </w:r>
+          </w:p>
+        </w:tc>
+        <w:tc>
+          <w:tcPr>
+            <w:tcW w:type="dxa" w:w="440"/>
+            <w:tcBorders>
+              <w:top w:val="none" w:color="FFFFFF" w:sz="0"/>
+              <w:left w:val="none" w:color="FFFFFF" w:sz="0"/>
+              <w:bottom w:val="none" w:color="FFFFFF" w:sz="0"/>
+              <w:right w:val="none" w:color="FFFFFF" w:sz="0"/>
+            </w:tcBorders>
+            <w:shd w:fill="FFF5F5" w:color="auto" w:val="clear"/>
+            <w:tcMar>
+              <w:top w:type="dxa" w:w="40"/>
+              <w:left w:type="dxa" w:w="80"/>
+              <w:bottom w:type="dxa" w:w="40"/>
+              <w:right w:type="dxa" w:w="80"/>
+            </w:tcMar>
+            <w:vAlign w:val="center"/>
+          </w:tcPr>
+          <w:p>
+            <w:pPr>
+              <w:jc w:val="center"/>
+            </w:pPr>
+            <w:r>
+              <w:rPr>
+                <w:rFonts w:ascii="Arial" w:cs="Arial" w:eastAsia="Arial" w:hAnsi="Arial"/>
+                <w:color w:val="6B6B6B"/>
+                <w:sz w:val="15"/>
+                <w:szCs w:val="15"/>
+              </w:rPr>
+              <w:t xml:space="preserve">30s</w:t>
+            </w:r>
+          </w:p>
+        </w:tc>
+        <w:tc>
+          <w:tcPr>
+            <w:tcW w:type="dxa" w:w="5580"/>
+            <w:tcBorders>
+              <w:top w:val="none" w:color="FFFFFF" w:sz="0"/>
+              <w:left w:val="none" w:color="FFFFFF" w:sz="0"/>
+              <w:bottom w:val="none" w:color="FFFFFF" w:sz="0"/>
+              <w:right w:val="none" w:color="FFFFFF" w:sz="0"/>
+            </w:tcBorders>
+            <w:shd w:fill="FFF5F5" w:color="auto" w:val="clear"/>
+            <w:tcMar>
+              <w:top w:type="dxa" w:w="40"/>
+              <w:left w:type="dxa" w:w="80"/>
+              <w:bottom w:type="dxa" w:w="40"/>
+              <w:right w:type="dxa" w:w="80"/>
+            </w:tcMar>
+            <w:vAlign w:val="center"/>
+          </w:tcPr>
+          <w:p>
+            <w:r>
+              <w:rPr>
+                <w:rFonts w:ascii="Arial" w:cs="Arial" w:eastAsia="Arial" w:hAnsi="Arial"/>
+                <w:color w:val="6B6B6B"/>
+                <w:sz w:val="17"/>
+                <w:szCs w:val="17"/>
+              </w:rPr>
+              <w:t xml:space="preserve">Row variant performed lying prone over a foam roller — unstable-surface, core-integrated pulling accessory. Pull to hip, squeeze shoulder blade, no compensatory shrug.</w:t>
+            </w:r>
+          </w:p>
+        </w:tc>
+      </w:tr>
+    </w:tbl>
+    <w:p>
+      <w:pPr>
+        <w:spacing w:after="100"/>
+      </w:pPr>
+    </w:p>
+    <w:p>
+      <w:pPr>
+        <w:spacing w:after="60" w:before="120"/>
+      </w:pPr>
+      <w:r>
+        <w:rPr>
+          <w:rFonts w:ascii="Arial" w:cs="Arial" w:eastAsia="Arial" w:hAnsi="Arial"/>
+          <w:b/>
+          <w:bCs/>
+          <w:color w:val="43A047"/>
+          <w:sz w:val="17"/>
+          <w:szCs w:val="17"/>
+        </w:rPr>
+        <w:t xml:space="preserve">E — SECONDARY COMPOUND — SINGLE-LEG RDL (LEFT-LED)</w:t>
+      </w:r>
+    </w:p>
+    <w:p>
+      <w:pPr>
+        <w:spacing w:after="80"/>
+      </w:pPr>
+      <w:r>
+        <w:rPr>
+          <w:rFonts w:ascii="Arial" w:cs="Arial" w:eastAsia="Arial" w:hAnsi="Arial"/>
+          <w:b/>
+          <w:bCs/>
+          <w:color w:val="43A047"/>
+          <w:sz w:val="17"/>
+          <w:szCs w:val="17"/>
+        </w:rPr>
+        <w:t xml:space="preserve">Load Target:  </w:t>
+      </w:r>
+      <w:r>
+        <w:rPr>
+          <w:rFonts w:ascii="Arial" w:cs="Arial" w:eastAsia="Arial" w:hAnsi="Arial"/>
+          <w:color w:val="2C2C2C"/>
+          <w:sz w:val="17"/>
+          <w:szCs w:val="17"/>
+        </w:rPr>
+        <w:t xml:space="preserve">The day's second compound pattern — a hip hinge, rotating off the knee-dominant squat work above. Tested at 25 lbs x5 (Epley 1RM ≈29 lbs) — Week 1 trains at 22.5 lbs/side, climbing to 25 lbs/side by Week 4. Left leg leads every set.</w:t>
+      </w:r>
+    </w:p>
+    <w:tbl>
+      <w:tblPr>
+        <w:tblW w:type="dxa" w:w="10440"/>
+        <w:tblBorders>
+          <w:top w:val="none" w:color="FFFFFF" w:sz="0"/>
+          <w:left w:val="none" w:color="FFFFFF" w:sz="0"/>
+          <w:bottom w:val="none" w:color="FFFFFF" w:sz="0"/>
+          <w:right w:val="none" w:color="FFFFFF" w:sz="0"/>
+          <w:insideH w:val="single" w:color="auto" w:sz="4"/>
+          <w:insideV w:val="single" w:color="auto" w:sz="4"/>
+        </w:tblBorders>
+      </w:tblPr>
+      <w:tblGrid>
+        <w:gridCol w:w="2400"/>
+        <w:gridCol w:w="380"/>
+        <w:gridCol w:w="420"/>
+        <w:gridCol w:w="680"/>
+        <w:gridCol w:w="540"/>
+        <w:gridCol w:w="440"/>
+        <w:gridCol w:w="5580"/>
+      </w:tblGrid>
+      <w:tr>
+        <w:tc>
+          <w:tcPr>
+            <w:tcW w:type="dxa" w:w="2400"/>
+            <w:tcBorders>
+              <w:top w:val="none" w:color="FFFFFF" w:sz="0"/>
+              <w:left w:val="none" w:color="FFFFFF" w:sz="0"/>
+              <w:bottom w:val="none" w:color="FFFFFF" w:sz="0"/>
+              <w:right w:val="none" w:color="FFFFFF" w:sz="0"/>
+            </w:tcBorders>
+            <w:shd w:fill="E8F5E9" w:color="auto" w:val="clear"/>
+            <w:tcMar>
+              <w:top w:type="dxa" w:w="40"/>
+              <w:left w:type="dxa" w:w="80"/>
+              <w:bottom w:type="dxa" w:w="40"/>
+              <w:right w:type="dxa" w:w="80"/>
+            </w:tcMar>
+            <w:vAlign w:val="center"/>
+          </w:tcPr>
+          <w:p>
+            <w:pPr>
+              <w:jc w:val="left"/>
+            </w:pPr>
+            <w:r>
+              <w:rPr>
+                <w:rFonts w:ascii="Arial" w:cs="Arial" w:eastAsia="Arial" w:hAnsi="Arial"/>
+                <w:b/>
+                <w:bCs/>
+                <w:color w:val="43A047"/>
+                <w:sz w:val="15"/>
+                <w:szCs w:val="15"/>
+              </w:rPr>
+              <w:t xml:space="preserve">EXERCISE</w:t>
+            </w:r>
+          </w:p>
+        </w:tc>
+        <w:tc>
+          <w:tcPr>
+            <w:tcW w:type="dxa" w:w="380"/>
+            <w:tcBorders>
+              <w:top w:val="none" w:color="FFFFFF" w:sz="0"/>
+              <w:left w:val="none" w:color="FFFFFF" w:sz="0"/>
+              <w:bottom w:val="none" w:color="FFFFFF" w:sz="0"/>
+              <w:right w:val="none" w:color="FFFFFF" w:sz="0"/>
+            </w:tcBorders>
+            <w:shd w:fill="E8F5E9" w:color="auto" w:val="clear"/>
+            <w:tcMar>
+              <w:top w:type="dxa" w:w="40"/>
+              <w:left w:type="dxa" w:w="80"/>
+              <w:bottom w:type="dxa" w:w="40"/>
+              <w:right w:type="dxa" w:w="80"/>
+            </w:tcMar>
+            <w:vAlign w:val="center"/>
+          </w:tcPr>
+          <w:p>
+            <w:pPr>
+              <w:jc w:val="center"/>
+            </w:pPr>
+            <w:r>
+              <w:rPr>
+                <w:rFonts w:ascii="Arial" w:cs="Arial" w:eastAsia="Arial" w:hAnsi="Arial"/>
+                <w:b/>
+                <w:bCs/>
+                <w:color w:val="43A047"/>
+                <w:sz w:val="13"/>
+                <w:szCs w:val="13"/>
+              </w:rPr>
+              <w:t xml:space="preserve">SETS</w:t>
+            </w:r>
+          </w:p>
+        </w:tc>
+        <w:tc>
+          <w:tcPr>
+            <w:tcW w:type="dxa" w:w="420"/>
+            <w:tcBorders>
+              <w:top w:val="none" w:color="FFFFFF" w:sz="0"/>
+              <w:left w:val="none" w:color="FFFFFF" w:sz="0"/>
+              <w:bottom w:val="none" w:color="FFFFFF" w:sz="0"/>
+              <w:right w:val="none" w:color="FFFFFF" w:sz="0"/>
+            </w:tcBorders>
+            <w:shd w:fill="E8F5E9" w:color="auto" w:val="clear"/>
+            <w:tcMar>
+              <w:top w:type="dxa" w:w="40"/>
+              <w:left w:type="dxa" w:w="80"/>
+              <w:bottom w:type="dxa" w:w="40"/>
+              <w:right w:type="dxa" w:w="80"/>
+            </w:tcMar>
+            <w:vAlign w:val="center"/>
+          </w:tcPr>
+          <w:p>
+            <w:pPr>
+              <w:jc w:val="center"/>
+            </w:pPr>
+            <w:r>
+              <w:rPr>
+                <w:rFonts w:ascii="Arial" w:cs="Arial" w:eastAsia="Arial" w:hAnsi="Arial"/>
+                <w:b/>
+                <w:bCs/>
+                <w:color w:val="43A047"/>
+                <w:sz w:val="13"/>
+                <w:szCs w:val="13"/>
+              </w:rPr>
+              <w:t xml:space="preserve">REPS</w:t>
+            </w:r>
+          </w:p>
+        </w:tc>
+        <w:tc>
+          <w:tcPr>
+            <w:tcW w:type="dxa" w:w="680"/>
+            <w:tcBorders>
+              <w:top w:val="none" w:color="FFFFFF" w:sz="0"/>
+              <w:left w:val="none" w:color="FFFFFF" w:sz="0"/>
+              <w:bottom w:val="none" w:color="FFFFFF" w:sz="0"/>
+              <w:right w:val="none" w:color="FFFFFF" w:sz="0"/>
+            </w:tcBorders>
+            <w:shd w:fill="E8F5E9" w:color="auto" w:val="clear"/>
+            <w:tcMar>
+              <w:top w:type="dxa" w:w="40"/>
+              <w:left w:type="dxa" w:w="80"/>
+              <w:bottom w:type="dxa" w:w="40"/>
+              <w:right w:type="dxa" w:w="80"/>
+            </w:tcMar>
+            <w:vAlign w:val="center"/>
+          </w:tcPr>
+          <w:p>
+            <w:pPr>
+              <w:jc w:val="center"/>
+            </w:pPr>
+            <w:r>
+              <w:rPr>
+                <w:rFonts w:ascii="Arial" w:cs="Arial" w:eastAsia="Arial" w:hAnsi="Arial"/>
+                <w:b/>
+                <w:bCs/>
+                <w:color w:val="43A047"/>
+                <w:sz w:val="13"/>
+                <w:szCs w:val="13"/>
+              </w:rPr>
+              <w:t xml:space="preserve">LOAD</w:t>
+            </w:r>
+          </w:p>
+        </w:tc>
+        <w:tc>
+          <w:tcPr>
+            <w:tcW w:type="dxa" w:w="540"/>
+            <w:tcBorders>
+              <w:top w:val="none" w:color="FFFFFF" w:sz="0"/>
+              <w:left w:val="none" w:color="FFFFFF" w:sz="0"/>
+              <w:bottom w:val="none" w:color="FFFFFF" w:sz="0"/>
+              <w:right w:val="none" w:color="FFFFFF" w:sz="0"/>
+            </w:tcBorders>
+            <w:shd w:fill="E8F5E9" w:color="auto" w:val="clear"/>
+            <w:tcMar>
+              <w:top w:type="dxa" w:w="40"/>
+              <w:left w:type="dxa" w:w="80"/>
+              <w:bottom w:type="dxa" w:w="40"/>
+              <w:right w:type="dxa" w:w="80"/>
+            </w:tcMar>
+            <w:vAlign w:val="center"/>
+          </w:tcPr>
+          <w:p>
+            <w:pPr>
+              <w:jc w:val="center"/>
+            </w:pPr>
+            <w:r>
+              <w:rPr>
+                <w:rFonts w:ascii="Arial" w:cs="Arial" w:eastAsia="Arial" w:hAnsi="Arial"/>
+                <w:b/>
+                <w:bCs/>
+                <w:color w:val="43A047"/>
+                <w:sz w:val="13"/>
+                <w:szCs w:val="13"/>
+              </w:rPr>
+              <w:t xml:space="preserve">TEMPO</w:t>
+            </w:r>
+          </w:p>
+        </w:tc>
+        <w:tc>
+          <w:tcPr>
+            <w:tcW w:type="dxa" w:w="440"/>
+            <w:tcBorders>
+              <w:top w:val="none" w:color="FFFFFF" w:sz="0"/>
+              <w:left w:val="none" w:color="FFFFFF" w:sz="0"/>
+              <w:bottom w:val="none" w:color="FFFFFF" w:sz="0"/>
+              <w:right w:val="none" w:color="FFFFFF" w:sz="0"/>
+            </w:tcBorders>
+            <w:shd w:fill="E8F5E9" w:color="auto" w:val="clear"/>
+            <w:tcMar>
+              <w:top w:type="dxa" w:w="40"/>
+              <w:left w:type="dxa" w:w="80"/>
+              <w:bottom w:type="dxa" w:w="40"/>
+              <w:right w:type="dxa" w:w="80"/>
+            </w:tcMar>
+            <w:vAlign w:val="center"/>
+          </w:tcPr>
+          <w:p>
+            <w:pPr>
+              <w:jc w:val="center"/>
+            </w:pPr>
+            <w:r>
+              <w:rPr>
+                <w:rFonts w:ascii="Arial" w:cs="Arial" w:eastAsia="Arial" w:hAnsi="Arial"/>
+                <w:b/>
+                <w:bCs/>
+                <w:color w:val="43A047"/>
+                <w:sz w:val="13"/>
+                <w:szCs w:val="13"/>
+              </w:rPr>
+              <w:t xml:space="preserve">REST</w:t>
+            </w:r>
+          </w:p>
+        </w:tc>
+        <w:tc>
+          <w:tcPr>
+            <w:tcW w:type="dxa" w:w="5580"/>
+            <w:tcBorders>
+              <w:top w:val="none" w:color="FFFFFF" w:sz="0"/>
+              <w:left w:val="none" w:color="FFFFFF" w:sz="0"/>
+              <w:bottom w:val="none" w:color="FFFFFF" w:sz="0"/>
+              <w:right w:val="none" w:color="FFFFFF" w:sz="0"/>
+            </w:tcBorders>
+            <w:shd w:fill="E8F5E9" w:color="auto" w:val="clear"/>
+            <w:tcMar>
+              <w:top w:type="dxa" w:w="40"/>
+              <w:left w:type="dxa" w:w="80"/>
+              <w:bottom w:type="dxa" w:w="40"/>
+              <w:right w:type="dxa" w:w="80"/>
+            </w:tcMar>
+            <w:vAlign w:val="center"/>
+          </w:tcPr>
+          <w:p>
+            <w:pPr>
+              <w:jc w:val="left"/>
+            </w:pPr>
+            <w:r>
+              <w:rPr>
+                <w:rFonts w:ascii="Arial" w:cs="Arial" w:eastAsia="Arial" w:hAnsi="Arial"/>
+                <w:b/>
+                <w:bCs/>
+                <w:color w:val="43A047"/>
+                <w:sz w:val="15"/>
+                <w:szCs w:val="15"/>
+              </w:rPr>
+              <w:t xml:space="preserve">COACHING CUE</w:t>
+            </w:r>
+          </w:p>
+        </w:tc>
+      </w:tr>
+      <w:tr>
+        <w:tc>
+          <w:tcPr>
+            <w:tcW w:type="dxa" w:w="2400"/>
+            <w:tcBorders>
+              <w:top w:val="none" w:color="FFFFFF" w:sz="0"/>
+              <w:left w:val="none" w:color="FFFFFF" w:sz="0"/>
+              <w:bottom w:val="none" w:color="FFFFFF" w:sz="0"/>
+              <w:right w:val="none" w:color="FFFFFF" w:sz="0"/>
+            </w:tcBorders>
+            <w:shd w:fill="F1F8F2" w:color="auto" w:val="clear"/>
+            <w:tcMar>
+              <w:top w:type="dxa" w:w="40"/>
+              <w:left w:type="dxa" w:w="80"/>
+              <w:bottom w:type="dxa" w:w="40"/>
+              <w:right w:type="dxa" w:w="80"/>
+            </w:tcMar>
+            <w:vAlign w:val="center"/>
+          </w:tcPr>
+          <w:p>
+            <w:r>
+              <w:rPr>
+                <w:rFonts w:ascii="Arial" w:cs="Arial" w:eastAsia="Arial" w:hAnsi="Arial"/>
+                <w:b/>
+                <w:bCs/>
+                <w:color w:val="2C2C2C"/>
+                <w:sz w:val="18"/>
+                <w:szCs w:val="18"/>
+              </w:rPr>
               <w:t xml:space="preserve">Single-Leg RDL (Left-Led)</w:t>
             </w:r>
           </w:p>
@@ -12123,7 +13007,7 @@
           <w:sz w:val="17"/>
           <w:szCs w:val="17"/>
         </w:rPr>
-        <w:t xml:space="preserve">D — METABOLIC FINISHER</w:t>
+        <w:t xml:space="preserve">F — METABOLIC FINISHER</w:t>
       </w:r>
     </w:p>
     <w:p>
@@ -14040,7 +14924,7 @@
           <w:sz w:val="17"/>
           <w:szCs w:val="17"/>
         </w:rPr>
-        <w:t xml:space="preserve">B — PRIMARY STRENGTH — HEX BAR DEADLIFT &amp; HIP THRUST</w:t>
+        <w:t xml:space="preserve">B — PRIMARY STRENGTH — HEX BAR DEADLIFT</w:t>
       </w:r>
     </w:p>
     <w:p>
@@ -14065,7 +14949,7 @@
           <w:sz w:val="17"/>
           <w:szCs w:val="17"/>
         </w:rPr>
-        <w:t xml:space="preserve">Hex Bar Deadlift tested at 85 lbs x5 (Epley 1RM ≈99 lbs) — Week 1 trains at 75 lbs, climbing to 85 lbs by Week 4. Hip Thrust tested at 35 lbs x5 (Epley 1RM ≈41 lbs) — Week 1 trains at 30 lbs, climbing to 35 lbs.</w:t>
+        <w:t xml:space="preserve">Her strongest tested lift. Tested at 85 lbs x5 (Epley 1RM ≈99 lbs) — Week 1 trains at 75 lbs, climbing to 85 lbs by Week 4.</w:t>
       </w:r>
     </w:p>
     <w:tbl>
@@ -14584,7 +15468,322 @@
                 <w:sz w:val="14"/>
                 <w:szCs w:val="14"/>
               </w:rPr>
-              <w:t xml:space="preserve">  1-2 RIR</w:t>
+              <w:t xml:space="preserve">  2 RIR</w:t>
+            </w:r>
+          </w:p>
+        </w:tc>
+      </w:tr>
+    </w:tbl>
+    <w:p>
+      <w:pPr>
+        <w:spacing w:after="100"/>
+      </w:pPr>
+    </w:p>
+    <w:p>
+      <w:pPr>
+        <w:spacing w:after="60" w:before="120"/>
+      </w:pPr>
+      <w:r>
+        <w:rPr>
+          <w:rFonts w:ascii="Arial" w:cs="Arial" w:eastAsia="Arial" w:hAnsi="Arial"/>
+          <w:b/>
+          <w:bCs/>
+          <w:color w:val="C9A227"/>
+          <w:sz w:val="17"/>
+          <w:szCs w:val="17"/>
+        </w:rPr>
+        <w:t xml:space="preserve">C — ACCESSORY — DB HIP THRUST (GLUTE BUILD)</w:t>
+      </w:r>
+    </w:p>
+    <w:p>
+      <w:pPr>
+        <w:spacing w:after="80"/>
+      </w:pPr>
+      <w:r>
+        <w:rPr>
+          <w:rFonts w:ascii="Arial" w:cs="Arial" w:eastAsia="Arial" w:hAnsi="Arial"/>
+          <w:b/>
+          <w:bCs/>
+          <w:color w:val="C9A227"/>
+          <w:sz w:val="17"/>
+          <w:szCs w:val="17"/>
+        </w:rPr>
+        <w:t xml:space="preserve">Load Target:  </w:t>
+      </w:r>
+      <w:r>
+        <w:rPr>
+          <w:rFonts w:ascii="Arial" w:cs="Arial" w:eastAsia="Arial" w:hAnsi="Arial"/>
+          <w:color w:val="2C2C2C"/>
+          <w:sz w:val="17"/>
+          <w:szCs w:val="17"/>
+        </w:rPr>
+        <w:t xml:space="preserve">The glute-building accessory directly behind the deadlift — same posterior chain, isolated harder at the hip. Tested at 35 lbs x5 (Epley 1RM ≈41 lbs) — Week 1 trains at 30 lbs, climbing to 35 lbs by Week 4. Held at 2 reps in reserve — the left-hip rehab governs how hard this is pushed, not a hypertrophy default.</w:t>
+      </w:r>
+    </w:p>
+    <w:tbl>
+      <w:tblPr>
+        <w:tblW w:type="dxa" w:w="10440"/>
+        <w:tblBorders>
+          <w:top w:val="none" w:color="FFFFFF" w:sz="0"/>
+          <w:left w:val="none" w:color="FFFFFF" w:sz="0"/>
+          <w:bottom w:val="none" w:color="FFFFFF" w:sz="0"/>
+          <w:right w:val="none" w:color="FFFFFF" w:sz="0"/>
+          <w:insideH w:val="single" w:color="auto" w:sz="4"/>
+          <w:insideV w:val="single" w:color="auto" w:sz="4"/>
+        </w:tblBorders>
+      </w:tblPr>
+      <w:tblGrid>
+        <w:gridCol w:w="2400"/>
+        <w:gridCol w:w="380"/>
+        <w:gridCol w:w="420"/>
+        <w:gridCol w:w="680"/>
+        <w:gridCol w:w="540"/>
+        <w:gridCol w:w="440"/>
+        <w:gridCol w:w="5580"/>
+      </w:tblGrid>
+      <w:tr>
+        <w:tc>
+          <w:tcPr>
+            <w:tcW w:type="dxa" w:w="2400"/>
+            <w:tcBorders>
+              <w:top w:val="none" w:color="FFFFFF" w:sz="0"/>
+              <w:left w:val="none" w:color="FFFFFF" w:sz="0"/>
+              <w:bottom w:val="none" w:color="FFFFFF" w:sz="0"/>
+              <w:right w:val="none" w:color="FFFFFF" w:sz="0"/>
+            </w:tcBorders>
+            <w:shd w:fill="F5E8C0" w:color="auto" w:val="clear"/>
+            <w:tcMar>
+              <w:top w:type="dxa" w:w="40"/>
+              <w:left w:type="dxa" w:w="80"/>
+              <w:bottom w:type="dxa" w:w="40"/>
+              <w:right w:type="dxa" w:w="80"/>
+            </w:tcMar>
+            <w:vAlign w:val="center"/>
+          </w:tcPr>
+          <w:p>
+            <w:pPr>
+              <w:jc w:val="left"/>
+            </w:pPr>
+            <w:r>
+              <w:rPr>
+                <w:rFonts w:ascii="Arial" w:cs="Arial" w:eastAsia="Arial" w:hAnsi="Arial"/>
+                <w:b/>
+                <w:bCs/>
+                <w:color w:val="C9A227"/>
+                <w:sz w:val="15"/>
+                <w:szCs w:val="15"/>
+              </w:rPr>
+              <w:t xml:space="preserve">EXERCISE</w:t>
+            </w:r>
+          </w:p>
+        </w:tc>
+        <w:tc>
+          <w:tcPr>
+            <w:tcW w:type="dxa" w:w="380"/>
+            <w:tcBorders>
+              <w:top w:val="none" w:color="FFFFFF" w:sz="0"/>
+              <w:left w:val="none" w:color="FFFFFF" w:sz="0"/>
+              <w:bottom w:val="none" w:color="FFFFFF" w:sz="0"/>
+              <w:right w:val="none" w:color="FFFFFF" w:sz="0"/>
+            </w:tcBorders>
+            <w:shd w:fill="F5E8C0" w:color="auto" w:val="clear"/>
+            <w:tcMar>
+              <w:top w:type="dxa" w:w="40"/>
+              <w:left w:type="dxa" w:w="80"/>
+              <w:bottom w:type="dxa" w:w="40"/>
+              <w:right w:type="dxa" w:w="80"/>
+            </w:tcMar>
+            <w:vAlign w:val="center"/>
+          </w:tcPr>
+          <w:p>
+            <w:pPr>
+              <w:jc w:val="center"/>
+            </w:pPr>
+            <w:r>
+              <w:rPr>
+                <w:rFonts w:ascii="Arial" w:cs="Arial" w:eastAsia="Arial" w:hAnsi="Arial"/>
+                <w:b/>
+                <w:bCs/>
+                <w:color w:val="C9A227"/>
+                <w:sz w:val="13"/>
+                <w:szCs w:val="13"/>
+              </w:rPr>
+              <w:t xml:space="preserve">SETS</w:t>
+            </w:r>
+          </w:p>
+        </w:tc>
+        <w:tc>
+          <w:tcPr>
+            <w:tcW w:type="dxa" w:w="420"/>
+            <w:tcBorders>
+              <w:top w:val="none" w:color="FFFFFF" w:sz="0"/>
+              <w:left w:val="none" w:color="FFFFFF" w:sz="0"/>
+              <w:bottom w:val="none" w:color="FFFFFF" w:sz="0"/>
+              <w:right w:val="none" w:color="FFFFFF" w:sz="0"/>
+            </w:tcBorders>
+            <w:shd w:fill="F5E8C0" w:color="auto" w:val="clear"/>
+            <w:tcMar>
+              <w:top w:type="dxa" w:w="40"/>
+              <w:left w:type="dxa" w:w="80"/>
+              <w:bottom w:type="dxa" w:w="40"/>
+              <w:right w:type="dxa" w:w="80"/>
+            </w:tcMar>
+            <w:vAlign w:val="center"/>
+          </w:tcPr>
+          <w:p>
+            <w:pPr>
+              <w:jc w:val="center"/>
+            </w:pPr>
+            <w:r>
+              <w:rPr>
+                <w:rFonts w:ascii="Arial" w:cs="Arial" w:eastAsia="Arial" w:hAnsi="Arial"/>
+                <w:b/>
+                <w:bCs/>
+                <w:color w:val="C9A227"/>
+                <w:sz w:val="13"/>
+                <w:szCs w:val="13"/>
+              </w:rPr>
+              <w:t xml:space="preserve">REPS</w:t>
+            </w:r>
+          </w:p>
+        </w:tc>
+        <w:tc>
+          <w:tcPr>
+            <w:tcW w:type="dxa" w:w="680"/>
+            <w:tcBorders>
+              <w:top w:val="none" w:color="FFFFFF" w:sz="0"/>
+              <w:left w:val="none" w:color="FFFFFF" w:sz="0"/>
+              <w:bottom w:val="none" w:color="FFFFFF" w:sz="0"/>
+              <w:right w:val="none" w:color="FFFFFF" w:sz="0"/>
+            </w:tcBorders>
+            <w:shd w:fill="F5E8C0" w:color="auto" w:val="clear"/>
+            <w:tcMar>
+              <w:top w:type="dxa" w:w="40"/>
+              <w:left w:type="dxa" w:w="80"/>
+              <w:bottom w:type="dxa" w:w="40"/>
+              <w:right w:type="dxa" w:w="80"/>
+            </w:tcMar>
+            <w:vAlign w:val="center"/>
+          </w:tcPr>
+          <w:p>
+            <w:pPr>
+              <w:jc w:val="center"/>
+            </w:pPr>
+            <w:r>
+              <w:rPr>
+                <w:rFonts w:ascii="Arial" w:cs="Arial" w:eastAsia="Arial" w:hAnsi="Arial"/>
+                <w:b/>
+                <w:bCs/>
+                <w:color w:val="C9A227"/>
+                <w:sz w:val="13"/>
+                <w:szCs w:val="13"/>
+              </w:rPr>
+              <w:t xml:space="preserve">LOAD</w:t>
+            </w:r>
+          </w:p>
+        </w:tc>
+        <w:tc>
+          <w:tcPr>
+            <w:tcW w:type="dxa" w:w="540"/>
+            <w:tcBorders>
+              <w:top w:val="none" w:color="FFFFFF" w:sz="0"/>
+              <w:left w:val="none" w:color="FFFFFF" w:sz="0"/>
+              <w:bottom w:val="none" w:color="FFFFFF" w:sz="0"/>
+              <w:right w:val="none" w:color="FFFFFF" w:sz="0"/>
+            </w:tcBorders>
+            <w:shd w:fill="F5E8C0" w:color="auto" w:val="clear"/>
+            <w:tcMar>
+              <w:top w:type="dxa" w:w="40"/>
+              <w:left w:type="dxa" w:w="80"/>
+              <w:bottom w:type="dxa" w:w="40"/>
+              <w:right w:type="dxa" w:w="80"/>
+            </w:tcMar>
+            <w:vAlign w:val="center"/>
+          </w:tcPr>
+          <w:p>
+            <w:pPr>
+              <w:jc w:val="center"/>
+            </w:pPr>
+            <w:r>
+              <w:rPr>
+                <w:rFonts w:ascii="Arial" w:cs="Arial" w:eastAsia="Arial" w:hAnsi="Arial"/>
+                <w:b/>
+                <w:bCs/>
+                <w:color w:val="C9A227"/>
+                <w:sz w:val="13"/>
+                <w:szCs w:val="13"/>
+              </w:rPr>
+              <w:t xml:space="preserve">TEMPO</w:t>
+            </w:r>
+          </w:p>
+        </w:tc>
+        <w:tc>
+          <w:tcPr>
+            <w:tcW w:type="dxa" w:w="440"/>
+            <w:tcBorders>
+              <w:top w:val="none" w:color="FFFFFF" w:sz="0"/>
+              <w:left w:val="none" w:color="FFFFFF" w:sz="0"/>
+              <w:bottom w:val="none" w:color="FFFFFF" w:sz="0"/>
+              <w:right w:val="none" w:color="FFFFFF" w:sz="0"/>
+            </w:tcBorders>
+            <w:shd w:fill="F5E8C0" w:color="auto" w:val="clear"/>
+            <w:tcMar>
+              <w:top w:type="dxa" w:w="40"/>
+              <w:left w:type="dxa" w:w="80"/>
+              <w:bottom w:type="dxa" w:w="40"/>
+              <w:right w:type="dxa" w:w="80"/>
+            </w:tcMar>
+            <w:vAlign w:val="center"/>
+          </w:tcPr>
+          <w:p>
+            <w:pPr>
+              <w:jc w:val="center"/>
+            </w:pPr>
+            <w:r>
+              <w:rPr>
+                <w:rFonts w:ascii="Arial" w:cs="Arial" w:eastAsia="Arial" w:hAnsi="Arial"/>
+                <w:b/>
+                <w:bCs/>
+                <w:color w:val="C9A227"/>
+                <w:sz w:val="13"/>
+                <w:szCs w:val="13"/>
+              </w:rPr>
+              <w:t xml:space="preserve">REST</w:t>
+            </w:r>
+          </w:p>
+        </w:tc>
+        <w:tc>
+          <w:tcPr>
+            <w:tcW w:type="dxa" w:w="5580"/>
+            <w:tcBorders>
+              <w:top w:val="none" w:color="FFFFFF" w:sz="0"/>
+              <w:left w:val="none" w:color="FFFFFF" w:sz="0"/>
+              <w:bottom w:val="none" w:color="FFFFFF" w:sz="0"/>
+              <w:right w:val="none" w:color="FFFFFF" w:sz="0"/>
+            </w:tcBorders>
+            <w:shd w:fill="F5E8C0" w:color="auto" w:val="clear"/>
+            <w:tcMar>
+              <w:top w:type="dxa" w:w="40"/>
+              <w:left w:type="dxa" w:w="80"/>
+              <w:bottom w:type="dxa" w:w="40"/>
+              <w:right w:type="dxa" w:w="80"/>
+            </w:tcMar>
+            <w:vAlign w:val="center"/>
+          </w:tcPr>
+          <w:p>
+            <w:pPr>
+              <w:jc w:val="left"/>
+            </w:pPr>
+            <w:r>
+              <w:rPr>
+                <w:rFonts w:ascii="Arial" w:cs="Arial" w:eastAsia="Arial" w:hAnsi="Arial"/>
+                <w:b/>
+                <w:bCs/>
+                <w:color w:val="C9A227"/>
+                <w:sz w:val="15"/>
+                <w:szCs w:val="15"/>
+              </w:rPr>
+              <w:t xml:space="preserve">COACHING CUE</w:t>
             </w:r>
           </w:p>
         </w:tc>
@@ -14599,7 +15798,7 @@
               <w:bottom w:val="none" w:color="FFFFFF" w:sz="0"/>
               <w:right w:val="none" w:color="FFFFFF" w:sz="0"/>
             </w:tcBorders>
-            <w:shd w:fill="FFFFFF" w:color="auto" w:val="clear"/>
+            <w:shd w:fill="FAF3E0" w:color="auto" w:val="clear"/>
             <w:tcMar>
               <w:top w:type="dxa" w:w="40"/>
               <w:left w:type="dxa" w:w="80"/>
@@ -14644,7 +15843,7 @@
               <w:bottom w:val="none" w:color="FFFFFF" w:sz="0"/>
               <w:right w:val="none" w:color="FFFFFF" w:sz="0"/>
             </w:tcBorders>
-            <w:shd w:fill="FFFFFF" w:color="auto" w:val="clear"/>
+            <w:shd w:fill="FAF3E0" w:color="auto" w:val="clear"/>
             <w:tcMar>
               <w:top w:type="dxa" w:w="40"/>
               <w:left w:type="dxa" w:w="80"/>
@@ -14677,7 +15876,7 @@
               <w:bottom w:val="none" w:color="FFFFFF" w:sz="0"/>
               <w:right w:val="none" w:color="FFFFFF" w:sz="0"/>
             </w:tcBorders>
-            <w:shd w:fill="FFFFFF" w:color="auto" w:val="clear"/>
+            <w:shd w:fill="FAF3E0" w:color="auto" w:val="clear"/>
             <w:tcMar>
               <w:top w:type="dxa" w:w="40"/>
               <w:left w:type="dxa" w:w="80"/>
@@ -14710,7 +15909,7 @@
               <w:bottom w:val="none" w:color="FFFFFF" w:sz="0"/>
               <w:right w:val="none" w:color="FFFFFF" w:sz="0"/>
             </w:tcBorders>
-            <w:shd w:fill="FFFFFF" w:color="auto" w:val="clear"/>
+            <w:shd w:fill="FAF3E0" w:color="auto" w:val="clear"/>
             <w:tcMar>
               <w:top w:type="dxa" w:w="40"/>
               <w:left w:type="dxa" w:w="80"/>
@@ -14743,7 +15942,7 @@
               <w:bottom w:val="none" w:color="FFFFFF" w:sz="0"/>
               <w:right w:val="none" w:color="FFFFFF" w:sz="0"/>
             </w:tcBorders>
-            <w:shd w:fill="FFFFFF" w:color="auto" w:val="clear"/>
+            <w:shd w:fill="FAF3E0" w:color="auto" w:val="clear"/>
             <w:tcMar>
               <w:top w:type="dxa" w:w="40"/>
               <w:left w:type="dxa" w:w="80"/>
@@ -14776,7 +15975,7 @@
               <w:bottom w:val="none" w:color="FFFFFF" w:sz="0"/>
               <w:right w:val="none" w:color="FFFFFF" w:sz="0"/>
             </w:tcBorders>
-            <w:shd w:fill="FFFFFF" w:color="auto" w:val="clear"/>
+            <w:shd w:fill="FAF3E0" w:color="auto" w:val="clear"/>
             <w:tcMar>
               <w:top w:type="dxa" w:w="40"/>
               <w:left w:type="dxa" w:w="80"/>
@@ -14809,7 +16008,7 @@
               <w:bottom w:val="none" w:color="FFFFFF" w:sz="0"/>
               <w:right w:val="none" w:color="FFFFFF" w:sz="0"/>
             </w:tcBorders>
-            <w:shd w:fill="FFFFFF" w:color="auto" w:val="clear"/>
+            <w:shd w:fill="FAF3E0" w:color="auto" w:val="clear"/>
             <w:tcMar>
               <w:top w:type="dxa" w:w="40"/>
               <w:left w:type="dxa" w:w="80"/>
@@ -14861,7 +16060,7 @@
           <w:sz w:val="17"/>
           <w:szCs w:val="17"/>
         </w:rPr>
-        <w:t xml:space="preserve">C — SHOULDER &amp; PULL CHECK-IN — CONTINUED REINTRODUCTION</w:t>
+        <w:t xml:space="preserve">D — PT-LED SHOULDER PREP — I'S-T'S-W'S (PRONE, MODIFIED)</w:t>
       </w:r>
     </w:p>
     <w:p>
@@ -14886,7 +16085,7 @@
           <w:sz w:val="17"/>
           <w:szCs w:val="17"/>
         </w:rPr>
-        <w:t xml:space="preserve">A brief continued check-in, not a full repeat of Day 1's corrective block — confirms the reintroduction is progressing cleanly before the next Day 1 session. Same pain-monitoring rule applies: sharp/pinching pain stops the set, ordinary fatigue does not.</w:t>
+        <w:t xml:space="preserve">Carried into this session from her PT-led work with Jason Bethea — the same modified shoulder activation used in Day 1's corrective block, positioned here to prime the left shoulder immediately before the pressing check-in below. Control precedes power on this day too.</w:t>
       </w:r>
     </w:p>
     <w:tbl>
@@ -15186,6 +16385,563 @@
                 <w:sz w:val="18"/>
                 <w:szCs w:val="18"/>
               </w:rPr>
+              <w:t xml:space="preserve">I's-T's-W's (Prone, Modified)</w:t>
+            </w:r>
+          </w:p>
+          <w:p>
+            <w:r>
+              <w:rPr>
+                <w:rFonts w:ascii="Arial" w:cs="Arial" w:eastAsia="Arial" w:hAnsi="Arial"/>
+                <w:i/>
+                <w:iCs/>
+                <w:color w:val="B71C1C"/>
+                <w:sz w:val="14"/>
+                <w:szCs w:val="14"/>
+              </w:rPr>
+              <w:t xml:space="preserve">Left shoulder — reduced ROM on the W/Y sweep portion, per documented session modification</w:t>
+            </w:r>
+          </w:p>
+        </w:tc>
+        <w:tc>
+          <w:tcPr>
+            <w:tcW w:type="dxa" w:w="380"/>
+            <w:tcBorders>
+              <w:top w:val="none" w:color="FFFFFF" w:sz="0"/>
+              <w:left w:val="none" w:color="FFFFFF" w:sz="0"/>
+              <w:bottom w:val="none" w:color="FFFFFF" w:sz="0"/>
+              <w:right w:val="none" w:color="FFFFFF" w:sz="0"/>
+            </w:tcBorders>
+            <w:shd w:fill="FFF5F5" w:color="auto" w:val="clear"/>
+            <w:tcMar>
+              <w:top w:type="dxa" w:w="40"/>
+              <w:left w:type="dxa" w:w="80"/>
+              <w:bottom w:type="dxa" w:w="40"/>
+              <w:right w:type="dxa" w:w="80"/>
+            </w:tcMar>
+            <w:vAlign w:val="center"/>
+          </w:tcPr>
+          <w:p>
+            <w:pPr>
+              <w:jc w:val="center"/>
+            </w:pPr>
+            <w:r>
+              <w:rPr>
+                <w:rFonts w:ascii="Arial" w:cs="Arial" w:eastAsia="Arial" w:hAnsi="Arial"/>
+                <w:color w:val="6B6B6B"/>
+                <w:sz w:val="15"/>
+                <w:szCs w:val="15"/>
+              </w:rPr>
+              <w:t xml:space="preserve">2</w:t>
+            </w:r>
+          </w:p>
+        </w:tc>
+        <w:tc>
+          <w:tcPr>
+            <w:tcW w:type="dxa" w:w="420"/>
+            <w:tcBorders>
+              <w:top w:val="none" w:color="FFFFFF" w:sz="0"/>
+              <w:left w:val="none" w:color="FFFFFF" w:sz="0"/>
+              <w:bottom w:val="none" w:color="FFFFFF" w:sz="0"/>
+              <w:right w:val="none" w:color="FFFFFF" w:sz="0"/>
+            </w:tcBorders>
+            <w:shd w:fill="FFF5F5" w:color="auto" w:val="clear"/>
+            <w:tcMar>
+              <w:top w:type="dxa" w:w="40"/>
+              <w:left w:type="dxa" w:w="80"/>
+              <w:bottom w:type="dxa" w:w="40"/>
+              <w:right w:type="dxa" w:w="80"/>
+            </w:tcMar>
+            <w:vAlign w:val="center"/>
+          </w:tcPr>
+          <w:p>
+            <w:pPr>
+              <w:jc w:val="center"/>
+            </w:pPr>
+            <w:r>
+              <w:rPr>
+                <w:rFonts w:ascii="Arial" w:cs="Arial" w:eastAsia="Arial" w:hAnsi="Arial"/>
+                <w:color w:val="6B6B6B"/>
+                <w:sz w:val="15"/>
+                <w:szCs w:val="15"/>
+              </w:rPr>
+              <w:t xml:space="preserve">8/side (one arm)</w:t>
+            </w:r>
+          </w:p>
+        </w:tc>
+        <w:tc>
+          <w:tcPr>
+            <w:tcW w:type="dxa" w:w="680"/>
+            <w:tcBorders>
+              <w:top w:val="none" w:color="FFFFFF" w:sz="0"/>
+              <w:left w:val="none" w:color="FFFFFF" w:sz="0"/>
+              <w:bottom w:val="none" w:color="FFFFFF" w:sz="0"/>
+              <w:right w:val="none" w:color="FFFFFF" w:sz="0"/>
+            </w:tcBorders>
+            <w:shd w:fill="FFF5F5" w:color="auto" w:val="clear"/>
+            <w:tcMar>
+              <w:top w:type="dxa" w:w="40"/>
+              <w:left w:type="dxa" w:w="80"/>
+              <w:bottom w:type="dxa" w:w="40"/>
+              <w:right w:type="dxa" w:w="80"/>
+            </w:tcMar>
+            <w:vAlign w:val="center"/>
+          </w:tcPr>
+          <w:p>
+            <w:pPr>
+              <w:jc w:val="center"/>
+            </w:pPr>
+            <w:r>
+              <w:rPr>
+                <w:rFonts w:ascii="Arial" w:cs="Arial" w:eastAsia="Arial" w:hAnsi="Arial"/>
+                <w:color w:val="6B6B6B"/>
+                <w:sz w:val="15"/>
+                <w:szCs w:val="15"/>
+              </w:rPr>
+              <w:t xml:space="preserve">5 lb DB</w:t>
+            </w:r>
+          </w:p>
+        </w:tc>
+        <w:tc>
+          <w:tcPr>
+            <w:tcW w:type="dxa" w:w="540"/>
+            <w:tcBorders>
+              <w:top w:val="none" w:color="FFFFFF" w:sz="0"/>
+              <w:left w:val="none" w:color="FFFFFF" w:sz="0"/>
+              <w:bottom w:val="none" w:color="FFFFFF" w:sz="0"/>
+              <w:right w:val="none" w:color="FFFFFF" w:sz="0"/>
+            </w:tcBorders>
+            <w:shd w:fill="FFF5F5" w:color="auto" w:val="clear"/>
+            <w:tcMar>
+              <w:top w:type="dxa" w:w="40"/>
+              <w:left w:type="dxa" w:w="80"/>
+              <w:bottom w:type="dxa" w:w="40"/>
+              <w:right w:type="dxa" w:w="80"/>
+            </w:tcMar>
+            <w:vAlign w:val="center"/>
+          </w:tcPr>
+          <w:p>
+            <w:pPr>
+              <w:jc w:val="center"/>
+            </w:pPr>
+            <w:r>
+              <w:rPr>
+                <w:rFonts w:ascii="Arial" w:cs="Arial" w:eastAsia="Arial" w:hAnsi="Arial"/>
+                <w:color w:val="6B6B6B"/>
+                <w:sz w:val="15"/>
+                <w:szCs w:val="15"/>
+              </w:rPr>
+              <w:t xml:space="preserve">controlled</w:t>
+            </w:r>
+          </w:p>
+        </w:tc>
+        <w:tc>
+          <w:tcPr>
+            <w:tcW w:type="dxa" w:w="440"/>
+            <w:tcBorders>
+              <w:top w:val="none" w:color="FFFFFF" w:sz="0"/>
+              <w:left w:val="none" w:color="FFFFFF" w:sz="0"/>
+              <w:bottom w:val="none" w:color="FFFFFF" w:sz="0"/>
+              <w:right w:val="none" w:color="FFFFFF" w:sz="0"/>
+            </w:tcBorders>
+            <w:shd w:fill="FFF5F5" w:color="auto" w:val="clear"/>
+            <w:tcMar>
+              <w:top w:type="dxa" w:w="40"/>
+              <w:left w:type="dxa" w:w="80"/>
+              <w:bottom w:type="dxa" w:w="40"/>
+              <w:right w:type="dxa" w:w="80"/>
+            </w:tcMar>
+            <w:vAlign w:val="center"/>
+          </w:tcPr>
+          <w:p>
+            <w:pPr>
+              <w:jc w:val="center"/>
+            </w:pPr>
+            <w:r>
+              <w:rPr>
+                <w:rFonts w:ascii="Arial" w:cs="Arial" w:eastAsia="Arial" w:hAnsi="Arial"/>
+                <w:color w:val="6B6B6B"/>
+                <w:sz w:val="15"/>
+                <w:szCs w:val="15"/>
+              </w:rPr>
+              <w:t xml:space="preserve">30s</w:t>
+            </w:r>
+          </w:p>
+        </w:tc>
+        <w:tc>
+          <w:tcPr>
+            <w:tcW w:type="dxa" w:w="5580"/>
+            <w:tcBorders>
+              <w:top w:val="none" w:color="FFFFFF" w:sz="0"/>
+              <w:left w:val="none" w:color="FFFFFF" w:sz="0"/>
+              <w:bottom w:val="none" w:color="FFFFFF" w:sz="0"/>
+              <w:right w:val="none" w:color="FFFFFF" w:sz="0"/>
+            </w:tcBorders>
+            <w:shd w:fill="FFF5F5" w:color="auto" w:val="clear"/>
+            <w:tcMar>
+              <w:top w:type="dxa" w:w="40"/>
+              <w:left w:type="dxa" w:w="80"/>
+              <w:bottom w:type="dxa" w:w="40"/>
+              <w:right w:type="dxa" w:w="80"/>
+            </w:tcMar>
+            <w:vAlign w:val="center"/>
+          </w:tcPr>
+          <w:p>
+            <w:r>
+              <w:rPr>
+                <w:rFonts w:ascii="Arial" w:cs="Arial" w:eastAsia="Arial" w:hAnsi="Arial"/>
+                <w:color w:val="6B6B6B"/>
+                <w:sz w:val="17"/>
+                <w:szCs w:val="17"/>
+              </w:rPr>
+              <w:t xml:space="preserve">Performed one arm at a time in a hinge stance (documented modification from the standard bilateral-prone version). Reduced range on the W/Y sweep — pain-free range only.</w:t>
+            </w:r>
+          </w:p>
+        </w:tc>
+      </w:tr>
+    </w:tbl>
+    <w:p>
+      <w:pPr>
+        <w:spacing w:after="100"/>
+      </w:pPr>
+    </w:p>
+    <w:p>
+      <w:pPr>
+        <w:spacing w:after="60" w:before="120"/>
+      </w:pPr>
+      <w:r>
+        <w:rPr>
+          <w:rFonts w:ascii="Arial" w:cs="Arial" w:eastAsia="Arial" w:hAnsi="Arial"/>
+          <w:b/>
+          <w:bCs/>
+          <w:color w:val="E53935"/>
+          <w:sz w:val="17"/>
+          <w:szCs w:val="17"/>
+        </w:rPr>
+        <w:t xml:space="preserve">E — SECONDARY COMPOUND — SHOULDER &amp; PULL CHECK-IN</w:t>
+      </w:r>
+    </w:p>
+    <w:p>
+      <w:pPr>
+        <w:spacing w:after="80"/>
+      </w:pPr>
+      <w:r>
+        <w:rPr>
+          <w:rFonts w:ascii="Arial" w:cs="Arial" w:eastAsia="Arial" w:hAnsi="Arial"/>
+          <w:b/>
+          <w:bCs/>
+          <w:color w:val="E53935"/>
+          <w:sz w:val="17"/>
+          <w:szCs w:val="17"/>
+        </w:rPr>
+        <w:t xml:space="preserve">Why:  </w:t>
+      </w:r>
+      <w:r>
+        <w:rPr>
+          <w:rFonts w:ascii="Arial" w:cs="Arial" w:eastAsia="Arial" w:hAnsi="Arial"/>
+          <w:color w:val="2C2C2C"/>
+          <w:sz w:val="17"/>
+          <w:szCs w:val="17"/>
+        </w:rPr>
+        <w:t xml:space="preserve">The day's second compound pattern — pressing and pulling, rotating off the hip-dominant work above. A brief continued check-in, not a full repeat of Day 1's corrective block — confirms the reintroduction is progressing cleanly before the next Day 1 session, and is run here rather than later so the shoulder is checked fresh, not fatigued. Same pain-monitoring rule applies: sharp/pinching pain stops the set, ordinary fatigue does not.</w:t>
+      </w:r>
+    </w:p>
+    <w:tbl>
+      <w:tblPr>
+        <w:tblW w:type="dxa" w:w="10440"/>
+        <w:tblBorders>
+          <w:top w:val="none" w:color="FFFFFF" w:sz="0"/>
+          <w:left w:val="none" w:color="FFFFFF" w:sz="0"/>
+          <w:bottom w:val="none" w:color="FFFFFF" w:sz="0"/>
+          <w:right w:val="none" w:color="FFFFFF" w:sz="0"/>
+          <w:insideH w:val="single" w:color="auto" w:sz="4"/>
+          <w:insideV w:val="single" w:color="auto" w:sz="4"/>
+        </w:tblBorders>
+      </w:tblPr>
+      <w:tblGrid>
+        <w:gridCol w:w="2400"/>
+        <w:gridCol w:w="380"/>
+        <w:gridCol w:w="420"/>
+        <w:gridCol w:w="680"/>
+        <w:gridCol w:w="540"/>
+        <w:gridCol w:w="440"/>
+        <w:gridCol w:w="5580"/>
+      </w:tblGrid>
+      <w:tr>
+        <w:tc>
+          <w:tcPr>
+            <w:tcW w:type="dxa" w:w="2400"/>
+            <w:tcBorders>
+              <w:top w:val="none" w:color="FFFFFF" w:sz="0"/>
+              <w:left w:val="none" w:color="FFFFFF" w:sz="0"/>
+              <w:bottom w:val="none" w:color="FFFFFF" w:sz="0"/>
+              <w:right w:val="none" w:color="FFFFFF" w:sz="0"/>
+            </w:tcBorders>
+            <w:shd w:fill="FFEBEE" w:color="auto" w:val="clear"/>
+            <w:tcMar>
+              <w:top w:type="dxa" w:w="40"/>
+              <w:left w:type="dxa" w:w="80"/>
+              <w:bottom w:type="dxa" w:w="40"/>
+              <w:right w:type="dxa" w:w="80"/>
+            </w:tcMar>
+            <w:vAlign w:val="center"/>
+          </w:tcPr>
+          <w:p>
+            <w:pPr>
+              <w:jc w:val="left"/>
+            </w:pPr>
+            <w:r>
+              <w:rPr>
+                <w:rFonts w:ascii="Arial" w:cs="Arial" w:eastAsia="Arial" w:hAnsi="Arial"/>
+                <w:b/>
+                <w:bCs/>
+                <w:color w:val="E53935"/>
+                <w:sz w:val="15"/>
+                <w:szCs w:val="15"/>
+              </w:rPr>
+              <w:t xml:space="preserve">EXERCISE</w:t>
+            </w:r>
+          </w:p>
+        </w:tc>
+        <w:tc>
+          <w:tcPr>
+            <w:tcW w:type="dxa" w:w="380"/>
+            <w:tcBorders>
+              <w:top w:val="none" w:color="FFFFFF" w:sz="0"/>
+              <w:left w:val="none" w:color="FFFFFF" w:sz="0"/>
+              <w:bottom w:val="none" w:color="FFFFFF" w:sz="0"/>
+              <w:right w:val="none" w:color="FFFFFF" w:sz="0"/>
+            </w:tcBorders>
+            <w:shd w:fill="FFEBEE" w:color="auto" w:val="clear"/>
+            <w:tcMar>
+              <w:top w:type="dxa" w:w="40"/>
+              <w:left w:type="dxa" w:w="80"/>
+              <w:bottom w:type="dxa" w:w="40"/>
+              <w:right w:type="dxa" w:w="80"/>
+            </w:tcMar>
+            <w:vAlign w:val="center"/>
+          </w:tcPr>
+          <w:p>
+            <w:pPr>
+              <w:jc w:val="center"/>
+            </w:pPr>
+            <w:r>
+              <w:rPr>
+                <w:rFonts w:ascii="Arial" w:cs="Arial" w:eastAsia="Arial" w:hAnsi="Arial"/>
+                <w:b/>
+                <w:bCs/>
+                <w:color w:val="E53935"/>
+                <w:sz w:val="13"/>
+                <w:szCs w:val="13"/>
+              </w:rPr>
+              <w:t xml:space="preserve">SETS</w:t>
+            </w:r>
+          </w:p>
+        </w:tc>
+        <w:tc>
+          <w:tcPr>
+            <w:tcW w:type="dxa" w:w="420"/>
+            <w:tcBorders>
+              <w:top w:val="none" w:color="FFFFFF" w:sz="0"/>
+              <w:left w:val="none" w:color="FFFFFF" w:sz="0"/>
+              <w:bottom w:val="none" w:color="FFFFFF" w:sz="0"/>
+              <w:right w:val="none" w:color="FFFFFF" w:sz="0"/>
+            </w:tcBorders>
+            <w:shd w:fill="FFEBEE" w:color="auto" w:val="clear"/>
+            <w:tcMar>
+              <w:top w:type="dxa" w:w="40"/>
+              <w:left w:type="dxa" w:w="80"/>
+              <w:bottom w:type="dxa" w:w="40"/>
+              <w:right w:type="dxa" w:w="80"/>
+            </w:tcMar>
+            <w:vAlign w:val="center"/>
+          </w:tcPr>
+          <w:p>
+            <w:pPr>
+              <w:jc w:val="center"/>
+            </w:pPr>
+            <w:r>
+              <w:rPr>
+                <w:rFonts w:ascii="Arial" w:cs="Arial" w:eastAsia="Arial" w:hAnsi="Arial"/>
+                <w:b/>
+                <w:bCs/>
+                <w:color w:val="E53935"/>
+                <w:sz w:val="13"/>
+                <w:szCs w:val="13"/>
+              </w:rPr>
+              <w:t xml:space="preserve">REPS</w:t>
+            </w:r>
+          </w:p>
+        </w:tc>
+        <w:tc>
+          <w:tcPr>
+            <w:tcW w:type="dxa" w:w="680"/>
+            <w:tcBorders>
+              <w:top w:val="none" w:color="FFFFFF" w:sz="0"/>
+              <w:left w:val="none" w:color="FFFFFF" w:sz="0"/>
+              <w:bottom w:val="none" w:color="FFFFFF" w:sz="0"/>
+              <w:right w:val="none" w:color="FFFFFF" w:sz="0"/>
+            </w:tcBorders>
+            <w:shd w:fill="FFEBEE" w:color="auto" w:val="clear"/>
+            <w:tcMar>
+              <w:top w:type="dxa" w:w="40"/>
+              <w:left w:type="dxa" w:w="80"/>
+              <w:bottom w:type="dxa" w:w="40"/>
+              <w:right w:type="dxa" w:w="80"/>
+            </w:tcMar>
+            <w:vAlign w:val="center"/>
+          </w:tcPr>
+          <w:p>
+            <w:pPr>
+              <w:jc w:val="center"/>
+            </w:pPr>
+            <w:r>
+              <w:rPr>
+                <w:rFonts w:ascii="Arial" w:cs="Arial" w:eastAsia="Arial" w:hAnsi="Arial"/>
+                <w:b/>
+                <w:bCs/>
+                <w:color w:val="E53935"/>
+                <w:sz w:val="13"/>
+                <w:szCs w:val="13"/>
+              </w:rPr>
+              <w:t xml:space="preserve">LOAD</w:t>
+            </w:r>
+          </w:p>
+        </w:tc>
+        <w:tc>
+          <w:tcPr>
+            <w:tcW w:type="dxa" w:w="540"/>
+            <w:tcBorders>
+              <w:top w:val="none" w:color="FFFFFF" w:sz="0"/>
+              <w:left w:val="none" w:color="FFFFFF" w:sz="0"/>
+              <w:bottom w:val="none" w:color="FFFFFF" w:sz="0"/>
+              <w:right w:val="none" w:color="FFFFFF" w:sz="0"/>
+            </w:tcBorders>
+            <w:shd w:fill="FFEBEE" w:color="auto" w:val="clear"/>
+            <w:tcMar>
+              <w:top w:type="dxa" w:w="40"/>
+              <w:left w:type="dxa" w:w="80"/>
+              <w:bottom w:type="dxa" w:w="40"/>
+              <w:right w:type="dxa" w:w="80"/>
+            </w:tcMar>
+            <w:vAlign w:val="center"/>
+          </w:tcPr>
+          <w:p>
+            <w:pPr>
+              <w:jc w:val="center"/>
+            </w:pPr>
+            <w:r>
+              <w:rPr>
+                <w:rFonts w:ascii="Arial" w:cs="Arial" w:eastAsia="Arial" w:hAnsi="Arial"/>
+                <w:b/>
+                <w:bCs/>
+                <w:color w:val="E53935"/>
+                <w:sz w:val="13"/>
+                <w:szCs w:val="13"/>
+              </w:rPr>
+              <w:t xml:space="preserve">TEMPO</w:t>
+            </w:r>
+          </w:p>
+        </w:tc>
+        <w:tc>
+          <w:tcPr>
+            <w:tcW w:type="dxa" w:w="440"/>
+            <w:tcBorders>
+              <w:top w:val="none" w:color="FFFFFF" w:sz="0"/>
+              <w:left w:val="none" w:color="FFFFFF" w:sz="0"/>
+              <w:bottom w:val="none" w:color="FFFFFF" w:sz="0"/>
+              <w:right w:val="none" w:color="FFFFFF" w:sz="0"/>
+            </w:tcBorders>
+            <w:shd w:fill="FFEBEE" w:color="auto" w:val="clear"/>
+            <w:tcMar>
+              <w:top w:type="dxa" w:w="40"/>
+              <w:left w:type="dxa" w:w="80"/>
+              <w:bottom w:type="dxa" w:w="40"/>
+              <w:right w:type="dxa" w:w="80"/>
+            </w:tcMar>
+            <w:vAlign w:val="center"/>
+          </w:tcPr>
+          <w:p>
+            <w:pPr>
+              <w:jc w:val="center"/>
+            </w:pPr>
+            <w:r>
+              <w:rPr>
+                <w:rFonts w:ascii="Arial" w:cs="Arial" w:eastAsia="Arial" w:hAnsi="Arial"/>
+                <w:b/>
+                <w:bCs/>
+                <w:color w:val="E53935"/>
+                <w:sz w:val="13"/>
+                <w:szCs w:val="13"/>
+              </w:rPr>
+              <w:t xml:space="preserve">REST</w:t>
+            </w:r>
+          </w:p>
+        </w:tc>
+        <w:tc>
+          <w:tcPr>
+            <w:tcW w:type="dxa" w:w="5580"/>
+            <w:tcBorders>
+              <w:top w:val="none" w:color="FFFFFF" w:sz="0"/>
+              <w:left w:val="none" w:color="FFFFFF" w:sz="0"/>
+              <w:bottom w:val="none" w:color="FFFFFF" w:sz="0"/>
+              <w:right w:val="none" w:color="FFFFFF" w:sz="0"/>
+            </w:tcBorders>
+            <w:shd w:fill="FFEBEE" w:color="auto" w:val="clear"/>
+            <w:tcMar>
+              <w:top w:type="dxa" w:w="40"/>
+              <w:left w:type="dxa" w:w="80"/>
+              <w:bottom w:type="dxa" w:w="40"/>
+              <w:right w:type="dxa" w:w="80"/>
+            </w:tcMar>
+            <w:vAlign w:val="center"/>
+          </w:tcPr>
+          <w:p>
+            <w:pPr>
+              <w:jc w:val="left"/>
+            </w:pPr>
+            <w:r>
+              <w:rPr>
+                <w:rFonts w:ascii="Arial" w:cs="Arial" w:eastAsia="Arial" w:hAnsi="Arial"/>
+                <w:b/>
+                <w:bCs/>
+                <w:color w:val="E53935"/>
+                <w:sz w:val="15"/>
+                <w:szCs w:val="15"/>
+              </w:rPr>
+              <w:t xml:space="preserve">COACHING CUE</w:t>
+            </w:r>
+          </w:p>
+        </w:tc>
+      </w:tr>
+      <w:tr>
+        <w:tc>
+          <w:tcPr>
+            <w:tcW w:type="dxa" w:w="2400"/>
+            <w:tcBorders>
+              <w:top w:val="none" w:color="FFFFFF" w:sz="0"/>
+              <w:left w:val="none" w:color="FFFFFF" w:sz="0"/>
+              <w:bottom w:val="none" w:color="FFFFFF" w:sz="0"/>
+              <w:right w:val="none" w:color="FFFFFF" w:sz="0"/>
+            </w:tcBorders>
+            <w:shd w:fill="FFF5F5" w:color="auto" w:val="clear"/>
+            <w:tcMar>
+              <w:top w:type="dxa" w:w="40"/>
+              <w:left w:type="dxa" w:w="80"/>
+              <w:bottom w:type="dxa" w:w="40"/>
+              <w:right w:type="dxa" w:w="80"/>
+            </w:tcMar>
+            <w:vAlign w:val="center"/>
+          </w:tcPr>
+          <w:p>
+            <w:r>
+              <w:rPr>
+                <w:rFonts w:ascii="Arial" w:cs="Arial" w:eastAsia="Arial" w:hAnsi="Arial"/>
+                <w:b/>
+                <w:bCs/>
+                <w:color w:val="2C2C2C"/>
+                <w:sz w:val="18"/>
+                <w:szCs w:val="18"/>
+              </w:rPr>
               <w:t xml:space="preserve">Standing DB Overhead Press</w:t>
             </w:r>
           </w:p>
@@ -15658,7 +17414,7 @@
           <w:sz w:val="17"/>
           <w:szCs w:val="17"/>
         </w:rPr>
-        <w:t xml:space="preserve">D — LOADED CARRIES — ASYMMETRY PROTOCOL</w:t>
+        <w:t xml:space="preserve">F — LOADED CARRIES — ASYMMETRY PROTOCOL</w:t>
       </w:r>
     </w:p>
     <w:p>
@@ -16455,7 +18211,7 @@
           <w:sz w:val="17"/>
           <w:szCs w:val="17"/>
         </w:rPr>
-        <w:t xml:space="preserve">E — CORE — PLANK PROTOCOL</w:t>
+        <w:t xml:space="preserve">G — CORE — PLANK PROTOCOL</w:t>
       </w:r>
     </w:p>
     <w:p>
@@ -17228,7 +18984,7 @@
           <w:sz w:val="17"/>
           <w:szCs w:val="17"/>
         </w:rPr>
-        <w:t xml:space="preserve">F — POWER TRAINING — LOWER BODY (55-65 BRACKET)</w:t>
+        <w:t xml:space="preserve">H — POWER TRAINING — LOWER BODY (55-65 BRACKET)</w:t>
       </w:r>
     </w:p>
     <w:p>
@@ -17253,7 +19009,7 @@
           <w:sz w:val="17"/>
           <w:szCs w:val="17"/>
         </w:rPr>
-        <w:t xml:space="preserve">Muscle power — moving a sub-maximal load with maximal intent — predicts functional independence and longevity in older women more strongly than strength alone, and belongs in the 55-65 bracket already, not just 65+. This is deliberately a lower-body movement, not overhead, given the shoulder reintroduction still underway in Blocks A and C. Full recovery between sets is the point — this is a velocity stimulus, not a conditioning one, so it does not compete with Block G's deliberately brief finisher below.</w:t>
+        <w:t xml:space="preserve">Muscle power — moving a sub-maximal load with maximal intent — predicts functional independence and longevity in older women more strongly than strength alone, and belongs in the 55-65 bracket already, not just 65+. This is deliberately a lower-body movement, not overhead, given the shoulder reintroduction still underway in Blocks D and E. Full recovery between sets is the point — this is a velocity stimulus, not a conditioning one, so it does not compete with Block I's deliberately brief finisher below.</w:t>
       </w:r>
     </w:p>
     <w:tbl>
@@ -17785,7 +19541,7 @@
           <w:sz w:val="17"/>
           <w:szCs w:val="17"/>
         </w:rPr>
-        <w:t xml:space="preserve">G — METABOLIC FINISHER</w:t>
+        <w:t xml:space="preserve">I — METABOLIC FINISHER</w:t>
       </w:r>
     </w:p>
     <w:p>

</xml_diff>

<commit_message>
Fix audit findings on the Block Method pilot: Day 1 RIR tiering, squat rep count, Kieser RIR
</commit_message>
<xml_diff>
--- a/clients/siobhan_hansen/Siobhan_Hansen_3Day_Training_Plan.docx
+++ b/clients/siobhan_hansen/Siobhan_Hansen_3Day_Training_Plan.docx
@@ -1408,7 +1408,7 @@
                 <w:sz w:val="16"/>
                 <w:szCs w:val="16"/>
               </w:rPr>
-              <w:t xml:space="preserve">Wk1: 20 lbs x5 → Wk4: 25 lbs x5</w:t>
+              <w:t xml:space="preserve">Wk1: 20 lbs x6-8 → Wk4: 25 lbs x6-8 — matches the programmed 3x6-8</w:t>
             </w:r>
           </w:p>
         </w:tc>
@@ -3400,7 +3400,7 @@
           <w:sz w:val="17"/>
           <w:szCs w:val="17"/>
         </w:rPr>
-        <w:t xml:space="preserve">Technique day — form over load, no PRs. Overhead pressing is being actively, carefully reintroduced today after a prior period of full suspension; the corrective and scapular blocks below earn that reintroduction before any pressing happens. Muscle-building remains the session's primary goal given her ALST At-Risk status — every block here is real progressive-resistance work, not filler. Work every set at 3+ RIR.</w:t>
+        <w:t xml:space="preserve">Technique day — form over load, no PRs. Overhead pressing is being actively, carefully reintroduced today after a prior period of full suspension; the corrective and scapular blocks below earn that reintroduction before any pressing happens. Muscle-building remains the session's primary goal given her ALST At-Risk status — every block here is real progressive-resistance work, not filler. Effort is tiered by block today: corrective and scapular work stays comfortably submaximal (3+ RIR), the reintroduced press works at 2 RIR inside pain-free range, and the one hypertrophy-priority accessory set (incline push-up) is the only work taken to 1 rep in reserve.</w:t>
       </w:r>
     </w:p>
     <w:p>
@@ -8324,6 +8324,17 @@
                 <w:szCs w:val="17"/>
               </w:rPr>
               <w:t xml:space="preserve">Full controlled range, chest tall, no momentum.</w:t>
+            </w:r>
+            <w:r>
+              <w:rPr>
+                <w:rFonts w:ascii="Arial" w:cs="Arial" w:eastAsia="Arial" w:hAnsi="Arial"/>
+                <w:i/>
+                <w:iCs/>
+                <w:color w:val="00695C"/>
+                <w:sz w:val="14"/>
+                <w:szCs w:val="14"/>
+              </w:rPr>
+              <w:t xml:space="preserve">  2 RIR</w:t>
             </w:r>
           </w:p>
         </w:tc>
@@ -17391,6 +17402,17 @@
                 <w:szCs w:val="17"/>
               </w:rPr>
               <w:t xml:space="preserve">Full controlled range, chest tall, no momentum.</w:t>
+            </w:r>
+            <w:r>
+              <w:rPr>
+                <w:rFonts w:ascii="Arial" w:cs="Arial" w:eastAsia="Arial" w:hAnsi="Arial"/>
+                <w:i/>
+                <w:iCs/>
+                <w:color w:val="00695C"/>
+                <w:sz w:val="14"/>
+                <w:szCs w:val="14"/>
+              </w:rPr>
+              <w:t xml:space="preserve">  2 RIR</w:t>
             </w:r>
           </w:p>
         </w:tc>

</xml_diff>

<commit_message>
Add post-press closed-chain hold rule and expert scapular options; apply to Siobhan Hansen's Day 1
</commit_message>
<xml_diff>
--- a/clients/siobhan_hansen/Siobhan_Hansen_3Day_Training_Plan.docx
+++ b/clients/siobhan_hansen/Siobhan_Hansen_3Day_Training_Plan.docx
@@ -5461,7 +5461,7 @@
           <w:sz w:val="17"/>
           <w:szCs w:val="17"/>
         </w:rPr>
-        <w:t xml:space="preserve">Trainer instruction: "Before doing pull ups needs scapula strength." This dedicated block is the strengthening protocol itself, not a warm-up throwaway, and gates her Assisted Pull-Up progression (tested at intake — 5 reps x close, standard, wide grip — see baselines table). Loaded progression on pull-ups is deferred until this block's own criteria are consistently clean: band pull-aparts 3x15 and a controlled 20-second scapular dead hang with no compensatory shrug.</w:t>
+        <w:t xml:space="preserve">Trainer instruction: "Before doing pull ups needs scapula strength." This dedicated block is the strengthening protocol itself, not a warm-up throwaway, and gates her Assisted Pull-Up progression (tested at intake — 5 reps x close, standard, wide grip — see baselines table). Loaded progression on pull-ups is deferred until this block's own criteria are consistently clean: band pull-aparts 3x15 and a controlled 20-second scapular dead hang with no compensatory shrug. Expert retraction options for the coach running the session — rotate by what her control shows that day rather than repeating one drill: band pull-apart, retraction-depression hold, scapular push-up, prone I's-T's-W's (her Day 3 modification applies), face pull, wall slide with lift-off, chest-supported scap-retraction row.</w:t>
       </w:r>
     </w:p>
     <w:tbl>
@@ -5990,465 +5990,7 @@
                 <w:sz w:val="18"/>
                 <w:szCs w:val="18"/>
               </w:rPr>
-              <w:t xml:space="preserve">Band Pull-Apart</w:t>
-            </w:r>
-          </w:p>
-        </w:tc>
-        <w:tc>
-          <w:tcPr>
-            <w:tcW w:type="dxa" w:w="380"/>
-            <w:tcBorders>
-              <w:top w:val="none" w:color="FFFFFF" w:sz="0"/>
-              <w:left w:val="none" w:color="FFFFFF" w:sz="0"/>
-              <w:bottom w:val="none" w:color="FFFFFF" w:sz="0"/>
-              <w:right w:val="none" w:color="FFFFFF" w:sz="0"/>
-            </w:tcBorders>
-            <w:shd w:fill="FFFFFF" w:color="auto" w:val="clear"/>
-            <w:tcMar>
-              <w:top w:type="dxa" w:w="40"/>
-              <w:left w:type="dxa" w:w="80"/>
-              <w:bottom w:type="dxa" w:w="40"/>
-              <w:right w:type="dxa" w:w="80"/>
-            </w:tcMar>
-            <w:vAlign w:val="center"/>
-          </w:tcPr>
-          <w:p>
-            <w:pPr>
-              <w:jc w:val="center"/>
-            </w:pPr>
-            <w:r>
-              <w:rPr>
-                <w:rFonts w:ascii="Arial" w:cs="Arial" w:eastAsia="Arial" w:hAnsi="Arial"/>
-                <w:color w:val="6B6B6B"/>
-                <w:sz w:val="15"/>
-                <w:szCs w:val="15"/>
-              </w:rPr>
-              <w:t xml:space="preserve">3</w:t>
-            </w:r>
-          </w:p>
-        </w:tc>
-        <w:tc>
-          <w:tcPr>
-            <w:tcW w:type="dxa" w:w="420"/>
-            <w:tcBorders>
-              <w:top w:val="none" w:color="FFFFFF" w:sz="0"/>
-              <w:left w:val="none" w:color="FFFFFF" w:sz="0"/>
-              <w:bottom w:val="none" w:color="FFFFFF" w:sz="0"/>
-              <w:right w:val="none" w:color="FFFFFF" w:sz="0"/>
-            </w:tcBorders>
-            <w:shd w:fill="FFFFFF" w:color="auto" w:val="clear"/>
-            <w:tcMar>
-              <w:top w:type="dxa" w:w="40"/>
-              <w:left w:type="dxa" w:w="80"/>
-              <w:bottom w:type="dxa" w:w="40"/>
-              <w:right w:type="dxa" w:w="80"/>
-            </w:tcMar>
-            <w:vAlign w:val="center"/>
-          </w:tcPr>
-          <w:p>
-            <w:pPr>
-              <w:jc w:val="center"/>
-            </w:pPr>
-            <w:r>
-              <w:rPr>
-                <w:rFonts w:ascii="Arial" w:cs="Arial" w:eastAsia="Arial" w:hAnsi="Arial"/>
-                <w:color w:val="6B6B6B"/>
-                <w:sz w:val="15"/>
-                <w:szCs w:val="15"/>
-              </w:rPr>
-              <w:t xml:space="preserve">15</w:t>
-            </w:r>
-          </w:p>
-        </w:tc>
-        <w:tc>
-          <w:tcPr>
-            <w:tcW w:type="dxa" w:w="680"/>
-            <w:tcBorders>
-              <w:top w:val="none" w:color="FFFFFF" w:sz="0"/>
-              <w:left w:val="none" w:color="FFFFFF" w:sz="0"/>
-              <w:bottom w:val="none" w:color="FFFFFF" w:sz="0"/>
-              <w:right w:val="none" w:color="FFFFFF" w:sz="0"/>
-            </w:tcBorders>
-            <w:shd w:fill="FFFFFF" w:color="auto" w:val="clear"/>
-            <w:tcMar>
-              <w:top w:type="dxa" w:w="40"/>
-              <w:left w:type="dxa" w:w="80"/>
-              <w:bottom w:type="dxa" w:w="40"/>
-              <w:right w:type="dxa" w:w="80"/>
-            </w:tcMar>
-            <w:vAlign w:val="center"/>
-          </w:tcPr>
-          <w:p>
-            <w:pPr>
-              <w:jc w:val="center"/>
-            </w:pPr>
-            <w:r>
-              <w:rPr>
-                <w:rFonts w:ascii="Arial" w:cs="Arial" w:eastAsia="Arial" w:hAnsi="Arial"/>
-                <w:color w:val="6B6B6B"/>
-                <w:sz w:val="15"/>
-                <w:szCs w:val="15"/>
-              </w:rPr>
-              <w:t xml:space="preserve">light-mod band</w:t>
-            </w:r>
-          </w:p>
-        </w:tc>
-        <w:tc>
-          <w:tcPr>
-            <w:tcW w:type="dxa" w:w="540"/>
-            <w:tcBorders>
-              <w:top w:val="none" w:color="FFFFFF" w:sz="0"/>
-              <w:left w:val="none" w:color="FFFFFF" w:sz="0"/>
-              <w:bottom w:val="none" w:color="FFFFFF" w:sz="0"/>
-              <w:right w:val="none" w:color="FFFFFF" w:sz="0"/>
-            </w:tcBorders>
-            <w:shd w:fill="FFFFFF" w:color="auto" w:val="clear"/>
-            <w:tcMar>
-              <w:top w:type="dxa" w:w="40"/>
-              <w:left w:type="dxa" w:w="80"/>
-              <w:bottom w:type="dxa" w:w="40"/>
-              <w:right w:type="dxa" w:w="80"/>
-            </w:tcMar>
-            <w:vAlign w:val="center"/>
-          </w:tcPr>
-          <w:p>
-            <w:pPr>
-              <w:jc w:val="center"/>
-            </w:pPr>
-            <w:r>
-              <w:rPr>
-                <w:rFonts w:ascii="Arial" w:cs="Arial" w:eastAsia="Arial" w:hAnsi="Arial"/>
-                <w:color w:val="6B6B6B"/>
-                <w:sz w:val="15"/>
-                <w:szCs w:val="15"/>
-              </w:rPr>
-              <w:t xml:space="preserve">2-1-2</w:t>
-            </w:r>
-          </w:p>
-        </w:tc>
-        <w:tc>
-          <w:tcPr>
-            <w:tcW w:type="dxa" w:w="440"/>
-            <w:tcBorders>
-              <w:top w:val="none" w:color="FFFFFF" w:sz="0"/>
-              <w:left w:val="none" w:color="FFFFFF" w:sz="0"/>
-              <w:bottom w:val="none" w:color="FFFFFF" w:sz="0"/>
-              <w:right w:val="none" w:color="FFFFFF" w:sz="0"/>
-            </w:tcBorders>
-            <w:shd w:fill="FFFFFF" w:color="auto" w:val="clear"/>
-            <w:tcMar>
-              <w:top w:type="dxa" w:w="40"/>
-              <w:left w:type="dxa" w:w="80"/>
-              <w:bottom w:type="dxa" w:w="40"/>
-              <w:right w:type="dxa" w:w="80"/>
-            </w:tcMar>
-            <w:vAlign w:val="center"/>
-          </w:tcPr>
-          <w:p>
-            <w:pPr>
-              <w:jc w:val="center"/>
-            </w:pPr>
-            <w:r>
-              <w:rPr>
-                <w:rFonts w:ascii="Arial" w:cs="Arial" w:eastAsia="Arial" w:hAnsi="Arial"/>
-                <w:color w:val="6B6B6B"/>
-                <w:sz w:val="15"/>
-                <w:szCs w:val="15"/>
-              </w:rPr>
-              <w:t xml:space="preserve">30s</w:t>
-            </w:r>
-          </w:p>
-        </w:tc>
-        <w:tc>
-          <w:tcPr>
-            <w:tcW w:type="dxa" w:w="5580"/>
-            <w:tcBorders>
-              <w:top w:val="none" w:color="FFFFFF" w:sz="0"/>
-              <w:left w:val="none" w:color="FFFFFF" w:sz="0"/>
-              <w:bottom w:val="none" w:color="FFFFFF" w:sz="0"/>
-              <w:right w:val="none" w:color="FFFFFF" w:sz="0"/>
-            </w:tcBorders>
-            <w:shd w:fill="FFFFFF" w:color="auto" w:val="clear"/>
-            <w:tcMar>
-              <w:top w:type="dxa" w:w="40"/>
-              <w:left w:type="dxa" w:w="80"/>
-              <w:bottom w:type="dxa" w:w="40"/>
-              <w:right w:type="dxa" w:w="80"/>
-            </w:tcMar>
-            <w:vAlign w:val="center"/>
-          </w:tcPr>
-          <w:p>
-            <w:r>
-              <w:rPr>
-                <w:rFonts w:ascii="Arial" w:cs="Arial" w:eastAsia="Arial" w:hAnsi="Arial"/>
-                <w:color w:val="6B6B6B"/>
-                <w:sz w:val="17"/>
-                <w:szCs w:val="17"/>
-              </w:rPr>
-              <w:t xml:space="preserve">Squeeze shoulder blades together, arms stay near shoulder height.</w:t>
-            </w:r>
-          </w:p>
-        </w:tc>
-      </w:tr>
-      <w:tr>
-        <w:tc>
-          <w:tcPr>
-            <w:tcW w:type="dxa" w:w="2400"/>
-            <w:tcBorders>
-              <w:top w:val="none" w:color="FFFFFF" w:sz="0"/>
-              <w:left w:val="none" w:color="FFFFFF" w:sz="0"/>
-              <w:bottom w:val="none" w:color="FFFFFF" w:sz="0"/>
-              <w:right w:val="none" w:color="FFFFFF" w:sz="0"/>
-            </w:tcBorders>
-            <w:shd w:fill="F8F4FB" w:color="auto" w:val="clear"/>
-            <w:tcMar>
-              <w:top w:type="dxa" w:w="40"/>
-              <w:left w:type="dxa" w:w="80"/>
-              <w:bottom w:type="dxa" w:w="40"/>
-              <w:right w:type="dxa" w:w="80"/>
-            </w:tcMar>
-            <w:vAlign w:val="center"/>
-          </w:tcPr>
-          <w:p>
-            <w:r>
-              <w:rPr>
-                <w:rFonts w:ascii="Arial" w:cs="Arial" w:eastAsia="Arial" w:hAnsi="Arial"/>
-                <w:b/>
-                <w:bCs/>
-                <w:color w:val="2C2C2C"/>
-                <w:sz w:val="18"/>
-                <w:szCs w:val="18"/>
-              </w:rPr>
-              <w:t xml:space="preserve">Scapular Dead Hang (Assisted, Controlled)</w:t>
-            </w:r>
-          </w:p>
-        </w:tc>
-        <w:tc>
-          <w:tcPr>
-            <w:tcW w:type="dxa" w:w="380"/>
-            <w:tcBorders>
-              <w:top w:val="none" w:color="FFFFFF" w:sz="0"/>
-              <w:left w:val="none" w:color="FFFFFF" w:sz="0"/>
-              <w:bottom w:val="none" w:color="FFFFFF" w:sz="0"/>
-              <w:right w:val="none" w:color="FFFFFF" w:sz="0"/>
-            </w:tcBorders>
-            <w:shd w:fill="F8F4FB" w:color="auto" w:val="clear"/>
-            <w:tcMar>
-              <w:top w:type="dxa" w:w="40"/>
-              <w:left w:type="dxa" w:w="80"/>
-              <w:bottom w:type="dxa" w:w="40"/>
-              <w:right w:type="dxa" w:w="80"/>
-            </w:tcMar>
-            <w:vAlign w:val="center"/>
-          </w:tcPr>
-          <w:p>
-            <w:pPr>
-              <w:jc w:val="center"/>
-            </w:pPr>
-            <w:r>
-              <w:rPr>
-                <w:rFonts w:ascii="Arial" w:cs="Arial" w:eastAsia="Arial" w:hAnsi="Arial"/>
-                <w:color w:val="6B6B6B"/>
-                <w:sz w:val="15"/>
-                <w:szCs w:val="15"/>
-              </w:rPr>
-              <w:t xml:space="preserve">2</w:t>
-            </w:r>
-          </w:p>
-        </w:tc>
-        <w:tc>
-          <w:tcPr>
-            <w:tcW w:type="dxa" w:w="420"/>
-            <w:tcBorders>
-              <w:top w:val="none" w:color="FFFFFF" w:sz="0"/>
-              <w:left w:val="none" w:color="FFFFFF" w:sz="0"/>
-              <w:bottom w:val="none" w:color="FFFFFF" w:sz="0"/>
-              <w:right w:val="none" w:color="FFFFFF" w:sz="0"/>
-            </w:tcBorders>
-            <w:shd w:fill="F8F4FB" w:color="auto" w:val="clear"/>
-            <w:tcMar>
-              <w:top w:type="dxa" w:w="40"/>
-              <w:left w:type="dxa" w:w="80"/>
-              <w:bottom w:type="dxa" w:w="40"/>
-              <w:right w:type="dxa" w:w="80"/>
-            </w:tcMar>
-            <w:vAlign w:val="center"/>
-          </w:tcPr>
-          <w:p>
-            <w:pPr>
-              <w:jc w:val="center"/>
-            </w:pPr>
-            <w:r>
-              <w:rPr>
-                <w:rFonts w:ascii="Arial" w:cs="Arial" w:eastAsia="Arial" w:hAnsi="Arial"/>
-                <w:color w:val="6B6B6B"/>
-                <w:sz w:val="15"/>
-                <w:szCs w:val="15"/>
-              </w:rPr>
-              <w:t xml:space="preserve">15-20s</w:t>
-            </w:r>
-          </w:p>
-        </w:tc>
-        <w:tc>
-          <w:tcPr>
-            <w:tcW w:type="dxa" w:w="680"/>
-            <w:tcBorders>
-              <w:top w:val="none" w:color="FFFFFF" w:sz="0"/>
-              <w:left w:val="none" w:color="FFFFFF" w:sz="0"/>
-              <w:bottom w:val="none" w:color="FFFFFF" w:sz="0"/>
-              <w:right w:val="none" w:color="FFFFFF" w:sz="0"/>
-            </w:tcBorders>
-            <w:shd w:fill="F8F4FB" w:color="auto" w:val="clear"/>
-            <w:tcMar>
-              <w:top w:type="dxa" w:w="40"/>
-              <w:left w:type="dxa" w:w="80"/>
-              <w:bottom w:type="dxa" w:w="40"/>
-              <w:right w:type="dxa" w:w="80"/>
-            </w:tcMar>
-            <w:vAlign w:val="center"/>
-          </w:tcPr>
-          <w:p>
-            <w:pPr>
-              <w:jc w:val="center"/>
-            </w:pPr>
-            <w:r>
-              <w:rPr>
-                <w:rFonts w:ascii="Arial" w:cs="Arial" w:eastAsia="Arial" w:hAnsi="Arial"/>
-                <w:color w:val="6B6B6B"/>
-                <w:sz w:val="15"/>
-                <w:szCs w:val="15"/>
-              </w:rPr>
-              <w:t xml:space="preserve">bodyweight, assisted</w:t>
-            </w:r>
-          </w:p>
-        </w:tc>
-        <w:tc>
-          <w:tcPr>
-            <w:tcW w:type="dxa" w:w="540"/>
-            <w:tcBorders>
-              <w:top w:val="none" w:color="FFFFFF" w:sz="0"/>
-              <w:left w:val="none" w:color="FFFFFF" w:sz="0"/>
-              <w:bottom w:val="none" w:color="FFFFFF" w:sz="0"/>
-              <w:right w:val="none" w:color="FFFFFF" w:sz="0"/>
-            </w:tcBorders>
-            <w:shd w:fill="F8F4FB" w:color="auto" w:val="clear"/>
-            <w:tcMar>
-              <w:top w:type="dxa" w:w="40"/>
-              <w:left w:type="dxa" w:w="80"/>
-              <w:bottom w:type="dxa" w:w="40"/>
-              <w:right w:type="dxa" w:w="80"/>
-            </w:tcMar>
-            <w:vAlign w:val="center"/>
-          </w:tcPr>
-          <w:p>
-            <w:pPr>
-              <w:jc w:val="center"/>
-            </w:pPr>
-            <w:r>
-              <w:rPr>
-                <w:rFonts w:ascii="Arial" w:cs="Arial" w:eastAsia="Arial" w:hAnsi="Arial"/>
-                <w:color w:val="6B6B6B"/>
-                <w:sz w:val="15"/>
-                <w:szCs w:val="15"/>
-              </w:rPr>
-              <w:t xml:space="preserve">hold</w:t>
-            </w:r>
-          </w:p>
-        </w:tc>
-        <w:tc>
-          <w:tcPr>
-            <w:tcW w:type="dxa" w:w="440"/>
-            <w:tcBorders>
-              <w:top w:val="none" w:color="FFFFFF" w:sz="0"/>
-              <w:left w:val="none" w:color="FFFFFF" w:sz="0"/>
-              <w:bottom w:val="none" w:color="FFFFFF" w:sz="0"/>
-              <w:right w:val="none" w:color="FFFFFF" w:sz="0"/>
-            </w:tcBorders>
-            <w:shd w:fill="F8F4FB" w:color="auto" w:val="clear"/>
-            <w:tcMar>
-              <w:top w:type="dxa" w:w="40"/>
-              <w:left w:type="dxa" w:w="80"/>
-              <w:bottom w:type="dxa" w:w="40"/>
-              <w:right w:type="dxa" w:w="80"/>
-            </w:tcMar>
-            <w:vAlign w:val="center"/>
-          </w:tcPr>
-          <w:p>
-            <w:pPr>
-              <w:jc w:val="center"/>
-            </w:pPr>
-            <w:r>
-              <w:rPr>
-                <w:rFonts w:ascii="Arial" w:cs="Arial" w:eastAsia="Arial" w:hAnsi="Arial"/>
-                <w:color w:val="6B6B6B"/>
-                <w:sz w:val="15"/>
-                <w:szCs w:val="15"/>
-              </w:rPr>
-              <w:t xml:space="preserve">45s</w:t>
-            </w:r>
-          </w:p>
-        </w:tc>
-        <w:tc>
-          <w:tcPr>
-            <w:tcW w:type="dxa" w:w="5580"/>
-            <w:tcBorders>
-              <w:top w:val="none" w:color="FFFFFF" w:sz="0"/>
-              <w:left w:val="none" w:color="FFFFFF" w:sz="0"/>
-              <w:bottom w:val="none" w:color="FFFFFF" w:sz="0"/>
-              <w:right w:val="none" w:color="FFFFFF" w:sz="0"/>
-            </w:tcBorders>
-            <w:shd w:fill="F8F4FB" w:color="auto" w:val="clear"/>
-            <w:tcMar>
-              <w:top w:type="dxa" w:w="40"/>
-              <w:left w:type="dxa" w:w="80"/>
-              <w:bottom w:type="dxa" w:w="40"/>
-              <w:right w:type="dxa" w:w="80"/>
-            </w:tcMar>
-            <w:vAlign w:val="center"/>
-          </w:tcPr>
-          <w:p>
-            <w:r>
-              <w:rPr>
-                <w:rFonts w:ascii="Arial" w:cs="Arial" w:eastAsia="Arial" w:hAnsi="Arial"/>
-                <w:color w:val="6B6B6B"/>
-                <w:sz w:val="17"/>
-                <w:szCs w:val="17"/>
-              </w:rPr>
-              <w:t xml:space="preserve">Active scapular engagement, not a passive hang — shoulders set, not shrugged.</w:t>
-            </w:r>
-          </w:p>
-        </w:tc>
-      </w:tr>
-      <w:tr>
-        <w:tc>
-          <w:tcPr>
-            <w:tcW w:type="dxa" w:w="2400"/>
-            <w:tcBorders>
-              <w:top w:val="none" w:color="FFFFFF" w:sz="0"/>
-              <w:left w:val="none" w:color="FFFFFF" w:sz="0"/>
-              <w:bottom w:val="none" w:color="FFFFFF" w:sz="0"/>
-              <w:right w:val="none" w:color="FFFFFF" w:sz="0"/>
-            </w:tcBorders>
-            <w:shd w:fill="FFFFFF" w:color="auto" w:val="clear"/>
-            <w:tcMar>
-              <w:top w:type="dxa" w:w="40"/>
-              <w:left w:type="dxa" w:w="80"/>
-              <w:bottom w:type="dxa" w:w="40"/>
-              <w:right w:type="dxa" w:w="80"/>
-            </w:tcMar>
-            <w:vAlign w:val="center"/>
-          </w:tcPr>
-          <w:p>
-            <w:r>
-              <w:rPr>
-                <w:rFonts w:ascii="Arial" w:cs="Arial" w:eastAsia="Arial" w:hAnsi="Arial"/>
-                <w:b/>
-                <w:bCs/>
-                <w:color w:val="2C2C2C"/>
-                <w:sz w:val="18"/>
-                <w:szCs w:val="18"/>
-              </w:rPr>
-              <w:t xml:space="preserve">Assisted Pull-Up (Baseline Reference — Not Yet Progressing)</w:t>
+              <w:t xml:space="preserve">Scapular Push-Up</w:t>
             </w:r>
           </w:p>
           <w:p>
@@ -6461,6 +6003,706 @@
                 <w:sz w:val="14"/>
                 <w:szCs w:val="14"/>
               </w:rPr>
+              <w:t xml:space="preserve">Left shoulder — quadruped regression if plank position provokes</w:t>
+            </w:r>
+          </w:p>
+        </w:tc>
+        <w:tc>
+          <w:tcPr>
+            <w:tcW w:type="dxa" w:w="380"/>
+            <w:tcBorders>
+              <w:top w:val="none" w:color="FFFFFF" w:sz="0"/>
+              <w:left w:val="none" w:color="FFFFFF" w:sz="0"/>
+              <w:bottom w:val="none" w:color="FFFFFF" w:sz="0"/>
+              <w:right w:val="none" w:color="FFFFFF" w:sz="0"/>
+            </w:tcBorders>
+            <w:shd w:fill="FFFFFF" w:color="auto" w:val="clear"/>
+            <w:tcMar>
+              <w:top w:type="dxa" w:w="40"/>
+              <w:left w:type="dxa" w:w="80"/>
+              <w:bottom w:type="dxa" w:w="40"/>
+              <w:right w:type="dxa" w:w="80"/>
+            </w:tcMar>
+            <w:vAlign w:val="center"/>
+          </w:tcPr>
+          <w:p>
+            <w:pPr>
+              <w:jc w:val="center"/>
+            </w:pPr>
+            <w:r>
+              <w:rPr>
+                <w:rFonts w:ascii="Arial" w:cs="Arial" w:eastAsia="Arial" w:hAnsi="Arial"/>
+                <w:color w:val="6B6B6B"/>
+                <w:sz w:val="15"/>
+                <w:szCs w:val="15"/>
+              </w:rPr>
+              <w:t xml:space="preserve">2</w:t>
+            </w:r>
+          </w:p>
+        </w:tc>
+        <w:tc>
+          <w:tcPr>
+            <w:tcW w:type="dxa" w:w="420"/>
+            <w:tcBorders>
+              <w:top w:val="none" w:color="FFFFFF" w:sz="0"/>
+              <w:left w:val="none" w:color="FFFFFF" w:sz="0"/>
+              <w:bottom w:val="none" w:color="FFFFFF" w:sz="0"/>
+              <w:right w:val="none" w:color="FFFFFF" w:sz="0"/>
+            </w:tcBorders>
+            <w:shd w:fill="FFFFFF" w:color="auto" w:val="clear"/>
+            <w:tcMar>
+              <w:top w:type="dxa" w:w="40"/>
+              <w:left w:type="dxa" w:w="80"/>
+              <w:bottom w:type="dxa" w:w="40"/>
+              <w:right w:type="dxa" w:w="80"/>
+            </w:tcMar>
+            <w:vAlign w:val="center"/>
+          </w:tcPr>
+          <w:p>
+            <w:pPr>
+              <w:jc w:val="center"/>
+            </w:pPr>
+            <w:r>
+              <w:rPr>
+                <w:rFonts w:ascii="Arial" w:cs="Arial" w:eastAsia="Arial" w:hAnsi="Arial"/>
+                <w:color w:val="6B6B6B"/>
+                <w:sz w:val="15"/>
+                <w:szCs w:val="15"/>
+              </w:rPr>
+              <w:t xml:space="preserve">10-12</w:t>
+            </w:r>
+          </w:p>
+        </w:tc>
+        <w:tc>
+          <w:tcPr>
+            <w:tcW w:type="dxa" w:w="680"/>
+            <w:tcBorders>
+              <w:top w:val="none" w:color="FFFFFF" w:sz="0"/>
+              <w:left w:val="none" w:color="FFFFFF" w:sz="0"/>
+              <w:bottom w:val="none" w:color="FFFFFF" w:sz="0"/>
+              <w:right w:val="none" w:color="FFFFFF" w:sz="0"/>
+            </w:tcBorders>
+            <w:shd w:fill="FFFFFF" w:color="auto" w:val="clear"/>
+            <w:tcMar>
+              <w:top w:type="dxa" w:w="40"/>
+              <w:left w:type="dxa" w:w="80"/>
+              <w:bottom w:type="dxa" w:w="40"/>
+              <w:right w:type="dxa" w:w="80"/>
+            </w:tcMar>
+            <w:vAlign w:val="center"/>
+          </w:tcPr>
+          <w:p>
+            <w:pPr>
+              <w:jc w:val="center"/>
+            </w:pPr>
+            <w:r>
+              <w:rPr>
+                <w:rFonts w:ascii="Arial" w:cs="Arial" w:eastAsia="Arial" w:hAnsi="Arial"/>
+                <w:color w:val="6B6B6B"/>
+                <w:sz w:val="15"/>
+                <w:szCs w:val="15"/>
+              </w:rPr>
+              <w:t xml:space="preserve">bodyweight</w:t>
+            </w:r>
+          </w:p>
+        </w:tc>
+        <w:tc>
+          <w:tcPr>
+            <w:tcW w:type="dxa" w:w="540"/>
+            <w:tcBorders>
+              <w:top w:val="none" w:color="FFFFFF" w:sz="0"/>
+              <w:left w:val="none" w:color="FFFFFF" w:sz="0"/>
+              <w:bottom w:val="none" w:color="FFFFFF" w:sz="0"/>
+              <w:right w:val="none" w:color="FFFFFF" w:sz="0"/>
+            </w:tcBorders>
+            <w:shd w:fill="FFFFFF" w:color="auto" w:val="clear"/>
+            <w:tcMar>
+              <w:top w:type="dxa" w:w="40"/>
+              <w:left w:type="dxa" w:w="80"/>
+              <w:bottom w:type="dxa" w:w="40"/>
+              <w:right w:type="dxa" w:w="80"/>
+            </w:tcMar>
+            <w:vAlign w:val="center"/>
+          </w:tcPr>
+          <w:p>
+            <w:pPr>
+              <w:jc w:val="center"/>
+            </w:pPr>
+            <w:r>
+              <w:rPr>
+                <w:rFonts w:ascii="Arial" w:cs="Arial" w:eastAsia="Arial" w:hAnsi="Arial"/>
+                <w:color w:val="6B6B6B"/>
+                <w:sz w:val="15"/>
+                <w:szCs w:val="15"/>
+              </w:rPr>
+              <w:t xml:space="preserve">controlled</w:t>
+            </w:r>
+          </w:p>
+        </w:tc>
+        <w:tc>
+          <w:tcPr>
+            <w:tcW w:type="dxa" w:w="440"/>
+            <w:tcBorders>
+              <w:top w:val="none" w:color="FFFFFF" w:sz="0"/>
+              <w:left w:val="none" w:color="FFFFFF" w:sz="0"/>
+              <w:bottom w:val="none" w:color="FFFFFF" w:sz="0"/>
+              <w:right w:val="none" w:color="FFFFFF" w:sz="0"/>
+            </w:tcBorders>
+            <w:shd w:fill="FFFFFF" w:color="auto" w:val="clear"/>
+            <w:tcMar>
+              <w:top w:type="dxa" w:w="40"/>
+              <w:left w:type="dxa" w:w="80"/>
+              <w:bottom w:type="dxa" w:w="40"/>
+              <w:right w:type="dxa" w:w="80"/>
+            </w:tcMar>
+            <w:vAlign w:val="center"/>
+          </w:tcPr>
+          <w:p>
+            <w:pPr>
+              <w:jc w:val="center"/>
+            </w:pPr>
+            <w:r>
+              <w:rPr>
+                <w:rFonts w:ascii="Arial" w:cs="Arial" w:eastAsia="Arial" w:hAnsi="Arial"/>
+                <w:color w:val="6B6B6B"/>
+                <w:sz w:val="15"/>
+                <w:szCs w:val="15"/>
+              </w:rPr>
+              <w:t xml:space="preserve">30s</w:t>
+            </w:r>
+          </w:p>
+        </w:tc>
+        <w:tc>
+          <w:tcPr>
+            <w:tcW w:type="dxa" w:w="5580"/>
+            <w:tcBorders>
+              <w:top w:val="none" w:color="FFFFFF" w:sz="0"/>
+              <w:left w:val="none" w:color="FFFFFF" w:sz="0"/>
+              <w:bottom w:val="none" w:color="FFFFFF" w:sz="0"/>
+              <w:right w:val="none" w:color="FFFFFF" w:sz="0"/>
+            </w:tcBorders>
+            <w:shd w:fill="FFFFFF" w:color="auto" w:val="clear"/>
+            <w:tcMar>
+              <w:top w:type="dxa" w:w="40"/>
+              <w:left w:type="dxa" w:w="80"/>
+              <w:bottom w:type="dxa" w:w="40"/>
+              <w:right w:type="dxa" w:w="80"/>
+            </w:tcMar>
+            <w:vAlign w:val="center"/>
+          </w:tcPr>
+          <w:p>
+            <w:r>
+              <w:rPr>
+                <w:rFonts w:ascii="Arial" w:cs="Arial" w:eastAsia="Arial" w:hAnsi="Arial"/>
+                <w:color w:val="6B6B6B"/>
+                <w:sz w:val="17"/>
+                <w:szCs w:val="17"/>
+              </w:rPr>
+              <w:t xml:space="preserve">Arms locked, move only the shoulder blades — protract and retract through full comfortable range.</w:t>
+            </w:r>
+          </w:p>
+        </w:tc>
+      </w:tr>
+      <w:tr>
+        <w:tc>
+          <w:tcPr>
+            <w:tcW w:type="dxa" w:w="2400"/>
+            <w:tcBorders>
+              <w:top w:val="none" w:color="FFFFFF" w:sz="0"/>
+              <w:left w:val="none" w:color="FFFFFF" w:sz="0"/>
+              <w:bottom w:val="none" w:color="FFFFFF" w:sz="0"/>
+              <w:right w:val="none" w:color="FFFFFF" w:sz="0"/>
+            </w:tcBorders>
+            <w:shd w:fill="F8F4FB" w:color="auto" w:val="clear"/>
+            <w:tcMar>
+              <w:top w:type="dxa" w:w="40"/>
+              <w:left w:type="dxa" w:w="80"/>
+              <w:bottom w:type="dxa" w:w="40"/>
+              <w:right w:type="dxa" w:w="80"/>
+            </w:tcMar>
+            <w:vAlign w:val="center"/>
+          </w:tcPr>
+          <w:p>
+            <w:r>
+              <w:rPr>
+                <w:rFonts w:ascii="Arial" w:cs="Arial" w:eastAsia="Arial" w:hAnsi="Arial"/>
+                <w:b/>
+                <w:bCs/>
+                <w:color w:val="2C2C2C"/>
+                <w:sz w:val="18"/>
+                <w:szCs w:val="18"/>
+              </w:rPr>
+              <w:t xml:space="preserve">Band Pull-Apart</w:t>
+            </w:r>
+          </w:p>
+        </w:tc>
+        <w:tc>
+          <w:tcPr>
+            <w:tcW w:type="dxa" w:w="380"/>
+            <w:tcBorders>
+              <w:top w:val="none" w:color="FFFFFF" w:sz="0"/>
+              <w:left w:val="none" w:color="FFFFFF" w:sz="0"/>
+              <w:bottom w:val="none" w:color="FFFFFF" w:sz="0"/>
+              <w:right w:val="none" w:color="FFFFFF" w:sz="0"/>
+            </w:tcBorders>
+            <w:shd w:fill="F8F4FB" w:color="auto" w:val="clear"/>
+            <w:tcMar>
+              <w:top w:type="dxa" w:w="40"/>
+              <w:left w:type="dxa" w:w="80"/>
+              <w:bottom w:type="dxa" w:w="40"/>
+              <w:right w:type="dxa" w:w="80"/>
+            </w:tcMar>
+            <w:vAlign w:val="center"/>
+          </w:tcPr>
+          <w:p>
+            <w:pPr>
+              <w:jc w:val="center"/>
+            </w:pPr>
+            <w:r>
+              <w:rPr>
+                <w:rFonts w:ascii="Arial" w:cs="Arial" w:eastAsia="Arial" w:hAnsi="Arial"/>
+                <w:color w:val="6B6B6B"/>
+                <w:sz w:val="15"/>
+                <w:szCs w:val="15"/>
+              </w:rPr>
+              <w:t xml:space="preserve">3</w:t>
+            </w:r>
+          </w:p>
+        </w:tc>
+        <w:tc>
+          <w:tcPr>
+            <w:tcW w:type="dxa" w:w="420"/>
+            <w:tcBorders>
+              <w:top w:val="none" w:color="FFFFFF" w:sz="0"/>
+              <w:left w:val="none" w:color="FFFFFF" w:sz="0"/>
+              <w:bottom w:val="none" w:color="FFFFFF" w:sz="0"/>
+              <w:right w:val="none" w:color="FFFFFF" w:sz="0"/>
+            </w:tcBorders>
+            <w:shd w:fill="F8F4FB" w:color="auto" w:val="clear"/>
+            <w:tcMar>
+              <w:top w:type="dxa" w:w="40"/>
+              <w:left w:type="dxa" w:w="80"/>
+              <w:bottom w:type="dxa" w:w="40"/>
+              <w:right w:type="dxa" w:w="80"/>
+            </w:tcMar>
+            <w:vAlign w:val="center"/>
+          </w:tcPr>
+          <w:p>
+            <w:pPr>
+              <w:jc w:val="center"/>
+            </w:pPr>
+            <w:r>
+              <w:rPr>
+                <w:rFonts w:ascii="Arial" w:cs="Arial" w:eastAsia="Arial" w:hAnsi="Arial"/>
+                <w:color w:val="6B6B6B"/>
+                <w:sz w:val="15"/>
+                <w:szCs w:val="15"/>
+              </w:rPr>
+              <w:t xml:space="preserve">15</w:t>
+            </w:r>
+          </w:p>
+        </w:tc>
+        <w:tc>
+          <w:tcPr>
+            <w:tcW w:type="dxa" w:w="680"/>
+            <w:tcBorders>
+              <w:top w:val="none" w:color="FFFFFF" w:sz="0"/>
+              <w:left w:val="none" w:color="FFFFFF" w:sz="0"/>
+              <w:bottom w:val="none" w:color="FFFFFF" w:sz="0"/>
+              <w:right w:val="none" w:color="FFFFFF" w:sz="0"/>
+            </w:tcBorders>
+            <w:shd w:fill="F8F4FB" w:color="auto" w:val="clear"/>
+            <w:tcMar>
+              <w:top w:type="dxa" w:w="40"/>
+              <w:left w:type="dxa" w:w="80"/>
+              <w:bottom w:type="dxa" w:w="40"/>
+              <w:right w:type="dxa" w:w="80"/>
+            </w:tcMar>
+            <w:vAlign w:val="center"/>
+          </w:tcPr>
+          <w:p>
+            <w:pPr>
+              <w:jc w:val="center"/>
+            </w:pPr>
+            <w:r>
+              <w:rPr>
+                <w:rFonts w:ascii="Arial" w:cs="Arial" w:eastAsia="Arial" w:hAnsi="Arial"/>
+                <w:color w:val="6B6B6B"/>
+                <w:sz w:val="15"/>
+                <w:szCs w:val="15"/>
+              </w:rPr>
+              <w:t xml:space="preserve">light-mod band</w:t>
+            </w:r>
+          </w:p>
+        </w:tc>
+        <w:tc>
+          <w:tcPr>
+            <w:tcW w:type="dxa" w:w="540"/>
+            <w:tcBorders>
+              <w:top w:val="none" w:color="FFFFFF" w:sz="0"/>
+              <w:left w:val="none" w:color="FFFFFF" w:sz="0"/>
+              <w:bottom w:val="none" w:color="FFFFFF" w:sz="0"/>
+              <w:right w:val="none" w:color="FFFFFF" w:sz="0"/>
+            </w:tcBorders>
+            <w:shd w:fill="F8F4FB" w:color="auto" w:val="clear"/>
+            <w:tcMar>
+              <w:top w:type="dxa" w:w="40"/>
+              <w:left w:type="dxa" w:w="80"/>
+              <w:bottom w:type="dxa" w:w="40"/>
+              <w:right w:type="dxa" w:w="80"/>
+            </w:tcMar>
+            <w:vAlign w:val="center"/>
+          </w:tcPr>
+          <w:p>
+            <w:pPr>
+              <w:jc w:val="center"/>
+            </w:pPr>
+            <w:r>
+              <w:rPr>
+                <w:rFonts w:ascii="Arial" w:cs="Arial" w:eastAsia="Arial" w:hAnsi="Arial"/>
+                <w:color w:val="6B6B6B"/>
+                <w:sz w:val="15"/>
+                <w:szCs w:val="15"/>
+              </w:rPr>
+              <w:t xml:space="preserve">2-1-2</w:t>
+            </w:r>
+          </w:p>
+        </w:tc>
+        <w:tc>
+          <w:tcPr>
+            <w:tcW w:type="dxa" w:w="440"/>
+            <w:tcBorders>
+              <w:top w:val="none" w:color="FFFFFF" w:sz="0"/>
+              <w:left w:val="none" w:color="FFFFFF" w:sz="0"/>
+              <w:bottom w:val="none" w:color="FFFFFF" w:sz="0"/>
+              <w:right w:val="none" w:color="FFFFFF" w:sz="0"/>
+            </w:tcBorders>
+            <w:shd w:fill="F8F4FB" w:color="auto" w:val="clear"/>
+            <w:tcMar>
+              <w:top w:type="dxa" w:w="40"/>
+              <w:left w:type="dxa" w:w="80"/>
+              <w:bottom w:type="dxa" w:w="40"/>
+              <w:right w:type="dxa" w:w="80"/>
+            </w:tcMar>
+            <w:vAlign w:val="center"/>
+          </w:tcPr>
+          <w:p>
+            <w:pPr>
+              <w:jc w:val="center"/>
+            </w:pPr>
+            <w:r>
+              <w:rPr>
+                <w:rFonts w:ascii="Arial" w:cs="Arial" w:eastAsia="Arial" w:hAnsi="Arial"/>
+                <w:color w:val="6B6B6B"/>
+                <w:sz w:val="15"/>
+                <w:szCs w:val="15"/>
+              </w:rPr>
+              <w:t xml:space="preserve">30s</w:t>
+            </w:r>
+          </w:p>
+        </w:tc>
+        <w:tc>
+          <w:tcPr>
+            <w:tcW w:type="dxa" w:w="5580"/>
+            <w:tcBorders>
+              <w:top w:val="none" w:color="FFFFFF" w:sz="0"/>
+              <w:left w:val="none" w:color="FFFFFF" w:sz="0"/>
+              <w:bottom w:val="none" w:color="FFFFFF" w:sz="0"/>
+              <w:right w:val="none" w:color="FFFFFF" w:sz="0"/>
+            </w:tcBorders>
+            <w:shd w:fill="F8F4FB" w:color="auto" w:val="clear"/>
+            <w:tcMar>
+              <w:top w:type="dxa" w:w="40"/>
+              <w:left w:type="dxa" w:w="80"/>
+              <w:bottom w:type="dxa" w:w="40"/>
+              <w:right w:type="dxa" w:w="80"/>
+            </w:tcMar>
+            <w:vAlign w:val="center"/>
+          </w:tcPr>
+          <w:p>
+            <w:r>
+              <w:rPr>
+                <w:rFonts w:ascii="Arial" w:cs="Arial" w:eastAsia="Arial" w:hAnsi="Arial"/>
+                <w:color w:val="6B6B6B"/>
+                <w:sz w:val="17"/>
+                <w:szCs w:val="17"/>
+              </w:rPr>
+              <w:t xml:space="preserve">Squeeze shoulder blades together, arms stay near shoulder height.</w:t>
+            </w:r>
+          </w:p>
+        </w:tc>
+      </w:tr>
+      <w:tr>
+        <w:tc>
+          <w:tcPr>
+            <w:tcW w:type="dxa" w:w="2400"/>
+            <w:tcBorders>
+              <w:top w:val="none" w:color="FFFFFF" w:sz="0"/>
+              <w:left w:val="none" w:color="FFFFFF" w:sz="0"/>
+              <w:bottom w:val="none" w:color="FFFFFF" w:sz="0"/>
+              <w:right w:val="none" w:color="FFFFFF" w:sz="0"/>
+            </w:tcBorders>
+            <w:shd w:fill="FFFFFF" w:color="auto" w:val="clear"/>
+            <w:tcMar>
+              <w:top w:type="dxa" w:w="40"/>
+              <w:left w:type="dxa" w:w="80"/>
+              <w:bottom w:type="dxa" w:w="40"/>
+              <w:right w:type="dxa" w:w="80"/>
+            </w:tcMar>
+            <w:vAlign w:val="center"/>
+          </w:tcPr>
+          <w:p>
+            <w:r>
+              <w:rPr>
+                <w:rFonts w:ascii="Arial" w:cs="Arial" w:eastAsia="Arial" w:hAnsi="Arial"/>
+                <w:b/>
+                <w:bCs/>
+                <w:color w:val="2C2C2C"/>
+                <w:sz w:val="18"/>
+                <w:szCs w:val="18"/>
+              </w:rPr>
+              <w:t xml:space="preserve">Scapular Dead Hang (Assisted, Controlled)</w:t>
+            </w:r>
+          </w:p>
+        </w:tc>
+        <w:tc>
+          <w:tcPr>
+            <w:tcW w:type="dxa" w:w="380"/>
+            <w:tcBorders>
+              <w:top w:val="none" w:color="FFFFFF" w:sz="0"/>
+              <w:left w:val="none" w:color="FFFFFF" w:sz="0"/>
+              <w:bottom w:val="none" w:color="FFFFFF" w:sz="0"/>
+              <w:right w:val="none" w:color="FFFFFF" w:sz="0"/>
+            </w:tcBorders>
+            <w:shd w:fill="FFFFFF" w:color="auto" w:val="clear"/>
+            <w:tcMar>
+              <w:top w:type="dxa" w:w="40"/>
+              <w:left w:type="dxa" w:w="80"/>
+              <w:bottom w:type="dxa" w:w="40"/>
+              <w:right w:type="dxa" w:w="80"/>
+            </w:tcMar>
+            <w:vAlign w:val="center"/>
+          </w:tcPr>
+          <w:p>
+            <w:pPr>
+              <w:jc w:val="center"/>
+            </w:pPr>
+            <w:r>
+              <w:rPr>
+                <w:rFonts w:ascii="Arial" w:cs="Arial" w:eastAsia="Arial" w:hAnsi="Arial"/>
+                <w:color w:val="6B6B6B"/>
+                <w:sz w:val="15"/>
+                <w:szCs w:val="15"/>
+              </w:rPr>
+              <w:t xml:space="preserve">2</w:t>
+            </w:r>
+          </w:p>
+        </w:tc>
+        <w:tc>
+          <w:tcPr>
+            <w:tcW w:type="dxa" w:w="420"/>
+            <w:tcBorders>
+              <w:top w:val="none" w:color="FFFFFF" w:sz="0"/>
+              <w:left w:val="none" w:color="FFFFFF" w:sz="0"/>
+              <w:bottom w:val="none" w:color="FFFFFF" w:sz="0"/>
+              <w:right w:val="none" w:color="FFFFFF" w:sz="0"/>
+            </w:tcBorders>
+            <w:shd w:fill="FFFFFF" w:color="auto" w:val="clear"/>
+            <w:tcMar>
+              <w:top w:type="dxa" w:w="40"/>
+              <w:left w:type="dxa" w:w="80"/>
+              <w:bottom w:type="dxa" w:w="40"/>
+              <w:right w:type="dxa" w:w="80"/>
+            </w:tcMar>
+            <w:vAlign w:val="center"/>
+          </w:tcPr>
+          <w:p>
+            <w:pPr>
+              <w:jc w:val="center"/>
+            </w:pPr>
+            <w:r>
+              <w:rPr>
+                <w:rFonts w:ascii="Arial" w:cs="Arial" w:eastAsia="Arial" w:hAnsi="Arial"/>
+                <w:color w:val="6B6B6B"/>
+                <w:sz w:val="15"/>
+                <w:szCs w:val="15"/>
+              </w:rPr>
+              <w:t xml:space="preserve">15-20s</w:t>
+            </w:r>
+          </w:p>
+        </w:tc>
+        <w:tc>
+          <w:tcPr>
+            <w:tcW w:type="dxa" w:w="680"/>
+            <w:tcBorders>
+              <w:top w:val="none" w:color="FFFFFF" w:sz="0"/>
+              <w:left w:val="none" w:color="FFFFFF" w:sz="0"/>
+              <w:bottom w:val="none" w:color="FFFFFF" w:sz="0"/>
+              <w:right w:val="none" w:color="FFFFFF" w:sz="0"/>
+            </w:tcBorders>
+            <w:shd w:fill="FFFFFF" w:color="auto" w:val="clear"/>
+            <w:tcMar>
+              <w:top w:type="dxa" w:w="40"/>
+              <w:left w:type="dxa" w:w="80"/>
+              <w:bottom w:type="dxa" w:w="40"/>
+              <w:right w:type="dxa" w:w="80"/>
+            </w:tcMar>
+            <w:vAlign w:val="center"/>
+          </w:tcPr>
+          <w:p>
+            <w:pPr>
+              <w:jc w:val="center"/>
+            </w:pPr>
+            <w:r>
+              <w:rPr>
+                <w:rFonts w:ascii="Arial" w:cs="Arial" w:eastAsia="Arial" w:hAnsi="Arial"/>
+                <w:color w:val="6B6B6B"/>
+                <w:sz w:val="15"/>
+                <w:szCs w:val="15"/>
+              </w:rPr>
+              <w:t xml:space="preserve">bodyweight, assisted</w:t>
+            </w:r>
+          </w:p>
+        </w:tc>
+        <w:tc>
+          <w:tcPr>
+            <w:tcW w:type="dxa" w:w="540"/>
+            <w:tcBorders>
+              <w:top w:val="none" w:color="FFFFFF" w:sz="0"/>
+              <w:left w:val="none" w:color="FFFFFF" w:sz="0"/>
+              <w:bottom w:val="none" w:color="FFFFFF" w:sz="0"/>
+              <w:right w:val="none" w:color="FFFFFF" w:sz="0"/>
+            </w:tcBorders>
+            <w:shd w:fill="FFFFFF" w:color="auto" w:val="clear"/>
+            <w:tcMar>
+              <w:top w:type="dxa" w:w="40"/>
+              <w:left w:type="dxa" w:w="80"/>
+              <w:bottom w:type="dxa" w:w="40"/>
+              <w:right w:type="dxa" w:w="80"/>
+            </w:tcMar>
+            <w:vAlign w:val="center"/>
+          </w:tcPr>
+          <w:p>
+            <w:pPr>
+              <w:jc w:val="center"/>
+            </w:pPr>
+            <w:r>
+              <w:rPr>
+                <w:rFonts w:ascii="Arial" w:cs="Arial" w:eastAsia="Arial" w:hAnsi="Arial"/>
+                <w:color w:val="6B6B6B"/>
+                <w:sz w:val="15"/>
+                <w:szCs w:val="15"/>
+              </w:rPr>
+              <w:t xml:space="preserve">hold</w:t>
+            </w:r>
+          </w:p>
+        </w:tc>
+        <w:tc>
+          <w:tcPr>
+            <w:tcW w:type="dxa" w:w="440"/>
+            <w:tcBorders>
+              <w:top w:val="none" w:color="FFFFFF" w:sz="0"/>
+              <w:left w:val="none" w:color="FFFFFF" w:sz="0"/>
+              <w:bottom w:val="none" w:color="FFFFFF" w:sz="0"/>
+              <w:right w:val="none" w:color="FFFFFF" w:sz="0"/>
+            </w:tcBorders>
+            <w:shd w:fill="FFFFFF" w:color="auto" w:val="clear"/>
+            <w:tcMar>
+              <w:top w:type="dxa" w:w="40"/>
+              <w:left w:type="dxa" w:w="80"/>
+              <w:bottom w:type="dxa" w:w="40"/>
+              <w:right w:type="dxa" w:w="80"/>
+            </w:tcMar>
+            <w:vAlign w:val="center"/>
+          </w:tcPr>
+          <w:p>
+            <w:pPr>
+              <w:jc w:val="center"/>
+            </w:pPr>
+            <w:r>
+              <w:rPr>
+                <w:rFonts w:ascii="Arial" w:cs="Arial" w:eastAsia="Arial" w:hAnsi="Arial"/>
+                <w:color w:val="6B6B6B"/>
+                <w:sz w:val="15"/>
+                <w:szCs w:val="15"/>
+              </w:rPr>
+              <w:t xml:space="preserve">45s</w:t>
+            </w:r>
+          </w:p>
+        </w:tc>
+        <w:tc>
+          <w:tcPr>
+            <w:tcW w:type="dxa" w:w="5580"/>
+            <w:tcBorders>
+              <w:top w:val="none" w:color="FFFFFF" w:sz="0"/>
+              <w:left w:val="none" w:color="FFFFFF" w:sz="0"/>
+              <w:bottom w:val="none" w:color="FFFFFF" w:sz="0"/>
+              <w:right w:val="none" w:color="FFFFFF" w:sz="0"/>
+            </w:tcBorders>
+            <w:shd w:fill="FFFFFF" w:color="auto" w:val="clear"/>
+            <w:tcMar>
+              <w:top w:type="dxa" w:w="40"/>
+              <w:left w:type="dxa" w:w="80"/>
+              <w:bottom w:type="dxa" w:w="40"/>
+              <w:right w:type="dxa" w:w="80"/>
+            </w:tcMar>
+            <w:vAlign w:val="center"/>
+          </w:tcPr>
+          <w:p>
+            <w:r>
+              <w:rPr>
+                <w:rFonts w:ascii="Arial" w:cs="Arial" w:eastAsia="Arial" w:hAnsi="Arial"/>
+                <w:color w:val="6B6B6B"/>
+                <w:sz w:val="17"/>
+                <w:szCs w:val="17"/>
+              </w:rPr>
+              <w:t xml:space="preserve">Active scapular engagement, not a passive hang — shoulders set, not shrugged.</w:t>
+            </w:r>
+          </w:p>
+        </w:tc>
+      </w:tr>
+      <w:tr>
+        <w:tc>
+          <w:tcPr>
+            <w:tcW w:type="dxa" w:w="2400"/>
+            <w:tcBorders>
+              <w:top w:val="none" w:color="FFFFFF" w:sz="0"/>
+              <w:left w:val="none" w:color="FFFFFF" w:sz="0"/>
+              <w:bottom w:val="none" w:color="FFFFFF" w:sz="0"/>
+              <w:right w:val="none" w:color="FFFFFF" w:sz="0"/>
+            </w:tcBorders>
+            <w:shd w:fill="F8F4FB" w:color="auto" w:val="clear"/>
+            <w:tcMar>
+              <w:top w:type="dxa" w:w="40"/>
+              <w:left w:type="dxa" w:w="80"/>
+              <w:bottom w:type="dxa" w:w="40"/>
+              <w:right w:type="dxa" w:w="80"/>
+            </w:tcMar>
+            <w:vAlign w:val="center"/>
+          </w:tcPr>
+          <w:p>
+            <w:r>
+              <w:rPr>
+                <w:rFonts w:ascii="Arial" w:cs="Arial" w:eastAsia="Arial" w:hAnsi="Arial"/>
+                <w:b/>
+                <w:bCs/>
+                <w:color w:val="2C2C2C"/>
+                <w:sz w:val="18"/>
+                <w:szCs w:val="18"/>
+              </w:rPr>
+              <w:t xml:space="preserve">Assisted Pull-Up (Baseline Reference — Not Yet Progressing)</w:t>
+            </w:r>
+          </w:p>
+          <w:p>
+            <w:r>
+              <w:rPr>
+                <w:rFonts w:ascii="Arial" w:cs="Arial" w:eastAsia="Arial" w:hAnsi="Arial"/>
+                <w:i/>
+                <w:iCs/>
+                <w:color w:val="B71C1C"/>
+                <w:sz w:val="14"/>
+                <w:szCs w:val="14"/>
+              </w:rPr>
               <w:t xml:space="preserve">Gated — hold at tested baseline until scapular criteria above are consistently met</w:t>
             </w:r>
           </w:p>
@@ -6474,7 +6716,7 @@
               <w:bottom w:val="none" w:color="FFFFFF" w:sz="0"/>
               <w:right w:val="none" w:color="FFFFFF" w:sz="0"/>
             </w:tcBorders>
-            <w:shd w:fill="FFFFFF" w:color="auto" w:val="clear"/>
+            <w:shd w:fill="F8F4FB" w:color="auto" w:val="clear"/>
             <w:tcMar>
               <w:top w:type="dxa" w:w="40"/>
               <w:left w:type="dxa" w:w="80"/>
@@ -6507,7 +6749,7 @@
               <w:bottom w:val="none" w:color="FFFFFF" w:sz="0"/>
               <w:right w:val="none" w:color="FFFFFF" w:sz="0"/>
             </w:tcBorders>
-            <w:shd w:fill="FFFFFF" w:color="auto" w:val="clear"/>
+            <w:shd w:fill="F8F4FB" w:color="auto" w:val="clear"/>
             <w:tcMar>
               <w:top w:type="dxa" w:w="40"/>
               <w:left w:type="dxa" w:w="80"/>
@@ -6540,7 +6782,7 @@
               <w:bottom w:val="none" w:color="FFFFFF" w:sz="0"/>
               <w:right w:val="none" w:color="FFFFFF" w:sz="0"/>
             </w:tcBorders>
-            <w:shd w:fill="FFFFFF" w:color="auto" w:val="clear"/>
+            <w:shd w:fill="F8F4FB" w:color="auto" w:val="clear"/>
             <w:tcMar>
               <w:top w:type="dxa" w:w="40"/>
               <w:left w:type="dxa" w:w="80"/>
@@ -6573,7 +6815,7 @@
               <w:bottom w:val="none" w:color="FFFFFF" w:sz="0"/>
               <w:right w:val="none" w:color="FFFFFF" w:sz="0"/>
             </w:tcBorders>
-            <w:shd w:fill="FFFFFF" w:color="auto" w:val="clear"/>
+            <w:shd w:fill="F8F4FB" w:color="auto" w:val="clear"/>
             <w:tcMar>
               <w:top w:type="dxa" w:w="40"/>
               <w:left w:type="dxa" w:w="80"/>
@@ -6606,7 +6848,7 @@
               <w:bottom w:val="none" w:color="FFFFFF" w:sz="0"/>
               <w:right w:val="none" w:color="FFFFFF" w:sz="0"/>
             </w:tcBorders>
-            <w:shd w:fill="FFFFFF" w:color="auto" w:val="clear"/>
+            <w:shd w:fill="F8F4FB" w:color="auto" w:val="clear"/>
             <w:tcMar>
               <w:top w:type="dxa" w:w="40"/>
               <w:left w:type="dxa" w:w="80"/>
@@ -6639,7 +6881,7 @@
               <w:bottom w:val="none" w:color="FFFFFF" w:sz="0"/>
               <w:right w:val="none" w:color="FFFFFF" w:sz="0"/>
             </w:tcBorders>
-            <w:shd w:fill="FFFFFF" w:color="auto" w:val="clear"/>
+            <w:shd w:fill="F8F4FB" w:color="auto" w:val="clear"/>
             <w:tcMar>
               <w:top w:type="dxa" w:w="40"/>
               <w:left w:type="dxa" w:w="80"/>
@@ -7225,6 +7467,248 @@
                 <w:szCs w:val="14"/>
               </w:rPr>
               <w:t xml:space="preserve">  2 RIR</w:t>
+            </w:r>
+          </w:p>
+        </w:tc>
+      </w:tr>
+      <w:tr>
+        <w:tc>
+          <w:tcPr>
+            <w:tcW w:type="dxa" w:w="2400"/>
+            <w:tcBorders>
+              <w:top w:val="none" w:color="FFFFFF" w:sz="0"/>
+              <w:left w:val="none" w:color="FFFFFF" w:sz="0"/>
+              <w:bottom w:val="none" w:color="FFFFFF" w:sz="0"/>
+              <w:right w:val="none" w:color="FFFFFF" w:sz="0"/>
+            </w:tcBorders>
+            <w:shd w:fill="FFFFFF" w:color="auto" w:val="clear"/>
+            <w:tcMar>
+              <w:top w:type="dxa" w:w="40"/>
+              <w:left w:type="dxa" w:w="80"/>
+              <w:bottom w:type="dxa" w:w="40"/>
+              <w:right w:type="dxa" w:w="80"/>
+            </w:tcMar>
+            <w:vAlign w:val="center"/>
+          </w:tcPr>
+          <w:p>
+            <w:r>
+              <w:rPr>
+                <w:rFonts w:ascii="Arial" w:cs="Arial" w:eastAsia="Arial" w:hAnsi="Arial"/>
+                <w:b/>
+                <w:bCs/>
+                <w:color w:val="2C2C2C"/>
+                <w:sz w:val="18"/>
+                <w:szCs w:val="18"/>
+              </w:rPr>
+              <w:t xml:space="preserve">Plank Shoulder Taps (Static Hold)</w:t>
+            </w:r>
+          </w:p>
+          <w:p>
+            <w:r>
+              <w:rPr>
+                <w:rFonts w:ascii="Arial" w:cs="Arial" w:eastAsia="Arial" w:hAnsi="Arial"/>
+                <w:i/>
+                <w:iCs/>
+                <w:color w:val="B71C1C"/>
+                <w:sz w:val="14"/>
+                <w:szCs w:val="14"/>
+              </w:rPr>
+              <w:t xml:space="preserve">Left shoulder — regress to quadruped position if the plank loads it painfully</w:t>
+            </w:r>
+          </w:p>
+        </w:tc>
+        <w:tc>
+          <w:tcPr>
+            <w:tcW w:type="dxa" w:w="380"/>
+            <w:tcBorders>
+              <w:top w:val="none" w:color="FFFFFF" w:sz="0"/>
+              <w:left w:val="none" w:color="FFFFFF" w:sz="0"/>
+              <w:bottom w:val="none" w:color="FFFFFF" w:sz="0"/>
+              <w:right w:val="none" w:color="FFFFFF" w:sz="0"/>
+            </w:tcBorders>
+            <w:shd w:fill="FFFFFF" w:color="auto" w:val="clear"/>
+            <w:tcMar>
+              <w:top w:type="dxa" w:w="40"/>
+              <w:left w:type="dxa" w:w="80"/>
+              <w:bottom w:type="dxa" w:w="40"/>
+              <w:right w:type="dxa" w:w="80"/>
+            </w:tcMar>
+            <w:vAlign w:val="center"/>
+          </w:tcPr>
+          <w:p>
+            <w:pPr>
+              <w:jc w:val="center"/>
+            </w:pPr>
+            <w:r>
+              <w:rPr>
+                <w:rFonts w:ascii="Arial" w:cs="Arial" w:eastAsia="Arial" w:hAnsi="Arial"/>
+                <w:color w:val="6B6B6B"/>
+                <w:sz w:val="15"/>
+                <w:szCs w:val="15"/>
+              </w:rPr>
+              <w:t xml:space="preserve">2</w:t>
+            </w:r>
+          </w:p>
+        </w:tc>
+        <w:tc>
+          <w:tcPr>
+            <w:tcW w:type="dxa" w:w="420"/>
+            <w:tcBorders>
+              <w:top w:val="none" w:color="FFFFFF" w:sz="0"/>
+              <w:left w:val="none" w:color="FFFFFF" w:sz="0"/>
+              <w:bottom w:val="none" w:color="FFFFFF" w:sz="0"/>
+              <w:right w:val="none" w:color="FFFFFF" w:sz="0"/>
+            </w:tcBorders>
+            <w:shd w:fill="FFFFFF" w:color="auto" w:val="clear"/>
+            <w:tcMar>
+              <w:top w:type="dxa" w:w="40"/>
+              <w:left w:type="dxa" w:w="80"/>
+              <w:bottom w:type="dxa" w:w="40"/>
+              <w:right w:type="dxa" w:w="80"/>
+            </w:tcMar>
+            <w:vAlign w:val="center"/>
+          </w:tcPr>
+          <w:p>
+            <w:pPr>
+              <w:jc w:val="center"/>
+            </w:pPr>
+            <w:r>
+              <w:rPr>
+                <w:rFonts w:ascii="Arial" w:cs="Arial" w:eastAsia="Arial" w:hAnsi="Arial"/>
+                <w:color w:val="6B6B6B"/>
+                <w:sz w:val="15"/>
+                <w:szCs w:val="15"/>
+              </w:rPr>
+              <w:t xml:space="preserve">8-10 taps/side</w:t>
+            </w:r>
+          </w:p>
+        </w:tc>
+        <w:tc>
+          <w:tcPr>
+            <w:tcW w:type="dxa" w:w="680"/>
+            <w:tcBorders>
+              <w:top w:val="none" w:color="FFFFFF" w:sz="0"/>
+              <w:left w:val="none" w:color="FFFFFF" w:sz="0"/>
+              <w:bottom w:val="none" w:color="FFFFFF" w:sz="0"/>
+              <w:right w:val="none" w:color="FFFFFF" w:sz="0"/>
+            </w:tcBorders>
+            <w:shd w:fill="FFFFFF" w:color="auto" w:val="clear"/>
+            <w:tcMar>
+              <w:top w:type="dxa" w:w="40"/>
+              <w:left w:type="dxa" w:w="80"/>
+              <w:bottom w:type="dxa" w:w="40"/>
+              <w:right w:type="dxa" w:w="80"/>
+            </w:tcMar>
+            <w:vAlign w:val="center"/>
+          </w:tcPr>
+          <w:p>
+            <w:pPr>
+              <w:jc w:val="center"/>
+            </w:pPr>
+            <w:r>
+              <w:rPr>
+                <w:rFonts w:ascii="Arial" w:cs="Arial" w:eastAsia="Arial" w:hAnsi="Arial"/>
+                <w:color w:val="6B6B6B"/>
+                <w:sz w:val="15"/>
+                <w:szCs w:val="15"/>
+              </w:rPr>
+              <w:t xml:space="preserve">bodyweight</w:t>
+            </w:r>
+          </w:p>
+        </w:tc>
+        <w:tc>
+          <w:tcPr>
+            <w:tcW w:type="dxa" w:w="540"/>
+            <w:tcBorders>
+              <w:top w:val="none" w:color="FFFFFF" w:sz="0"/>
+              <w:left w:val="none" w:color="FFFFFF" w:sz="0"/>
+              <w:bottom w:val="none" w:color="FFFFFF" w:sz="0"/>
+              <w:right w:val="none" w:color="FFFFFF" w:sz="0"/>
+            </w:tcBorders>
+            <w:shd w:fill="FFFFFF" w:color="auto" w:val="clear"/>
+            <w:tcMar>
+              <w:top w:type="dxa" w:w="40"/>
+              <w:left w:type="dxa" w:w="80"/>
+              <w:bottom w:type="dxa" w:w="40"/>
+              <w:right w:type="dxa" w:w="80"/>
+            </w:tcMar>
+            <w:vAlign w:val="center"/>
+          </w:tcPr>
+          <w:p>
+            <w:pPr>
+              <w:jc w:val="center"/>
+            </w:pPr>
+            <w:r>
+              <w:rPr>
+                <w:rFonts w:ascii="Arial" w:cs="Arial" w:eastAsia="Arial" w:hAnsi="Arial"/>
+                <w:color w:val="6B6B6B"/>
+                <w:sz w:val="15"/>
+                <w:szCs w:val="15"/>
+              </w:rPr>
+              <w:t xml:space="preserve">slow, controlled</w:t>
+            </w:r>
+          </w:p>
+        </w:tc>
+        <w:tc>
+          <w:tcPr>
+            <w:tcW w:type="dxa" w:w="440"/>
+            <w:tcBorders>
+              <w:top w:val="none" w:color="FFFFFF" w:sz="0"/>
+              <w:left w:val="none" w:color="FFFFFF" w:sz="0"/>
+              <w:bottom w:val="none" w:color="FFFFFF" w:sz="0"/>
+              <w:right w:val="none" w:color="FFFFFF" w:sz="0"/>
+            </w:tcBorders>
+            <w:shd w:fill="FFFFFF" w:color="auto" w:val="clear"/>
+            <w:tcMar>
+              <w:top w:type="dxa" w:w="40"/>
+              <w:left w:type="dxa" w:w="80"/>
+              <w:bottom w:type="dxa" w:w="40"/>
+              <w:right w:type="dxa" w:w="80"/>
+            </w:tcMar>
+            <w:vAlign w:val="center"/>
+          </w:tcPr>
+          <w:p>
+            <w:pPr>
+              <w:jc w:val="center"/>
+            </w:pPr>
+            <w:r>
+              <w:rPr>
+                <w:rFonts w:ascii="Arial" w:cs="Arial" w:eastAsia="Arial" w:hAnsi="Arial"/>
+                <w:color w:val="6B6B6B"/>
+                <w:sz w:val="15"/>
+                <w:szCs w:val="15"/>
+              </w:rPr>
+              <w:t xml:space="preserve">45s</w:t>
+            </w:r>
+          </w:p>
+        </w:tc>
+        <w:tc>
+          <w:tcPr>
+            <w:tcW w:type="dxa" w:w="5580"/>
+            <w:tcBorders>
+              <w:top w:val="none" w:color="FFFFFF" w:sz="0"/>
+              <w:left w:val="none" w:color="FFFFFF" w:sz="0"/>
+              <w:bottom w:val="none" w:color="FFFFFF" w:sz="0"/>
+              <w:right w:val="none" w:color="FFFFFF" w:sz="0"/>
+            </w:tcBorders>
+            <w:shd w:fill="FFFFFF" w:color="auto" w:val="clear"/>
+            <w:tcMar>
+              <w:top w:type="dxa" w:w="40"/>
+              <w:left w:type="dxa" w:w="80"/>
+              <w:bottom w:type="dxa" w:w="40"/>
+              <w:right w:type="dxa" w:w="80"/>
+            </w:tcMar>
+            <w:vAlign w:val="center"/>
+          </w:tcPr>
+          <w:p>
+            <w:r>
+              <w:rPr>
+                <w:rFonts w:ascii="Arial" w:cs="Arial" w:eastAsia="Arial" w:hAnsi="Arial"/>
+                <w:color w:val="6B6B6B"/>
+                <w:sz w:val="17"/>
+                <w:szCs w:val="17"/>
+              </w:rPr>
+              <w:t xml:space="preserve">Hold the push-up position, hips level — tap slow, the hold is the exercise. Anchors the shoulder closed-chain right after pressing.</w:t>
             </w:r>
           </w:p>
         </w:tc>

</xml_diff>

<commit_message>
Apply Block Method slot 6 (Third Compound — Integration) to the Siobhan Hansen pilot
Day 1 gains a right-led Suitcase Carry integration block (pelvic floor
callout now fires on all 3 days), Day 2 gains a light Hinge-to-Carry
Complex with the standard left-hip flag, Day 3's carries/core/power
blocks retitled as its integration work. Carry/complex work stated as
distance/quality-governed, no RIR target. Both documents regenerated
and verified via python-docx; Client View leak-swept clean.

Co-Authored-By: Claude Fable 5 <noreply@anthropic.com>
Claude-Session: https://claude.ai/code/session_01VTRA12TAy4P16NRVKS4SK5
</commit_message>
<xml_diff>
--- a/clients/siobhan_hansen/Siobhan_Hansen_3Day_Training_Plan.docx
+++ b/clients/siobhan_hansen/Siobhan_Hansen_3Day_Training_Plan.docx
@@ -2961,7 +2961,7 @@
           <w:sz w:val="17"/>
           <w:szCs w:val="17"/>
         </w:rPr>
-        <w:t xml:space="preserve">Arms: Left 7 lbs / Right 6.2 lbs — a 0.8 lb gap, roughly 11% relative to the larger side. RIGHT arm is weaker (lower LST) and leads every unilateral rowing/pressing exercise across this program (Single-Arm Row, Day 1; Suitcase Carry, Day 3 — the weaker hand holds the load, per the Asymmetry Protocol's coaching convention). Legs: Left 12.7 lbs / Right 13.5 lbs — also a 0.8 lb gap, roughly 6% relative to the larger side. LEFT leg continues to lead every unilateral leg exercise (Single-Leg Stance Squat and Single-Leg RDL, Day 2; carried forward into Day 3's activation work), with this gap tracked closely at the 8-week Styku rescan to confirm the lead assignment still reflects a real, worth-addressing difference. Reps/loads are logged per side throughout.</w:t>
+        <w:t xml:space="preserve">Arms: Left 7 lbs / Right 6.2 lbs — a 0.8 lb gap, roughly 11% relative to the larger side. RIGHT arm is weaker (lower LST) and leads every unilateral rowing/pressing exercise across this program (Single-Arm Row, Day 1; Suitcase Carry, Days 1 and 3 — the weaker hand holds the load, per the Asymmetry Protocol's coaching convention). Legs: Left 12.7 lbs / Right 13.5 lbs — also a 0.8 lb gap, roughly 6% relative to the larger side. LEFT leg continues to lead every unilateral leg exercise (Single-Leg Stance Squat and Single-Leg RDL, Day 2; carried forward into Day 3's activation work), with this gap tracked closely at the 8-week Styku rescan to confirm the lead assignment still reflects a real, worth-addressing difference. Reps/loads are logged per side throughout.</w:t>
       </w:r>
     </w:p>
     <w:p>
@@ -2986,7 +2986,7 @@
           <w:sz w:val="17"/>
           <w:szCs w:val="17"/>
         </w:rPr>
-        <w:t xml:space="preserve">At 59, Siobhan sits within CLAUDE.md's 55-65 "Postmenopausal" Age Bracket. isPostmenopausal is a confirmed, already-documented fact (not inferred from today's build), so pelvicFloorCallout() fires automatically on every day containing squat, deadlift/RDL, hip-thrust, or carry content — Days 2 and 3 in this program — and is left to fire naturally throughout, never suppressed. Protein escalates to the upper end of the 1.6-2.2 g/kg range on ALST At-Risk grounds (CLAUDE.md's Protein Targets section, corrected 8/17/2026 — the target is now context-driven [energy deficit / heavy training load / ALST At-Risk], not an age-band escalation; she qualifies on ALST At-Risk alone, independent of her age): at her 53.5 kg bodyweight that resolves to 107-118g/day, matching her already-documented protein target exactly — no number changed, only the stated rationale. Creatine is strongly indicated. LIFTMOR-style bone-loading candidacy (T-score &lt; -1.0) is worth screening for as part of ongoing care, though no DEXA/T-score data is currently on file to confirm candidacy either way.</w:t>
+        <w:t xml:space="preserve">At 59, Siobhan sits within CLAUDE.md's 55-65 "Postmenopausal" Age Bracket. isPostmenopausal is a confirmed, already-documented fact (not inferred from today's build), so pelvicFloorCallout() fires automatically on every day containing squat, deadlift/RDL, hip-thrust, or carry content — all three days in this program, since the 8/18/2026 integration blocks brought carry content to Day 1 (previously Days 2-3 only) — and is left to fire naturally throughout, never suppressed. Protein escalates to the upper end of the 1.6-2.2 g/kg range on ALST At-Risk grounds (CLAUDE.md's Protein Targets section, corrected 8/17/2026 — the target is now context-driven [energy deficit / heavy training load / ALST At-Risk], not an age-band escalation; she qualifies on ALST At-Risk alone, independent of her age): at her 53.5 kg bodyweight that resolves to 107-118g/day, matching her already-documented protein target exactly — no number changed, only the stated rationale. Creatine is strongly indicated. LIFTMOR-style bone-loading candidacy (T-score &lt; -1.0) is worth screening for as part of ongoing care, though no DEXA/T-score data is currently on file to confirm candidacy either way.</w:t>
       </w:r>
     </w:p>
     <w:p>
@@ -3102,7 +3102,7 @@
           <w:sz w:val="17"/>
           <w:szCs w:val="17"/>
         </w:rPr>
-        <w:t xml:space="preserve">Session Architecture — ICONS Block Method Pilot (8/18/2026):  </w:t>
+        <w:t xml:space="preserve">Session Architecture — ICONS Block Method Pilot (8/18/2026, incl. Slot 6):  </w:t>
       </w:r>
       <w:r>
         <w:rPr>
@@ -3111,7 +3111,7 @@
           <w:sz w:val="17"/>
           <w:szCs w:val="17"/>
         </w:rPr>
-        <w:t xml:space="preserve">This document is the roster pilot for the ICONS Block Method standing session architecture (Corrective → Primary Compound → Accessory → Jason's Exercise → Secondary Compound; see CLAUDE.md). Restructure is organizational only — every clinical element (left-hip tendinitis flags on all 6 hip-loaded exercises, shoulder reintroduction protocol, scapular gate, both asymmetry leads, pelvic-floor auto-fire on Days 2-3, protein bar on all days) and every Wk1→Wk4 load survives verbatim. What moved: Day 1 — Incline Push-Up promoted to the accessory slot ahead of the pull block (1 RIR per corrected accessory tier); slot 4 omitted (all Jason content consumed by the corrective slot; a slot-4 Floor Row would stack 3 consecutive pulls, and adding hip-side Jason work to Day 1 would raise rehab-exercise frequency to 3x/week — Jason's call, not ours). Day 2 — Squat/SL Stance Squat split into primary/accessory blocks; Floor Row on Foam Roller added as the Jason slot (2nd weekly touch of the postural finding, antagonist break between squat and hinge patterns). Day 3 — Hex DL/Hip Thrust split into primary/accessory blocks (Hex DL RIR aligned to 2 RIR primary default); I's-T's-W's added as the Jason slot priming the check-in; check-in reframed as the secondary compound; carries/core/power/finisher retained as post-architecture standing blocks (no named slot in the five-slot format — a pilot friction finding). Accessory-slot RIR held at 2 (not the 1-RIR default) on both hip-flagged accessories (SL Stance Squat, Hip Thrust) as a deliberate clinical override during active tendinitis rehab.</w:t>
+        <w:t xml:space="preserve">This document is the roster pilot for the ICONS Block Method standing session architecture (Corrective → Primary Compound → Accessory → Jason's Exercise → Secondary Compound → Third Compound — Integration; see CLAUDE.md — the sixth slot was added 8/18/2026, same day as the pilot, and is applied here too). Restructure is organizational only — every clinical element (left-hip tendinitis flags on all 6 originally hip-loaded exercises, shoulder reintroduction protocol, scapular gate, both asymmetry leads, protein bar on all days) and every Wk1→Wk4 load survives verbatim. Five-slot mapping: Day 1 — Incline Push-Up promoted to the accessory slot ahead of the pull block (1 RIR per corrected accessory tier); slot 4 omitted (all Jason content consumed by the corrective slot; a slot-4 Floor Row would stack 3 consecutive pulls, and adding hip-side Jason work to Day 1 would raise rehab-exercise frequency to 3x/week — Jason's call, not ours). Day 2 — Squat/SL Stance Squat split into primary/accessory blocks; Floor Row on Foam Roller added as the Jason slot (2nd weekly touch of the postural finding, antagonist break between squat and hinge patterns). Day 3 — Hex DL/Hip Thrust split into primary/accessory blocks (Hex DL RIR aligned to 2 RIR primary default); I's-T's-W's added as the Jason slot priming the check-in; check-in reframed as the secondary compound. Accessory-slot RIR held at 2 (not the 1-RIR default) on both hip-flagged accessories (SL Stance Squat, Hip Thrust) as a deliberate clinical override during active tendinitis rehab. SLOT 6 (Third Compound — Integration, applied fifth pass same day — resolves the pilot's original "carries/core/power have no named slot" friction finding): Day 1 gains Block F, Suitcase Carry right-led (15-20 lbs, anchored to the Day 3 suitcase prescription/tested Farmers Carry baseline, no invented number) — this brings carry content to Day 1, so pelvicFloorCallout() now auto-fires on ALL THREE days (previously 2-3 only; correct per the amended spec, not a bug). Day 2 gains Block F, Hinge-to-Carry Complex (DB Deadlift x5 → Farmers Carry, 2 sets, deliberately light 15-20 lbs/hand — integrates the day's patterns into braced gait without adding heavy hip-extension volume during active rehab; carries the standard left-hip flag, making 7 flagged hip-loaded exercises total). Day 3's Blocks F/G/H (carries/core/power) retitled as its integration work, content unchanged except Farmers Carry rirNote aligned from '2 RIR' to the carry convention. All carry/complex work is distance/quality-governed with no RIR target, stated per exercise. Metabolic finishers still close each day after the integration work.</w:t>
       </w:r>
     </w:p>
     <w:p>
@@ -3455,6 +3455,31 @@
     </w:p>
     <w:p>
       <w:pPr>
+        <w:spacing w:after="100"/>
+      </w:pPr>
+      <w:r>
+        <w:rPr>
+          <w:rFonts w:ascii="Arial" w:cs="Arial" w:eastAsia="Arial" w:hAnsi="Arial"/>
+          <w:b/>
+          <w:bCs/>
+          <w:color w:val="E65100"/>
+          <w:sz w:val="17"/>
+          <w:szCs w:val="17"/>
+        </w:rPr>
+        <w:t xml:space="preserve">Pelvic Floor Safety Note:  </w:t>
+      </w:r>
+      <w:r>
+        <w:rPr>
+          <w:rFonts w:ascii="Arial" w:cs="Arial" w:eastAsia="Arial" w:hAnsi="Arial"/>
+          <w:color w:val="2C2C2C"/>
+          <w:sz w:val="17"/>
+          <w:szCs w:val="17"/>
+        </w:rPr>
+        <w:t xml:space="preserve">Match your bracing to the load: breathe freely on lighter sets, exhale on exertion as your default, and use a brief, controlled brace on your heaviest working sets. If you experience any leaking, heaviness, or pressure, stop and flag your coach. This is common and treatable.</w:t>
+      </w:r>
+    </w:p>
+    <w:p>
+      <w:pPr>
         <w:spacing w:after="60" w:before="120"/>
       </w:pPr>
       <w:r>
@@ -9091,11 +9116,579 @@
           <w:rFonts w:ascii="Arial" w:cs="Arial" w:eastAsia="Arial" w:hAnsi="Arial"/>
           <w:b/>
           <w:bCs/>
+          <w:color w:val="C9A227"/>
+          <w:sz w:val="17"/>
+          <w:szCs w:val="17"/>
+        </w:rPr>
+        <w:t xml:space="preserve">F — FULL-BODY INTEGRATION — SUITCASE CARRY (RIGHT-LED)</w:t>
+      </w:r>
+    </w:p>
+    <w:p>
+      <w:pPr>
+        <w:spacing w:after="80"/>
+      </w:pPr>
+      <w:r>
+        <w:rPr>
+          <w:rFonts w:ascii="Arial" w:cs="Arial" w:eastAsia="Arial" w:hAnsi="Arial"/>
+          <w:b/>
+          <w:bCs/>
+          <w:color w:val="C9A227"/>
+          <w:sz w:val="17"/>
+          <w:szCs w:val="17"/>
+        </w:rPr>
+        <w:t xml:space="preserve">Why:  </w:t>
+      </w:r>
+      <w:r>
+        <w:rPr>
+          <w:rFonts w:ascii="Arial" w:cs="Arial" w:eastAsia="Arial" w:hAnsi="Arial"/>
+          <w:color w:val="2C2C2C"/>
+          <w:sz w:val="17"/>
+          <w:szCs w:val="17"/>
+        </w:rPr>
+        <w:t xml:space="preserve">The session's closing compound — one movement that pulls today's work together: the scapular setting built in Blocks A-B, the grip and pulling strength from Block E, and the tall pressing posture from Block C, all held at once under gait. The weaker (right) hand holds the load, the same rule as Day 3's suitcase carry. Distance and movement quality govern this work, not an RIR target — add load only when every yard stays tall and level.</w:t>
+      </w:r>
+    </w:p>
+    <w:tbl>
+      <w:tblPr>
+        <w:tblW w:type="dxa" w:w="10440"/>
+        <w:tblBorders>
+          <w:top w:val="none" w:color="FFFFFF" w:sz="0"/>
+          <w:left w:val="none" w:color="FFFFFF" w:sz="0"/>
+          <w:bottom w:val="none" w:color="FFFFFF" w:sz="0"/>
+          <w:right w:val="none" w:color="FFFFFF" w:sz="0"/>
+          <w:insideH w:val="single" w:color="auto" w:sz="4"/>
+          <w:insideV w:val="single" w:color="auto" w:sz="4"/>
+        </w:tblBorders>
+      </w:tblPr>
+      <w:tblGrid>
+        <w:gridCol w:w="2400"/>
+        <w:gridCol w:w="380"/>
+        <w:gridCol w:w="420"/>
+        <w:gridCol w:w="680"/>
+        <w:gridCol w:w="540"/>
+        <w:gridCol w:w="440"/>
+        <w:gridCol w:w="5580"/>
+      </w:tblGrid>
+      <w:tr>
+        <w:tc>
+          <w:tcPr>
+            <w:tcW w:type="dxa" w:w="2400"/>
+            <w:tcBorders>
+              <w:top w:val="none" w:color="FFFFFF" w:sz="0"/>
+              <w:left w:val="none" w:color="FFFFFF" w:sz="0"/>
+              <w:bottom w:val="none" w:color="FFFFFF" w:sz="0"/>
+              <w:right w:val="none" w:color="FFFFFF" w:sz="0"/>
+            </w:tcBorders>
+            <w:shd w:fill="F5E8C0" w:color="auto" w:val="clear"/>
+            <w:tcMar>
+              <w:top w:type="dxa" w:w="40"/>
+              <w:left w:type="dxa" w:w="80"/>
+              <w:bottom w:type="dxa" w:w="40"/>
+              <w:right w:type="dxa" w:w="80"/>
+            </w:tcMar>
+            <w:vAlign w:val="center"/>
+          </w:tcPr>
+          <w:p>
+            <w:pPr>
+              <w:jc w:val="left"/>
+            </w:pPr>
+            <w:r>
+              <w:rPr>
+                <w:rFonts w:ascii="Arial" w:cs="Arial" w:eastAsia="Arial" w:hAnsi="Arial"/>
+                <w:b/>
+                <w:bCs/>
+                <w:color w:val="C9A227"/>
+                <w:sz w:val="15"/>
+                <w:szCs w:val="15"/>
+              </w:rPr>
+              <w:t xml:space="preserve">EXERCISE</w:t>
+            </w:r>
+          </w:p>
+        </w:tc>
+        <w:tc>
+          <w:tcPr>
+            <w:tcW w:type="dxa" w:w="380"/>
+            <w:tcBorders>
+              <w:top w:val="none" w:color="FFFFFF" w:sz="0"/>
+              <w:left w:val="none" w:color="FFFFFF" w:sz="0"/>
+              <w:bottom w:val="none" w:color="FFFFFF" w:sz="0"/>
+              <w:right w:val="none" w:color="FFFFFF" w:sz="0"/>
+            </w:tcBorders>
+            <w:shd w:fill="F5E8C0" w:color="auto" w:val="clear"/>
+            <w:tcMar>
+              <w:top w:type="dxa" w:w="40"/>
+              <w:left w:type="dxa" w:w="80"/>
+              <w:bottom w:type="dxa" w:w="40"/>
+              <w:right w:type="dxa" w:w="80"/>
+            </w:tcMar>
+            <w:vAlign w:val="center"/>
+          </w:tcPr>
+          <w:p>
+            <w:pPr>
+              <w:jc w:val="center"/>
+            </w:pPr>
+            <w:r>
+              <w:rPr>
+                <w:rFonts w:ascii="Arial" w:cs="Arial" w:eastAsia="Arial" w:hAnsi="Arial"/>
+                <w:b/>
+                <w:bCs/>
+                <w:color w:val="C9A227"/>
+                <w:sz w:val="13"/>
+                <w:szCs w:val="13"/>
+              </w:rPr>
+              <w:t xml:space="preserve">SETS</w:t>
+            </w:r>
+          </w:p>
+        </w:tc>
+        <w:tc>
+          <w:tcPr>
+            <w:tcW w:type="dxa" w:w="420"/>
+            <w:tcBorders>
+              <w:top w:val="none" w:color="FFFFFF" w:sz="0"/>
+              <w:left w:val="none" w:color="FFFFFF" w:sz="0"/>
+              <w:bottom w:val="none" w:color="FFFFFF" w:sz="0"/>
+              <w:right w:val="none" w:color="FFFFFF" w:sz="0"/>
+            </w:tcBorders>
+            <w:shd w:fill="F5E8C0" w:color="auto" w:val="clear"/>
+            <w:tcMar>
+              <w:top w:type="dxa" w:w="40"/>
+              <w:left w:type="dxa" w:w="80"/>
+              <w:bottom w:type="dxa" w:w="40"/>
+              <w:right w:type="dxa" w:w="80"/>
+            </w:tcMar>
+            <w:vAlign w:val="center"/>
+          </w:tcPr>
+          <w:p>
+            <w:pPr>
+              <w:jc w:val="center"/>
+            </w:pPr>
+            <w:r>
+              <w:rPr>
+                <w:rFonts w:ascii="Arial" w:cs="Arial" w:eastAsia="Arial" w:hAnsi="Arial"/>
+                <w:b/>
+                <w:bCs/>
+                <w:color w:val="C9A227"/>
+                <w:sz w:val="13"/>
+                <w:szCs w:val="13"/>
+              </w:rPr>
+              <w:t xml:space="preserve">REPS</w:t>
+            </w:r>
+          </w:p>
+        </w:tc>
+        <w:tc>
+          <w:tcPr>
+            <w:tcW w:type="dxa" w:w="680"/>
+            <w:tcBorders>
+              <w:top w:val="none" w:color="FFFFFF" w:sz="0"/>
+              <w:left w:val="none" w:color="FFFFFF" w:sz="0"/>
+              <w:bottom w:val="none" w:color="FFFFFF" w:sz="0"/>
+              <w:right w:val="none" w:color="FFFFFF" w:sz="0"/>
+            </w:tcBorders>
+            <w:shd w:fill="F5E8C0" w:color="auto" w:val="clear"/>
+            <w:tcMar>
+              <w:top w:type="dxa" w:w="40"/>
+              <w:left w:type="dxa" w:w="80"/>
+              <w:bottom w:type="dxa" w:w="40"/>
+              <w:right w:type="dxa" w:w="80"/>
+            </w:tcMar>
+            <w:vAlign w:val="center"/>
+          </w:tcPr>
+          <w:p>
+            <w:pPr>
+              <w:jc w:val="center"/>
+            </w:pPr>
+            <w:r>
+              <w:rPr>
+                <w:rFonts w:ascii="Arial" w:cs="Arial" w:eastAsia="Arial" w:hAnsi="Arial"/>
+                <w:b/>
+                <w:bCs/>
+                <w:color w:val="C9A227"/>
+                <w:sz w:val="13"/>
+                <w:szCs w:val="13"/>
+              </w:rPr>
+              <w:t xml:space="preserve">LOAD</w:t>
+            </w:r>
+          </w:p>
+        </w:tc>
+        <w:tc>
+          <w:tcPr>
+            <w:tcW w:type="dxa" w:w="540"/>
+            <w:tcBorders>
+              <w:top w:val="none" w:color="FFFFFF" w:sz="0"/>
+              <w:left w:val="none" w:color="FFFFFF" w:sz="0"/>
+              <w:bottom w:val="none" w:color="FFFFFF" w:sz="0"/>
+              <w:right w:val="none" w:color="FFFFFF" w:sz="0"/>
+            </w:tcBorders>
+            <w:shd w:fill="F5E8C0" w:color="auto" w:val="clear"/>
+            <w:tcMar>
+              <w:top w:type="dxa" w:w="40"/>
+              <w:left w:type="dxa" w:w="80"/>
+              <w:bottom w:type="dxa" w:w="40"/>
+              <w:right w:type="dxa" w:w="80"/>
+            </w:tcMar>
+            <w:vAlign w:val="center"/>
+          </w:tcPr>
+          <w:p>
+            <w:pPr>
+              <w:jc w:val="center"/>
+            </w:pPr>
+            <w:r>
+              <w:rPr>
+                <w:rFonts w:ascii="Arial" w:cs="Arial" w:eastAsia="Arial" w:hAnsi="Arial"/>
+                <w:b/>
+                <w:bCs/>
+                <w:color w:val="C9A227"/>
+                <w:sz w:val="13"/>
+                <w:szCs w:val="13"/>
+              </w:rPr>
+              <w:t xml:space="preserve">TEMPO</w:t>
+            </w:r>
+          </w:p>
+        </w:tc>
+        <w:tc>
+          <w:tcPr>
+            <w:tcW w:type="dxa" w:w="440"/>
+            <w:tcBorders>
+              <w:top w:val="none" w:color="FFFFFF" w:sz="0"/>
+              <w:left w:val="none" w:color="FFFFFF" w:sz="0"/>
+              <w:bottom w:val="none" w:color="FFFFFF" w:sz="0"/>
+              <w:right w:val="none" w:color="FFFFFF" w:sz="0"/>
+            </w:tcBorders>
+            <w:shd w:fill="F5E8C0" w:color="auto" w:val="clear"/>
+            <w:tcMar>
+              <w:top w:type="dxa" w:w="40"/>
+              <w:left w:type="dxa" w:w="80"/>
+              <w:bottom w:type="dxa" w:w="40"/>
+              <w:right w:type="dxa" w:w="80"/>
+            </w:tcMar>
+            <w:vAlign w:val="center"/>
+          </w:tcPr>
+          <w:p>
+            <w:pPr>
+              <w:jc w:val="center"/>
+            </w:pPr>
+            <w:r>
+              <w:rPr>
+                <w:rFonts w:ascii="Arial" w:cs="Arial" w:eastAsia="Arial" w:hAnsi="Arial"/>
+                <w:b/>
+                <w:bCs/>
+                <w:color w:val="C9A227"/>
+                <w:sz w:val="13"/>
+                <w:szCs w:val="13"/>
+              </w:rPr>
+              <w:t xml:space="preserve">REST</w:t>
+            </w:r>
+          </w:p>
+        </w:tc>
+        <w:tc>
+          <w:tcPr>
+            <w:tcW w:type="dxa" w:w="5580"/>
+            <w:tcBorders>
+              <w:top w:val="none" w:color="FFFFFF" w:sz="0"/>
+              <w:left w:val="none" w:color="FFFFFF" w:sz="0"/>
+              <w:bottom w:val="none" w:color="FFFFFF" w:sz="0"/>
+              <w:right w:val="none" w:color="FFFFFF" w:sz="0"/>
+            </w:tcBorders>
+            <w:shd w:fill="F5E8C0" w:color="auto" w:val="clear"/>
+            <w:tcMar>
+              <w:top w:type="dxa" w:w="40"/>
+              <w:left w:type="dxa" w:w="80"/>
+              <w:bottom w:type="dxa" w:w="40"/>
+              <w:right w:type="dxa" w:w="80"/>
+            </w:tcMar>
+            <w:vAlign w:val="center"/>
+          </w:tcPr>
+          <w:p>
+            <w:pPr>
+              <w:jc w:val="left"/>
+            </w:pPr>
+            <w:r>
+              <w:rPr>
+                <w:rFonts w:ascii="Arial" w:cs="Arial" w:eastAsia="Arial" w:hAnsi="Arial"/>
+                <w:b/>
+                <w:bCs/>
+                <w:color w:val="C9A227"/>
+                <w:sz w:val="15"/>
+                <w:szCs w:val="15"/>
+              </w:rPr>
+              <w:t xml:space="preserve">COACHING CUE</w:t>
+            </w:r>
+          </w:p>
+        </w:tc>
+      </w:tr>
+      <w:tr>
+        <w:tc>
+          <w:tcPr>
+            <w:tcW w:type="dxa" w:w="2400"/>
+            <w:tcBorders>
+              <w:top w:val="none" w:color="FFFFFF" w:sz="0"/>
+              <w:left w:val="none" w:color="FFFFFF" w:sz="0"/>
+              <w:bottom w:val="none" w:color="FFFFFF" w:sz="0"/>
+              <w:right w:val="none" w:color="FFFFFF" w:sz="0"/>
+            </w:tcBorders>
+            <w:shd w:fill="FAF3E0" w:color="auto" w:val="clear"/>
+            <w:tcMar>
+              <w:top w:type="dxa" w:w="40"/>
+              <w:left w:type="dxa" w:w="80"/>
+              <w:bottom w:type="dxa" w:w="40"/>
+              <w:right w:type="dxa" w:w="80"/>
+            </w:tcMar>
+            <w:vAlign w:val="center"/>
+          </w:tcPr>
+          <w:p>
+            <w:r>
+              <w:rPr>
+                <w:rFonts w:ascii="Arial" w:cs="Arial" w:eastAsia="Arial" w:hAnsi="Arial"/>
+                <w:b/>
+                <w:bCs/>
+                <w:color w:val="2C2C2C"/>
+                <w:sz w:val="18"/>
+                <w:szCs w:val="18"/>
+              </w:rPr>
+              <w:t xml:space="preserve">Suitcase Carry (Right-Led)</w:t>
+            </w:r>
+          </w:p>
+          <w:p>
+            <w:r>
+              <w:rPr>
+                <w:rFonts w:ascii="Arial" w:cs="Arial" w:eastAsia="Arial" w:hAnsi="Arial"/>
+                <w:i/>
+                <w:iCs/>
+                <w:color w:val="B71C1C"/>
+                <w:sz w:val="14"/>
+                <w:szCs w:val="14"/>
+              </w:rPr>
+              <w:t xml:space="preserve">Right hand holds the weight — weaker arm (Styku)</w:t>
+            </w:r>
+          </w:p>
+        </w:tc>
+        <w:tc>
+          <w:tcPr>
+            <w:tcW w:type="dxa" w:w="380"/>
+            <w:tcBorders>
+              <w:top w:val="none" w:color="FFFFFF" w:sz="0"/>
+              <w:left w:val="none" w:color="FFFFFF" w:sz="0"/>
+              <w:bottom w:val="none" w:color="FFFFFF" w:sz="0"/>
+              <w:right w:val="none" w:color="FFFFFF" w:sz="0"/>
+            </w:tcBorders>
+            <w:shd w:fill="FAF3E0" w:color="auto" w:val="clear"/>
+            <w:tcMar>
+              <w:top w:type="dxa" w:w="40"/>
+              <w:left w:type="dxa" w:w="80"/>
+              <w:bottom w:type="dxa" w:w="40"/>
+              <w:right w:type="dxa" w:w="80"/>
+            </w:tcMar>
+            <w:vAlign w:val="center"/>
+          </w:tcPr>
+          <w:p>
+            <w:pPr>
+              <w:jc w:val="center"/>
+            </w:pPr>
+            <w:r>
+              <w:rPr>
+                <w:rFonts w:ascii="Arial" w:cs="Arial" w:eastAsia="Arial" w:hAnsi="Arial"/>
+                <w:color w:val="6B6B6B"/>
+                <w:sz w:val="15"/>
+                <w:szCs w:val="15"/>
+              </w:rPr>
+              <w:t xml:space="preserve">2</w:t>
+            </w:r>
+          </w:p>
+        </w:tc>
+        <w:tc>
+          <w:tcPr>
+            <w:tcW w:type="dxa" w:w="420"/>
+            <w:tcBorders>
+              <w:top w:val="none" w:color="FFFFFF" w:sz="0"/>
+              <w:left w:val="none" w:color="FFFFFF" w:sz="0"/>
+              <w:bottom w:val="none" w:color="FFFFFF" w:sz="0"/>
+              <w:right w:val="none" w:color="FFFFFF" w:sz="0"/>
+            </w:tcBorders>
+            <w:shd w:fill="FAF3E0" w:color="auto" w:val="clear"/>
+            <w:tcMar>
+              <w:top w:type="dxa" w:w="40"/>
+              <w:left w:type="dxa" w:w="80"/>
+              <w:bottom w:type="dxa" w:w="40"/>
+              <w:right w:type="dxa" w:w="80"/>
+            </w:tcMar>
+            <w:vAlign w:val="center"/>
+          </w:tcPr>
+          <w:p>
+            <w:pPr>
+              <w:jc w:val="center"/>
+            </w:pPr>
+            <w:r>
+              <w:rPr>
+                <w:rFonts w:ascii="Arial" w:cs="Arial" w:eastAsia="Arial" w:hAnsi="Arial"/>
+                <w:color w:val="6B6B6B"/>
+                <w:sz w:val="15"/>
+                <w:szCs w:val="15"/>
+              </w:rPr>
+              <w:t xml:space="preserve">20-30 yd/side</w:t>
+            </w:r>
+          </w:p>
+        </w:tc>
+        <w:tc>
+          <w:tcPr>
+            <w:tcW w:type="dxa" w:w="680"/>
+            <w:tcBorders>
+              <w:top w:val="none" w:color="FFFFFF" w:sz="0"/>
+              <w:left w:val="none" w:color="FFFFFF" w:sz="0"/>
+              <w:bottom w:val="none" w:color="FFFFFF" w:sz="0"/>
+              <w:right w:val="none" w:color="FFFFFF" w:sz="0"/>
+            </w:tcBorders>
+            <w:shd w:fill="FAF3E0" w:color="auto" w:val="clear"/>
+            <w:tcMar>
+              <w:top w:type="dxa" w:w="40"/>
+              <w:left w:type="dxa" w:w="80"/>
+              <w:bottom w:type="dxa" w:w="40"/>
+              <w:right w:type="dxa" w:w="80"/>
+            </w:tcMar>
+            <w:vAlign w:val="center"/>
+          </w:tcPr>
+          <w:p>
+            <w:pPr>
+              <w:jc w:val="center"/>
+            </w:pPr>
+            <w:r>
+              <w:rPr>
+                <w:rFonts w:ascii="Arial" w:cs="Arial" w:eastAsia="Arial" w:hAnsi="Arial"/>
+                <w:color w:val="6B6B6B"/>
+                <w:sz w:val="15"/>
+                <w:szCs w:val="15"/>
+              </w:rPr>
+              <w:t xml:space="preserve">15-20 lbs</w:t>
+            </w:r>
+          </w:p>
+        </w:tc>
+        <w:tc>
+          <w:tcPr>
+            <w:tcW w:type="dxa" w:w="540"/>
+            <w:tcBorders>
+              <w:top w:val="none" w:color="FFFFFF" w:sz="0"/>
+              <w:left w:val="none" w:color="FFFFFF" w:sz="0"/>
+              <w:bottom w:val="none" w:color="FFFFFF" w:sz="0"/>
+              <w:right w:val="none" w:color="FFFFFF" w:sz="0"/>
+            </w:tcBorders>
+            <w:shd w:fill="FAF3E0" w:color="auto" w:val="clear"/>
+            <w:tcMar>
+              <w:top w:type="dxa" w:w="40"/>
+              <w:left w:type="dxa" w:w="80"/>
+              <w:bottom w:type="dxa" w:w="40"/>
+              <w:right w:type="dxa" w:w="80"/>
+            </w:tcMar>
+            <w:vAlign w:val="center"/>
+          </w:tcPr>
+          <w:p>
+            <w:pPr>
+              <w:jc w:val="center"/>
+            </w:pPr>
+            <w:r>
+              <w:rPr>
+                <w:rFonts w:ascii="Arial" w:cs="Arial" w:eastAsia="Arial" w:hAnsi="Arial"/>
+                <w:color w:val="6B6B6B"/>
+                <w:sz w:val="15"/>
+                <w:szCs w:val="15"/>
+              </w:rPr>
+              <w:t xml:space="preserve">controlled</w:t>
+            </w:r>
+          </w:p>
+        </w:tc>
+        <w:tc>
+          <w:tcPr>
+            <w:tcW w:type="dxa" w:w="440"/>
+            <w:tcBorders>
+              <w:top w:val="none" w:color="FFFFFF" w:sz="0"/>
+              <w:left w:val="none" w:color="FFFFFF" w:sz="0"/>
+              <w:bottom w:val="none" w:color="FFFFFF" w:sz="0"/>
+              <w:right w:val="none" w:color="FFFFFF" w:sz="0"/>
+            </w:tcBorders>
+            <w:shd w:fill="FAF3E0" w:color="auto" w:val="clear"/>
+            <w:tcMar>
+              <w:top w:type="dxa" w:w="40"/>
+              <w:left w:type="dxa" w:w="80"/>
+              <w:bottom w:type="dxa" w:w="40"/>
+              <w:right w:type="dxa" w:w="80"/>
+            </w:tcMar>
+            <w:vAlign w:val="center"/>
+          </w:tcPr>
+          <w:p>
+            <w:pPr>
+              <w:jc w:val="center"/>
+            </w:pPr>
+            <w:r>
+              <w:rPr>
+                <w:rFonts w:ascii="Arial" w:cs="Arial" w:eastAsia="Arial" w:hAnsi="Arial"/>
+                <w:color w:val="6B6B6B"/>
+                <w:sz w:val="15"/>
+                <w:szCs w:val="15"/>
+              </w:rPr>
+              <w:t xml:space="preserve">60s</w:t>
+            </w:r>
+          </w:p>
+        </w:tc>
+        <w:tc>
+          <w:tcPr>
+            <w:tcW w:type="dxa" w:w="5580"/>
+            <w:tcBorders>
+              <w:top w:val="none" w:color="FFFFFF" w:sz="0"/>
+              <w:left w:val="none" w:color="FFFFFF" w:sz="0"/>
+              <w:bottom w:val="none" w:color="FFFFFF" w:sz="0"/>
+              <w:right w:val="none" w:color="FFFFFF" w:sz="0"/>
+            </w:tcBorders>
+            <w:shd w:fill="FAF3E0" w:color="auto" w:val="clear"/>
+            <w:tcMar>
+              <w:top w:type="dxa" w:w="40"/>
+              <w:left w:type="dxa" w:w="80"/>
+              <w:bottom w:type="dxa" w:w="40"/>
+              <w:right w:type="dxa" w:w="80"/>
+            </w:tcMar>
+            <w:vAlign w:val="center"/>
+          </w:tcPr>
+          <w:p>
+            <w:r>
+              <w:rPr>
+                <w:rFonts w:ascii="Arial" w:cs="Arial" w:eastAsia="Arial" w:hAnsi="Arial"/>
+                <w:color w:val="6B6B6B"/>
+                <w:sz w:val="17"/>
+                <w:szCs w:val="17"/>
+              </w:rPr>
+              <w:t xml:space="preserve">Right hand loaded. Shoulders set, ribs stacked, resist the lean.</w:t>
+            </w:r>
+            <w:r>
+              <w:rPr>
+                <w:rFonts w:ascii="Arial" w:cs="Arial" w:eastAsia="Arial" w:hAnsi="Arial"/>
+                <w:i/>
+                <w:iCs/>
+                <w:color w:val="00695C"/>
+                <w:sz w:val="14"/>
+                <w:szCs w:val="14"/>
+              </w:rPr>
+              <w:t xml:space="preserve">  Distance &amp; quality governed — no RIR target</w:t>
+            </w:r>
+          </w:p>
+        </w:tc>
+      </w:tr>
+    </w:tbl>
+    <w:p>
+      <w:pPr>
+        <w:spacing w:after="100"/>
+      </w:pPr>
+    </w:p>
+    <w:p>
+      <w:pPr>
+        <w:spacing w:after="60" w:before="120"/>
+      </w:pPr>
+      <w:r>
+        <w:rPr>
+          <w:rFonts w:ascii="Arial" w:cs="Arial" w:eastAsia="Arial" w:hAnsi="Arial"/>
+          <w:b/>
+          <w:bCs/>
           <w:color w:val="00695C"/>
           <w:sz w:val="17"/>
           <w:szCs w:val="17"/>
         </w:rPr>
-        <w:t xml:space="preserve">F — METABOLIC FINISHER</w:t>
+        <w:t xml:space="preserve">G — METABOLIC FINISHER</w:t>
       </w:r>
     </w:p>
     <w:p>
@@ -9673,7 +10266,7 @@
           <w:sz w:val="17"/>
           <w:szCs w:val="17"/>
         </w:rPr>
-        <w:t xml:space="preserve">Overhead pressing is being actively reintroduced today, not restricted — this is progressive strengthening within her current pain-free range. Sharp or pinching pain is the stop signal; ordinary fatigue and normal soreness are fine and expected. Scapular strength work is gating her pull-up progression, not a placeholder — hold Assisted Pull-Ups at the tested baseline until the block's own criteria are consistently met.</w:t>
+        <w:t xml:space="preserve">Overhead pressing is being actively reintroduced today, not restricted — this is progressive strengthening within her current pain-free range. Sharp or pinching pain is the stop signal; ordinary fatigue and normal soreness are fine and expected. Scapular strength work is gating her pull-up progression, not a placeholder — hold Assisted Pull-Ups at the tested baseline until the block's own criteria are consistently met. The closing suitcase carry puts today's scapular and postural work to use under load — right hand holds the weight, every yard tall and level.</w:t>
       </w:r>
     </w:p>
     <w:p>
@@ -13502,7 +14095,575 @@
           <w:sz w:val="17"/>
           <w:szCs w:val="17"/>
         </w:rPr>
-        <w:t xml:space="preserve">F — METABOLIC FINISHER</w:t>
+        <w:t xml:space="preserve">F — FULL-BODY INTEGRATION — HINGE-TO-CARRY COMPLEX</w:t>
+      </w:r>
+    </w:p>
+    <w:p>
+      <w:pPr>
+        <w:spacing w:after="80"/>
+      </w:pPr>
+      <w:r>
+        <w:rPr>
+          <w:rFonts w:ascii="Arial" w:cs="Arial" w:eastAsia="Arial" w:hAnsi="Arial"/>
+          <w:b/>
+          <w:bCs/>
+          <w:color w:val="C9A227"/>
+          <w:sz w:val="17"/>
+          <w:szCs w:val="17"/>
+        </w:rPr>
+        <w:t xml:space="preserve">Why:  </w:t>
+      </w:r>
+      <w:r>
+        <w:rPr>
+          <w:rFonts w:ascii="Arial" w:cs="Arial" w:eastAsia="Arial" w:hAnsi="Arial"/>
+          <w:color w:val="2C2C2C"/>
+          <w:sz w:val="17"/>
+          <w:szCs w:val="17"/>
+        </w:rPr>
+        <w:t xml:space="preserve">The session's closing compound complex — a light hip hinge flowing straight into a loaded walk, integrating today's squat and hinge patterns into upright, braced gait. Loads stay deliberately light: this closes the session with quality movement, not more heavy hip-extension volume on a day that already carries plenty of it, out of respect for the left-hip rehab. Distance and movement quality govern this work, not an RIR target.</w:t>
+      </w:r>
+    </w:p>
+    <w:tbl>
+      <w:tblPr>
+        <w:tblW w:type="dxa" w:w="10440"/>
+        <w:tblBorders>
+          <w:top w:val="none" w:color="FFFFFF" w:sz="0"/>
+          <w:left w:val="none" w:color="FFFFFF" w:sz="0"/>
+          <w:bottom w:val="none" w:color="FFFFFF" w:sz="0"/>
+          <w:right w:val="none" w:color="FFFFFF" w:sz="0"/>
+          <w:insideH w:val="single" w:color="auto" w:sz="4"/>
+          <w:insideV w:val="single" w:color="auto" w:sz="4"/>
+        </w:tblBorders>
+      </w:tblPr>
+      <w:tblGrid>
+        <w:gridCol w:w="2400"/>
+        <w:gridCol w:w="380"/>
+        <w:gridCol w:w="420"/>
+        <w:gridCol w:w="680"/>
+        <w:gridCol w:w="540"/>
+        <w:gridCol w:w="440"/>
+        <w:gridCol w:w="5580"/>
+      </w:tblGrid>
+      <w:tr>
+        <w:tc>
+          <w:tcPr>
+            <w:tcW w:type="dxa" w:w="2400"/>
+            <w:tcBorders>
+              <w:top w:val="none" w:color="FFFFFF" w:sz="0"/>
+              <w:left w:val="none" w:color="FFFFFF" w:sz="0"/>
+              <w:bottom w:val="none" w:color="FFFFFF" w:sz="0"/>
+              <w:right w:val="none" w:color="FFFFFF" w:sz="0"/>
+            </w:tcBorders>
+            <w:shd w:fill="F5E8C0" w:color="auto" w:val="clear"/>
+            <w:tcMar>
+              <w:top w:type="dxa" w:w="40"/>
+              <w:left w:type="dxa" w:w="80"/>
+              <w:bottom w:type="dxa" w:w="40"/>
+              <w:right w:type="dxa" w:w="80"/>
+            </w:tcMar>
+            <w:vAlign w:val="center"/>
+          </w:tcPr>
+          <w:p>
+            <w:pPr>
+              <w:jc w:val="left"/>
+            </w:pPr>
+            <w:r>
+              <w:rPr>
+                <w:rFonts w:ascii="Arial" w:cs="Arial" w:eastAsia="Arial" w:hAnsi="Arial"/>
+                <w:b/>
+                <w:bCs/>
+                <w:color w:val="C9A227"/>
+                <w:sz w:val="15"/>
+                <w:szCs w:val="15"/>
+              </w:rPr>
+              <w:t xml:space="preserve">EXERCISE</w:t>
+            </w:r>
+          </w:p>
+        </w:tc>
+        <w:tc>
+          <w:tcPr>
+            <w:tcW w:type="dxa" w:w="380"/>
+            <w:tcBorders>
+              <w:top w:val="none" w:color="FFFFFF" w:sz="0"/>
+              <w:left w:val="none" w:color="FFFFFF" w:sz="0"/>
+              <w:bottom w:val="none" w:color="FFFFFF" w:sz="0"/>
+              <w:right w:val="none" w:color="FFFFFF" w:sz="0"/>
+            </w:tcBorders>
+            <w:shd w:fill="F5E8C0" w:color="auto" w:val="clear"/>
+            <w:tcMar>
+              <w:top w:type="dxa" w:w="40"/>
+              <w:left w:type="dxa" w:w="80"/>
+              <w:bottom w:type="dxa" w:w="40"/>
+              <w:right w:type="dxa" w:w="80"/>
+            </w:tcMar>
+            <w:vAlign w:val="center"/>
+          </w:tcPr>
+          <w:p>
+            <w:pPr>
+              <w:jc w:val="center"/>
+            </w:pPr>
+            <w:r>
+              <w:rPr>
+                <w:rFonts w:ascii="Arial" w:cs="Arial" w:eastAsia="Arial" w:hAnsi="Arial"/>
+                <w:b/>
+                <w:bCs/>
+                <w:color w:val="C9A227"/>
+                <w:sz w:val="13"/>
+                <w:szCs w:val="13"/>
+              </w:rPr>
+              <w:t xml:space="preserve">SETS</w:t>
+            </w:r>
+          </w:p>
+        </w:tc>
+        <w:tc>
+          <w:tcPr>
+            <w:tcW w:type="dxa" w:w="420"/>
+            <w:tcBorders>
+              <w:top w:val="none" w:color="FFFFFF" w:sz="0"/>
+              <w:left w:val="none" w:color="FFFFFF" w:sz="0"/>
+              <w:bottom w:val="none" w:color="FFFFFF" w:sz="0"/>
+              <w:right w:val="none" w:color="FFFFFF" w:sz="0"/>
+            </w:tcBorders>
+            <w:shd w:fill="F5E8C0" w:color="auto" w:val="clear"/>
+            <w:tcMar>
+              <w:top w:type="dxa" w:w="40"/>
+              <w:left w:type="dxa" w:w="80"/>
+              <w:bottom w:type="dxa" w:w="40"/>
+              <w:right w:type="dxa" w:w="80"/>
+            </w:tcMar>
+            <w:vAlign w:val="center"/>
+          </w:tcPr>
+          <w:p>
+            <w:pPr>
+              <w:jc w:val="center"/>
+            </w:pPr>
+            <w:r>
+              <w:rPr>
+                <w:rFonts w:ascii="Arial" w:cs="Arial" w:eastAsia="Arial" w:hAnsi="Arial"/>
+                <w:b/>
+                <w:bCs/>
+                <w:color w:val="C9A227"/>
+                <w:sz w:val="13"/>
+                <w:szCs w:val="13"/>
+              </w:rPr>
+              <w:t xml:space="preserve">REPS</w:t>
+            </w:r>
+          </w:p>
+        </w:tc>
+        <w:tc>
+          <w:tcPr>
+            <w:tcW w:type="dxa" w:w="680"/>
+            <w:tcBorders>
+              <w:top w:val="none" w:color="FFFFFF" w:sz="0"/>
+              <w:left w:val="none" w:color="FFFFFF" w:sz="0"/>
+              <w:bottom w:val="none" w:color="FFFFFF" w:sz="0"/>
+              <w:right w:val="none" w:color="FFFFFF" w:sz="0"/>
+            </w:tcBorders>
+            <w:shd w:fill="F5E8C0" w:color="auto" w:val="clear"/>
+            <w:tcMar>
+              <w:top w:type="dxa" w:w="40"/>
+              <w:left w:type="dxa" w:w="80"/>
+              <w:bottom w:type="dxa" w:w="40"/>
+              <w:right w:type="dxa" w:w="80"/>
+            </w:tcMar>
+            <w:vAlign w:val="center"/>
+          </w:tcPr>
+          <w:p>
+            <w:pPr>
+              <w:jc w:val="center"/>
+            </w:pPr>
+            <w:r>
+              <w:rPr>
+                <w:rFonts w:ascii="Arial" w:cs="Arial" w:eastAsia="Arial" w:hAnsi="Arial"/>
+                <w:b/>
+                <w:bCs/>
+                <w:color w:val="C9A227"/>
+                <w:sz w:val="13"/>
+                <w:szCs w:val="13"/>
+              </w:rPr>
+              <w:t xml:space="preserve">LOAD</w:t>
+            </w:r>
+          </w:p>
+        </w:tc>
+        <w:tc>
+          <w:tcPr>
+            <w:tcW w:type="dxa" w:w="540"/>
+            <w:tcBorders>
+              <w:top w:val="none" w:color="FFFFFF" w:sz="0"/>
+              <w:left w:val="none" w:color="FFFFFF" w:sz="0"/>
+              <w:bottom w:val="none" w:color="FFFFFF" w:sz="0"/>
+              <w:right w:val="none" w:color="FFFFFF" w:sz="0"/>
+            </w:tcBorders>
+            <w:shd w:fill="F5E8C0" w:color="auto" w:val="clear"/>
+            <w:tcMar>
+              <w:top w:type="dxa" w:w="40"/>
+              <w:left w:type="dxa" w:w="80"/>
+              <w:bottom w:type="dxa" w:w="40"/>
+              <w:right w:type="dxa" w:w="80"/>
+            </w:tcMar>
+            <w:vAlign w:val="center"/>
+          </w:tcPr>
+          <w:p>
+            <w:pPr>
+              <w:jc w:val="center"/>
+            </w:pPr>
+            <w:r>
+              <w:rPr>
+                <w:rFonts w:ascii="Arial" w:cs="Arial" w:eastAsia="Arial" w:hAnsi="Arial"/>
+                <w:b/>
+                <w:bCs/>
+                <w:color w:val="C9A227"/>
+                <w:sz w:val="13"/>
+                <w:szCs w:val="13"/>
+              </w:rPr>
+              <w:t xml:space="preserve">TEMPO</w:t>
+            </w:r>
+          </w:p>
+        </w:tc>
+        <w:tc>
+          <w:tcPr>
+            <w:tcW w:type="dxa" w:w="440"/>
+            <w:tcBorders>
+              <w:top w:val="none" w:color="FFFFFF" w:sz="0"/>
+              <w:left w:val="none" w:color="FFFFFF" w:sz="0"/>
+              <w:bottom w:val="none" w:color="FFFFFF" w:sz="0"/>
+              <w:right w:val="none" w:color="FFFFFF" w:sz="0"/>
+            </w:tcBorders>
+            <w:shd w:fill="F5E8C0" w:color="auto" w:val="clear"/>
+            <w:tcMar>
+              <w:top w:type="dxa" w:w="40"/>
+              <w:left w:type="dxa" w:w="80"/>
+              <w:bottom w:type="dxa" w:w="40"/>
+              <w:right w:type="dxa" w:w="80"/>
+            </w:tcMar>
+            <w:vAlign w:val="center"/>
+          </w:tcPr>
+          <w:p>
+            <w:pPr>
+              <w:jc w:val="center"/>
+            </w:pPr>
+            <w:r>
+              <w:rPr>
+                <w:rFonts w:ascii="Arial" w:cs="Arial" w:eastAsia="Arial" w:hAnsi="Arial"/>
+                <w:b/>
+                <w:bCs/>
+                <w:color w:val="C9A227"/>
+                <w:sz w:val="13"/>
+                <w:szCs w:val="13"/>
+              </w:rPr>
+              <w:t xml:space="preserve">REST</w:t>
+            </w:r>
+          </w:p>
+        </w:tc>
+        <w:tc>
+          <w:tcPr>
+            <w:tcW w:type="dxa" w:w="5580"/>
+            <w:tcBorders>
+              <w:top w:val="none" w:color="FFFFFF" w:sz="0"/>
+              <w:left w:val="none" w:color="FFFFFF" w:sz="0"/>
+              <w:bottom w:val="none" w:color="FFFFFF" w:sz="0"/>
+              <w:right w:val="none" w:color="FFFFFF" w:sz="0"/>
+            </w:tcBorders>
+            <w:shd w:fill="F5E8C0" w:color="auto" w:val="clear"/>
+            <w:tcMar>
+              <w:top w:type="dxa" w:w="40"/>
+              <w:left w:type="dxa" w:w="80"/>
+              <w:bottom w:type="dxa" w:w="40"/>
+              <w:right w:type="dxa" w:w="80"/>
+            </w:tcMar>
+            <w:vAlign w:val="center"/>
+          </w:tcPr>
+          <w:p>
+            <w:pPr>
+              <w:jc w:val="left"/>
+            </w:pPr>
+            <w:r>
+              <w:rPr>
+                <w:rFonts w:ascii="Arial" w:cs="Arial" w:eastAsia="Arial" w:hAnsi="Arial"/>
+                <w:b/>
+                <w:bCs/>
+                <w:color w:val="C9A227"/>
+                <w:sz w:val="15"/>
+                <w:szCs w:val="15"/>
+              </w:rPr>
+              <w:t xml:space="preserve">COACHING CUE</w:t>
+            </w:r>
+          </w:p>
+        </w:tc>
+      </w:tr>
+      <w:tr>
+        <w:tc>
+          <w:tcPr>
+            <w:tcW w:type="dxa" w:w="2400"/>
+            <w:tcBorders>
+              <w:top w:val="none" w:color="FFFFFF" w:sz="0"/>
+              <w:left w:val="none" w:color="FFFFFF" w:sz="0"/>
+              <w:bottom w:val="none" w:color="FFFFFF" w:sz="0"/>
+              <w:right w:val="none" w:color="FFFFFF" w:sz="0"/>
+            </w:tcBorders>
+            <w:shd w:fill="FAF3E0" w:color="auto" w:val="clear"/>
+            <w:tcMar>
+              <w:top w:type="dxa" w:w="40"/>
+              <w:left w:type="dxa" w:w="80"/>
+              <w:bottom w:type="dxa" w:w="40"/>
+              <w:right w:type="dxa" w:w="80"/>
+            </w:tcMar>
+            <w:vAlign w:val="center"/>
+          </w:tcPr>
+          <w:p>
+            <w:r>
+              <w:rPr>
+                <w:rFonts w:ascii="Arial" w:cs="Arial" w:eastAsia="Arial" w:hAnsi="Arial"/>
+                <w:b/>
+                <w:bCs/>
+                <w:color w:val="2C2C2C"/>
+                <w:sz w:val="18"/>
+                <w:szCs w:val="18"/>
+              </w:rPr>
+              <w:t xml:space="preserve">Hinge-to-Carry Complex (DB Deadlift → Farmers Carry)</w:t>
+            </w:r>
+          </w:p>
+          <w:p>
+            <w:r>
+              <w:rPr>
+                <w:rFonts w:ascii="Arial" w:cs="Arial" w:eastAsia="Arial" w:hAnsi="Arial"/>
+                <w:i/>
+                <w:iCs/>
+                <w:color w:val="B71C1C"/>
+                <w:sz w:val="14"/>
+                <w:szCs w:val="14"/>
+              </w:rPr>
+              <w:t xml:space="preserve">Left hip — active tendinitis rehab; stop at sharp/pinching pain, not fatigue</w:t>
+            </w:r>
+          </w:p>
+        </w:tc>
+        <w:tc>
+          <w:tcPr>
+            <w:tcW w:type="dxa" w:w="380"/>
+            <w:tcBorders>
+              <w:top w:val="none" w:color="FFFFFF" w:sz="0"/>
+              <w:left w:val="none" w:color="FFFFFF" w:sz="0"/>
+              <w:bottom w:val="none" w:color="FFFFFF" w:sz="0"/>
+              <w:right w:val="none" w:color="FFFFFF" w:sz="0"/>
+            </w:tcBorders>
+            <w:shd w:fill="FAF3E0" w:color="auto" w:val="clear"/>
+            <w:tcMar>
+              <w:top w:type="dxa" w:w="40"/>
+              <w:left w:type="dxa" w:w="80"/>
+              <w:bottom w:type="dxa" w:w="40"/>
+              <w:right w:type="dxa" w:w="80"/>
+            </w:tcMar>
+            <w:vAlign w:val="center"/>
+          </w:tcPr>
+          <w:p>
+            <w:pPr>
+              <w:jc w:val="center"/>
+            </w:pPr>
+            <w:r>
+              <w:rPr>
+                <w:rFonts w:ascii="Arial" w:cs="Arial" w:eastAsia="Arial" w:hAnsi="Arial"/>
+                <w:color w:val="6B6B6B"/>
+                <w:sz w:val="15"/>
+                <w:szCs w:val="15"/>
+              </w:rPr>
+              <w:t xml:space="preserve">2</w:t>
+            </w:r>
+          </w:p>
+        </w:tc>
+        <w:tc>
+          <w:tcPr>
+            <w:tcW w:type="dxa" w:w="420"/>
+            <w:tcBorders>
+              <w:top w:val="none" w:color="FFFFFF" w:sz="0"/>
+              <w:left w:val="none" w:color="FFFFFF" w:sz="0"/>
+              <w:bottom w:val="none" w:color="FFFFFF" w:sz="0"/>
+              <w:right w:val="none" w:color="FFFFFF" w:sz="0"/>
+            </w:tcBorders>
+            <w:shd w:fill="FAF3E0" w:color="auto" w:val="clear"/>
+            <w:tcMar>
+              <w:top w:type="dxa" w:w="40"/>
+              <w:left w:type="dxa" w:w="80"/>
+              <w:bottom w:type="dxa" w:w="40"/>
+              <w:right w:type="dxa" w:w="80"/>
+            </w:tcMar>
+            <w:vAlign w:val="center"/>
+          </w:tcPr>
+          <w:p>
+            <w:pPr>
+              <w:jc w:val="center"/>
+            </w:pPr>
+            <w:r>
+              <w:rPr>
+                <w:rFonts w:ascii="Arial" w:cs="Arial" w:eastAsia="Arial" w:hAnsi="Arial"/>
+                <w:color w:val="6B6B6B"/>
+                <w:sz w:val="15"/>
+                <w:szCs w:val="15"/>
+              </w:rPr>
+              <w:t xml:space="preserve">5 + 20-30 yd</w:t>
+            </w:r>
+          </w:p>
+        </w:tc>
+        <w:tc>
+          <w:tcPr>
+            <w:tcW w:type="dxa" w:w="680"/>
+            <w:tcBorders>
+              <w:top w:val="none" w:color="FFFFFF" w:sz="0"/>
+              <w:left w:val="none" w:color="FFFFFF" w:sz="0"/>
+              <w:bottom w:val="none" w:color="FFFFFF" w:sz="0"/>
+              <w:right w:val="none" w:color="FFFFFF" w:sz="0"/>
+            </w:tcBorders>
+            <w:shd w:fill="FAF3E0" w:color="auto" w:val="clear"/>
+            <w:tcMar>
+              <w:top w:type="dxa" w:w="40"/>
+              <w:left w:type="dxa" w:w="80"/>
+              <w:bottom w:type="dxa" w:w="40"/>
+              <w:right w:type="dxa" w:w="80"/>
+            </w:tcMar>
+            <w:vAlign w:val="center"/>
+          </w:tcPr>
+          <w:p>
+            <w:pPr>
+              <w:jc w:val="center"/>
+            </w:pPr>
+            <w:r>
+              <w:rPr>
+                <w:rFonts w:ascii="Arial" w:cs="Arial" w:eastAsia="Arial" w:hAnsi="Arial"/>
+                <w:color w:val="6B6B6B"/>
+                <w:sz w:val="15"/>
+                <w:szCs w:val="15"/>
+              </w:rPr>
+              <w:t xml:space="preserve">15-20 lbs/hand</w:t>
+            </w:r>
+          </w:p>
+        </w:tc>
+        <w:tc>
+          <w:tcPr>
+            <w:tcW w:type="dxa" w:w="540"/>
+            <w:tcBorders>
+              <w:top w:val="none" w:color="FFFFFF" w:sz="0"/>
+              <w:left w:val="none" w:color="FFFFFF" w:sz="0"/>
+              <w:bottom w:val="none" w:color="FFFFFF" w:sz="0"/>
+              <w:right w:val="none" w:color="FFFFFF" w:sz="0"/>
+            </w:tcBorders>
+            <w:shd w:fill="FAF3E0" w:color="auto" w:val="clear"/>
+            <w:tcMar>
+              <w:top w:type="dxa" w:w="40"/>
+              <w:left w:type="dxa" w:w="80"/>
+              <w:bottom w:type="dxa" w:w="40"/>
+              <w:right w:type="dxa" w:w="80"/>
+            </w:tcMar>
+            <w:vAlign w:val="center"/>
+          </w:tcPr>
+          <w:p>
+            <w:pPr>
+              <w:jc w:val="center"/>
+            </w:pPr>
+            <w:r>
+              <w:rPr>
+                <w:rFonts w:ascii="Arial" w:cs="Arial" w:eastAsia="Arial" w:hAnsi="Arial"/>
+                <w:color w:val="6B6B6B"/>
+                <w:sz w:val="15"/>
+                <w:szCs w:val="15"/>
+              </w:rPr>
+              <w:t xml:space="preserve">controlled</w:t>
+            </w:r>
+          </w:p>
+        </w:tc>
+        <w:tc>
+          <w:tcPr>
+            <w:tcW w:type="dxa" w:w="440"/>
+            <w:tcBorders>
+              <w:top w:val="none" w:color="FFFFFF" w:sz="0"/>
+              <w:left w:val="none" w:color="FFFFFF" w:sz="0"/>
+              <w:bottom w:val="none" w:color="FFFFFF" w:sz="0"/>
+              <w:right w:val="none" w:color="FFFFFF" w:sz="0"/>
+            </w:tcBorders>
+            <w:shd w:fill="FAF3E0" w:color="auto" w:val="clear"/>
+            <w:tcMar>
+              <w:top w:type="dxa" w:w="40"/>
+              <w:left w:type="dxa" w:w="80"/>
+              <w:bottom w:type="dxa" w:w="40"/>
+              <w:right w:type="dxa" w:w="80"/>
+            </w:tcMar>
+            <w:vAlign w:val="center"/>
+          </w:tcPr>
+          <w:p>
+            <w:pPr>
+              <w:jc w:val="center"/>
+            </w:pPr>
+            <w:r>
+              <w:rPr>
+                <w:rFonts w:ascii="Arial" w:cs="Arial" w:eastAsia="Arial" w:hAnsi="Arial"/>
+                <w:color w:val="6B6B6B"/>
+                <w:sz w:val="15"/>
+                <w:szCs w:val="15"/>
+              </w:rPr>
+              <w:t xml:space="preserve">75s</w:t>
+            </w:r>
+          </w:p>
+        </w:tc>
+        <w:tc>
+          <w:tcPr>
+            <w:tcW w:type="dxa" w:w="5580"/>
+            <w:tcBorders>
+              <w:top w:val="none" w:color="FFFFFF" w:sz="0"/>
+              <w:left w:val="none" w:color="FFFFFF" w:sz="0"/>
+              <w:bottom w:val="none" w:color="FFFFFF" w:sz="0"/>
+              <w:right w:val="none" w:color="FFFFFF" w:sz="0"/>
+            </w:tcBorders>
+            <w:shd w:fill="FAF3E0" w:color="auto" w:val="clear"/>
+            <w:tcMar>
+              <w:top w:type="dxa" w:w="40"/>
+              <w:left w:type="dxa" w:w="80"/>
+              <w:bottom w:type="dxa" w:w="40"/>
+              <w:right w:type="dxa" w:w="80"/>
+            </w:tcMar>
+            <w:vAlign w:val="center"/>
+          </w:tcPr>
+          <w:p>
+            <w:r>
+              <w:rPr>
+                <w:rFonts w:ascii="Arial" w:cs="Arial" w:eastAsia="Arial" w:hAnsi="Arial"/>
+                <w:color w:val="6B6B6B"/>
+                <w:sz w:val="17"/>
+                <w:szCs w:val="17"/>
+              </w:rPr>
+              <w:t xml:space="preserve">Hinge to pick the DBs up clean, walk tall, hinge to set down.</w:t>
+            </w:r>
+            <w:r>
+              <w:rPr>
+                <w:rFonts w:ascii="Arial" w:cs="Arial" w:eastAsia="Arial" w:hAnsi="Arial"/>
+                <w:i/>
+                <w:iCs/>
+                <w:color w:val="00695C"/>
+                <w:sz w:val="14"/>
+                <w:szCs w:val="14"/>
+              </w:rPr>
+              <w:t xml:space="preserve">  Distance &amp; quality governed — no RIR target</w:t>
+            </w:r>
+          </w:p>
+        </w:tc>
+      </w:tr>
+    </w:tbl>
+    <w:p>
+      <w:pPr>
+        <w:spacing w:after="100"/>
+      </w:pPr>
+    </w:p>
+    <w:p>
+      <w:pPr>
+        <w:spacing w:after="60" w:before="120"/>
+      </w:pPr>
+      <w:r>
+        <w:rPr>
+          <w:rFonts w:ascii="Arial" w:cs="Arial" w:eastAsia="Arial" w:hAnsi="Arial"/>
+          <w:b/>
+          <w:bCs/>
+          <w:color w:val="C9A227"/>
+          <w:sz w:val="17"/>
+          <w:szCs w:val="17"/>
+        </w:rPr>
+        <w:t xml:space="preserve">G — METABOLIC FINISHER</w:t>
       </w:r>
     </w:p>
     <w:p>
@@ -14080,7 +15241,7 @@
           <w:sz w:val="17"/>
           <w:szCs w:val="17"/>
         </w:rPr>
-        <w:t xml:space="preserve">Left leg leads every unilateral set this session — Styku shows a 0.8 lb segmental gap (12.7 vs 13.5 lbs). Track the gap at the 8-week rescan. Muscle-building remains the session's primary goal given ALST At-Risk status — no set here is filler. Left hip is in active tendinitis rehab (coordinated with Jason Bethea) — every loaded lower-body set today is pain-monitored; sharp or pinching hip pain stops the set, ordinary fatigue does not.</w:t>
+        <w:t xml:space="preserve">Left leg leads every unilateral set this session — Styku shows a 0.8 lb segmental gap (12.7 vs 13.5 lbs). Track the gap at the 8-week rescan. Muscle-building remains the session's primary goal given ALST At-Risk status — no set here is filler. Left hip is in active tendinitis rehab (coordinated with Jason Bethea) — every loaded lower-body set today is pain-monitored, including the closing hinge-to-carry complex; sharp or pinching hip pain stops the set, ordinary fatigue does not. The complex stays light on purpose — it is quality movement under load, not extra hip-extension volume.</w:t>
       </w:r>
     </w:p>
     <w:p>
@@ -17920,7 +19081,7 @@
           <w:sz w:val="17"/>
           <w:szCs w:val="17"/>
         </w:rPr>
-        <w:t xml:space="preserve">F — LOADED CARRIES — ASYMMETRY PROTOCOL</w:t>
+        <w:t xml:space="preserve">F — FULL-BODY INTEGRATION — LOADED CARRIES (ASYMMETRY PROTOCOL)</w:t>
       </w:r>
     </w:p>
     <w:p>
@@ -17945,7 +19106,7 @@
           <w:sz w:val="17"/>
           <w:szCs w:val="17"/>
         </w:rPr>
-        <w:t xml:space="preserve">Farmers Carry tested bilaterally at 25 lbs/hand. Suitcase Carry adds the Asymmetry Protocol's single-hand rule directly — the weaker (right) hand holds the load, training anti-lateral-flexion through the opposite side.</w:t>
+        <w:t xml:space="preserve">The session's closing compound work begins here — the carries pull the day's hinge and hip-extension strength into upright, braced gait. Farmers Carry tested bilaterally at 25 lbs/hand. Suitcase Carry adds the Asymmetry Protocol's single-hand rule directly — the weaker (right) hand holds the load, training anti-lateral-flexion through the opposite side. Distance and movement quality govern the carries, not an RIR target.</w:t>
       </w:r>
     </w:p>
     <w:tbl>
@@ -18451,7 +19612,7 @@
                 <w:sz w:val="14"/>
                 <w:szCs w:val="14"/>
               </w:rPr>
-              <w:t xml:space="preserve">  2 RIR</w:t>
+              <w:t xml:space="preserve">  Distance &amp; quality governed — no RIR target</w:t>
             </w:r>
           </w:p>
         </w:tc>
@@ -18717,7 +19878,7 @@
           <w:sz w:val="17"/>
           <w:szCs w:val="17"/>
         </w:rPr>
-        <w:t xml:space="preserve">G — CORE — PLANK PROTOCOL</w:t>
+        <w:t xml:space="preserve">G — FULL-BODY INTEGRATION — CORE UNDER LOAD (PLANK PROTOCOL)</w:t>
       </w:r>
     </w:p>
     <w:p>
@@ -18742,7 +19903,7 @@
           <w:sz w:val="17"/>
           <w:szCs w:val="17"/>
         </w:rPr>
-        <w:t xml:space="preserve">Progression from the tested 1:04 plank baseline, paired with anti-rotation core work supporting posture under all the compound lifts above.</w:t>
+        <w:t xml:space="preserve">Core work as part of the session's integrated close — progression from the tested 1:04 plank baseline, paired with anti-rotation work supporting posture under all the compound lifts above.</w:t>
       </w:r>
     </w:p>
     <w:tbl>
@@ -19490,7 +20651,7 @@
           <w:sz w:val="17"/>
           <w:szCs w:val="17"/>
         </w:rPr>
-        <w:t xml:space="preserve">H — POWER TRAINING — LOWER BODY (55-65 BRACKET)</w:t>
+        <w:t xml:space="preserve">H — FULL-BODY INTEGRATION — POWER EXPRESSION (55-65 BRACKET)</w:t>
       </w:r>
     </w:p>
     <w:p>
@@ -19515,7 +20676,7 @@
           <w:sz w:val="17"/>
           <w:szCs w:val="17"/>
         </w:rPr>
-        <w:t xml:space="preserve">Muscle power — moving a sub-maximal load with maximal intent — predicts functional independence and longevity in older women more strongly than strength alone, and belongs in the 55-65 bracket already, not just 65+. This is deliberately a lower-body movement, not overhead, given the shoulder reintroduction still underway in Blocks D and E. Full recovery between sets is the point — this is a velocity stimulus, not a conditioning one, so it does not compete with Block I's deliberately brief finisher below.</w:t>
+        <w:t xml:space="preserve">The final piece of the session's integrated close: a power expression of the day's lower-body work. Muscle power — moving a sub-maximal load with maximal intent — predicts functional independence and longevity in older women more strongly than strength alone, and belongs in the 55-65 bracket already, not just 65+. This is deliberately a lower-body movement, not overhead, given the shoulder reintroduction still underway in Blocks D and E. Full recovery between sets is the point — this is a velocity stimulus, not a conditioning one, so it does not compete with Block I's deliberately brief finisher below.</w:t>
       </w:r>
     </w:p>
     <w:tbl>
@@ -21076,7 +22237,7 @@
                 <w:sz w:val="14"/>
                 <w:szCs w:val="14"/>
               </w:rPr>
-              <w:t xml:space="preserve">Overhead Press · Kieser Pulldown · Single-Arm Row</w:t>
+              <w:t xml:space="preserve">Overhead Press · Kieser Pulldown · Single-Arm Row · Suitcase Carry</w:t>
             </w:r>
           </w:p>
         </w:tc>
@@ -21111,7 +22272,7 @@
                 <w:sz w:val="14"/>
                 <w:szCs w:val="14"/>
               </w:rPr>
-              <w:t xml:space="preserve">Overhead press progresses only via pain-free ROM + RIR; scapular criteria (band pull-apart 3x15, 20s dead hang) gate pull-up loading.</w:t>
+              <w:t xml:space="preserve">Overhead press progresses only via pain-free ROM + RIR; scapular criteria (band pull-apart 3x15, 20s dead hang) gate pull-up loading; closing suitcase carry right-led, quality-governed.</w:t>
             </w:r>
           </w:p>
         </w:tc>
@@ -21253,7 +22414,7 @@
                 <w:sz w:val="14"/>
                 <w:szCs w:val="14"/>
               </w:rPr>
-              <w:t xml:space="preserve">Squat · Single-Leg Stance Squat · Single-Leg RDL</w:t>
+              <w:t xml:space="preserve">Squat · Single-Leg Stance Squat · Single-Leg RDL · Hinge-to-Carry</w:t>
             </w:r>
           </w:p>
         </w:tc>
@@ -21288,7 +22449,7 @@
                 <w:sz w:val="14"/>
                 <w:szCs w:val="14"/>
               </w:rPr>
-              <w:t xml:space="preserve">Loads build off tested baselines (Squat Epley 1RM ≈29 lbs); left leg leads every unilateral set per 0.8 lb Styku gap.</w:t>
+              <w:t xml:space="preserve">Loads build off tested baselines (Squat Epley 1RM ≈29 lbs); left leg leads every unilateral set per 0.8 lb Styku gap; closing complex stays light, quality-governed.</w:t>
             </w:r>
           </w:p>
         </w:tc>

</xml_diff>

<commit_message>
Apply external review to Siobhan Hansen: surplus, deload, bone screening, sleep; Silbernagel question flagged for Jason
</commit_message>
<xml_diff>
--- a/clients/siobhan_hansen/Siobhan_Hansen_3Day_Training_Plan.docx
+++ b/clients/siobhan_hansen/Siobhan_Hansen_3Day_Training_Plan.docx
@@ -2873,6 +2873,31 @@
           <w:rFonts w:ascii="Arial" w:cs="Arial" w:eastAsia="Arial" w:hAnsi="Arial"/>
           <w:b/>
           <w:bCs/>
+          <w:color w:val="C9A227"/>
+          <w:sz w:val="17"/>
+          <w:szCs w:val="17"/>
+        </w:rPr>
+        <w:t xml:space="preserve">Eating Enough Is Part of This Program — Modest Energy Surplus:  </w:t>
+      </w:r>
+      <w:r>
+        <w:rPr>
+          <w:rFonts w:ascii="Arial" w:cs="Arial" w:eastAsia="Arial" w:hAnsi="Arial"/>
+          <w:color w:val="2C2C2C"/>
+          <w:sz w:val="17"/>
+          <w:szCs w:val="17"/>
+        </w:rPr>
+        <w:t xml:space="preserve">The protein target below (107-118g/day) supplies the building blocks; total energy decides whether the body is allowed to build with them. At 118 lbs with an At-Risk lean-mass reading, muscle-building requires eating above maintenance — protein alone cannot do it at maintenance intake or below. The working starting point is a modest, consistent surplus of roughly 350-480 calories per day above her usual maintenance intake — not a fixed rule for the full eight weeks: it gets checked against the body-composition and strength trends at the rescan and adjusted from there, the same way every load in this plan is. This is not a meal plan and not a weight-gain alarm — it is the same training-support logic as the protein and creatine targets already in place: for Siobhan specifically, given the At-Risk lean-mass reading and low body weight, eating enough is part of the training program itself, not a separate project. Given her profile, a conversation with a registered dietitian is a genuinely worthwhile option — offered here as support for making the surplus easy and sustainable, and something her coach can help arrange whenever she'd like.</w:t>
+      </w:r>
+    </w:p>
+    <w:p>
+      <w:pPr>
+        <w:spacing w:after="100"/>
+      </w:pPr>
+      <w:r>
+        <w:rPr>
+          <w:rFonts w:ascii="Arial" w:cs="Arial" w:eastAsia="Arial" w:hAnsi="Arial"/>
+          <w:b/>
+          <w:bCs/>
           <w:color w:val="E53935"/>
           <w:sz w:val="17"/>
           <w:szCs w:val="17"/>
@@ -2937,6 +2962,31 @@
           <w:szCs w:val="17"/>
         </w:rPr>
         <w:t xml:space="preserve">Lean Mass 76.9 lbs (65.3%), Fat Mass 36.4 lbs, Bone Mass 4.6 lbs, BMR 1230 cal/day, Shape Score 72/100 — "Good." VFA 70.8 cm² is tracked here as a trend indicator, not a risk-band diagnosis — worth watching directionally at the 8-week rescan alongside the composition priorities above, rather than read against a fixed cm² cutoff. BMI 17.4 is a clinical Underweight flag (&lt;18.5) regardless of the "Fit" body-fat-percentage reading — see the governing sarcopenic-profile note above for how these findings interact.</w:t>
+      </w:r>
+    </w:p>
+    <w:p>
+      <w:pPr>
+        <w:spacing w:after="100"/>
+      </w:pPr>
+      <w:r>
+        <w:rPr>
+          <w:rFonts w:ascii="Arial" w:cs="Arial" w:eastAsia="Arial" w:hAnsi="Arial"/>
+          <w:b/>
+          <w:bCs/>
+          <w:color w:val="C9A227"/>
+          <w:sz w:val="17"/>
+          <w:szCs w:val="17"/>
+        </w:rPr>
+        <w:t xml:space="preserve">Bone Density — A Conversation Worth Raising With Her Physician (Bone Investment):  </w:t>
+      </w:r>
+      <w:r>
+        <w:rPr>
+          <w:rFonts w:ascii="Arial" w:cs="Arial" w:eastAsia="Arial" w:hAnsi="Arial"/>
+          <w:color w:val="2C2C2C"/>
+          <w:sz w:val="17"/>
+          <w:szCs w:val="17"/>
+        </w:rPr>
+        <w:t xml:space="preserve">At 59, postmenopausal, and at a low body weight, two established bone-density risk factors sit together in her profile — which makes this a conversation genuinely worth raising with her physician: a clinical bone-health risk assessment (FRAX or similar) and, if her physician finds it indicated, a DXA scan. This is bone investment, not alarm — the result directly informs how her Hex Bar Deadlift and Hip Thrust work gets framed and progressed over the long term. A T-score below -1.0 would make her a candidate for a formal bone-loading progression built on exactly the lifts already in this program; a healthy reading simply confirms the current plan as it stands. Stated honestly: her current working intensities — peaking around 85% of estimated 1RM at Week 4 — sit below the &gt;85% threshold the strongest bone-loading trial evidence used, and that is exactly appropriate for where she is right now, with a shoulder reintroduction and a hip rehab both underway. A T-score result is what would shape whether, when, and how the long-term loading plan builds toward that standard. Nothing in today's program waits on the scan — her deadlift and hip-thrust work is already real, progressive bone-loading stimulus at her current level.</w:t>
       </w:r>
     </w:p>
     <w:p>
@@ -3048,6 +3098,31 @@
           <w:rFonts w:ascii="Arial" w:cs="Arial" w:eastAsia="Arial" w:hAnsi="Arial"/>
           <w:b/>
           <w:bCs/>
+          <w:color w:val="1565C0"/>
+          <w:sz w:val="17"/>
+          <w:szCs w:val="17"/>
+        </w:rPr>
+        <w:t xml:space="preserve">Planned Deload — Week 5, Directly After the Week 4 Strength Check:  </w:t>
+      </w:r>
+      <w:r>
+        <w:rPr>
+          <w:rFonts w:ascii="Arial" w:cs="Arial" w:eastAsia="Arial" w:hAnsi="Arial"/>
+          <w:color w:val="2C2C2C"/>
+          <w:sz w:val="17"/>
+          <w:szCs w:val="17"/>
+        </w:rPr>
+        <w:t xml:space="preserve">This program deliberately includes one lighter week, and it is planned, not a reaction to anything going wrong. Week 5 — immediately after the Week 4 strength check — is a structured deload: the same exercises and the same movement patterns, with sets reduced by roughly a third, every set held comfortably in the technique band (3 or more reps in reserve), and loads held at Week 3-4 levels rather than climbing — the usual add-weight rule pauses for this one week. With a shoulder in active reintroduction and a hip in active rehab, this is how the program protects both healing sites while the strength built in Weeks 1-4 consolidates. One light week costs nothing that matters: muscle built over the previous month is not lost in a single reduced-volume week — only a small edge of peak strength dips, and it returns within days of resuming. Weeks 6-8 then rebuild from the Week 4 loads toward the Week 8 retest and rescan.</w:t>
+      </w:r>
+    </w:p>
+    <w:p>
+      <w:pPr>
+        <w:spacing w:after="100"/>
+      </w:pPr>
+      <w:r>
+        <w:rPr>
+          <w:rFonts w:ascii="Arial" w:cs="Arial" w:eastAsia="Arial" w:hAnsi="Arial"/>
+          <w:b/>
+          <w:bCs/>
           <w:color w:val="C9A227"/>
           <w:sz w:val="17"/>
           <w:szCs w:val="17"/>
@@ -3098,6 +3173,31 @@
           <w:rFonts w:ascii="Arial" w:cs="Arial" w:eastAsia="Arial" w:hAnsi="Arial"/>
           <w:b/>
           <w:bCs/>
+          <w:color w:val="1565C0"/>
+          <w:sz w:val="17"/>
+          <w:szCs w:val="17"/>
+        </w:rPr>
+        <w:t xml:space="preserve">Sleep — Where the Training Turns Into Muscle:  </w:t>
+      </w:r>
+      <w:r>
+        <w:rPr>
+          <w:rFonts w:ascii="Arial" w:cs="Arial" w:eastAsia="Arial" w:hAnsi="Arial"/>
+          <w:color w:val="2C2C2C"/>
+          <w:sz w:val="17"/>
+          <w:szCs w:val="17"/>
+        </w:rPr>
+        <w:t xml:space="preserve">One quiet part of this program deserves naming: sleep. The sessions here stimulate muscle; sleep is where that muscle actually gets built — and with a shoulder and a hip both healing alongside a muscle-building priority, her recovery hours are doing real work every night, not just resting. The encouraging part runs both directions: consistent resistance training itself measurably improves sleep quality, so the plan supports the nights as much as the nights support the plan. Protect sleep the way the sessions are protected — it is part of the program, not adjacent to it.</w:t>
+      </w:r>
+    </w:p>
+    <w:p>
+      <w:pPr>
+        <w:spacing w:after="100"/>
+      </w:pPr>
+      <w:r>
+        <w:rPr>
+          <w:rFonts w:ascii="Arial" w:cs="Arial" w:eastAsia="Arial" w:hAnsi="Arial"/>
+          <w:b/>
+          <w:bCs/>
           <w:color w:val="C9A227"/>
           <w:sz w:val="17"/>
           <w:szCs w:val="17"/>
@@ -3112,6 +3212,31 @@
           <w:szCs w:val="17"/>
         </w:rPr>
         <w:t xml:space="preserve">This document is the roster pilot for the ICONS Block Method standing session architecture (Corrective → Primary Compound → Accessory → Jason's Exercise → Secondary Compound → Third Compound — Integration; see CLAUDE.md — the sixth slot was added 8/18/2026, same day as the pilot, and is applied here too). Restructure is organizational only — every clinical element (left-hip tendinitis flags on all 6 originally hip-loaded exercises, shoulder reintroduction protocol, scapular gate, both asymmetry leads, protein bar on all days) and every Wk1→Wk4 load survives verbatim. Five-slot mapping: Day 1 — Incline Push-Up promoted to the accessory slot ahead of the pull block (1 RIR per corrected accessory tier); slot 4 omitted (all Jason content consumed by the corrective slot; a slot-4 Floor Row would stack 3 consecutive pulls, and adding hip-side Jason work to Day 1 would raise rehab-exercise frequency to 3x/week — Jason's call, not ours). Day 2 — Squat/SL Stance Squat split into primary/accessory blocks; Floor Row on Foam Roller added as the Jason slot (2nd weekly touch of the postural finding, antagonist break between squat and hinge patterns). Day 3 — Hex DL/Hip Thrust split into primary/accessory blocks (Hex DL RIR aligned to 2 RIR primary default); I's-T's-W's added as the Jason slot priming the check-in; check-in reframed as the secondary compound. Accessory-slot RIR held at 2 (not the 1-RIR default) on both hip-flagged accessories (SL Stance Squat, Hip Thrust) as a deliberate clinical override during active tendinitis rehab. SLOT 6 (Third Compound — Integration, applied fifth pass same day — resolves the pilot's original "carries/core/power have no named slot" friction finding): Day 1 gains Block F, Suitcase Carry right-led (15-20 lbs, anchored to the Day 3 suitcase prescription/tested Farmers Carry baseline, no invented number) — this brings carry content to Day 1, so pelvicFloorCallout() now auto-fires on ALL THREE days (previously 2-3 only; correct per the amended spec, not a bug). Day 2 gains Block F, Hinge-to-Carry Complex (DB Deadlift x5 → Farmers Carry, 2 sets, deliberately light 15-20 lbs/hand — integrates the day's patterns into braced gait without adding heavy hip-extension volume during active rehab; carries the standard left-hip flag, making 7 flagged hip-loaded exercises total). Day 3's Blocks F/G/H (carries/core/power) retitled as its integration work, content unchanged except Farmers Carry rirNote aligned from '2 RIR' to the carry convention. All carry/complex work is distance/quality-governed with no RIR target, stated per exercise. Metabolic finishers still close each day after the integration work.</w:t>
+      </w:r>
+    </w:p>
+    <w:p>
+      <w:pPr>
+        <w:spacing w:after="100"/>
+      </w:pPr>
+      <w:r>
+        <w:rPr>
+          <w:rFonts w:ascii="Arial" w:cs="Arial" w:eastAsia="Arial" w:hAnsi="Arial"/>
+          <w:b/>
+          <w:bCs/>
+          <w:color w:val="C9A227"/>
+          <w:sz w:val="17"/>
+          <w:szCs w:val="17"/>
+        </w:rPr>
+        <w:t xml:space="preserve">Clinical Question for Jason Bethea — Graded vs. Binary Hip Pain Rule (Pending, 8/18/2026):  </w:t>
+      </w:r>
+      <w:r>
+        <w:rPr>
+          <w:rFonts w:ascii="Arial" w:cs="Arial" w:eastAsia="Arial" w:hAnsi="Arial"/>
+          <w:color w:val="2C2C2C"/>
+          <w:sz w:val="17"/>
+          <w:szCs w:val="17"/>
+        </w:rPr>
+        <w:t xml:space="preserve">Recorded from the 8/18/2026 external review of this document, for Jason Bethea via the normal SOAP-note channel — deliberately NOT applied here. Her left-hip stop-signal is currently binary (sharp/pinching pain = stop the set), which is more conservative than the evidence-based graded tendinopathy loading model (Silbernagel pain-monitoring: pain up to ~5/10 acceptable DURING loading, provided it settles within 24 hours and is not trending worse week to week). The binary rule is Jason's clinical call as the coordinating in-house PT for her active left-hip tendinitis rehab — per the never-silently-merge-clinical-conflicts rule, every instance of the sharp/pinching stop-signal language in this document stays verbatim pending his input. If he adopts a graded model, the update touches all 7 hip-flagged exercises' flag text plus the Day 2/Day 3 block intros and ICONS Notes in one pass. Status: question pending; do not change the pain rule without his documented answer.</w:t>
       </w:r>
     </w:p>
     <w:p>
@@ -22659,7 +22784,7 @@
           <w:sz w:val="17"/>
           <w:szCs w:val="17"/>
         </w:rPr>
-        <w:t xml:space="preserve">Hex Bar Deadlift toward 95 lbs x5, Squat toward 30 lbs x6-8, Hip Thrust toward 40 lbs x8, all at 2-3 RIR. Overhead Press showing genuine week-over-week pain-free ROM expansion (not a fixed load target). Scapular block criteria (band pull-apart 3x15, 20s controlled dead hang) consistently clean — first checkpoint toward reduced pull-up assistance. Left-leg single-leg RDL/stance-squat loads matched toward parity with the right within 10%.</w:t>
+        <w:t xml:space="preserve">Hex Bar Deadlift toward 95 lbs x5, Squat toward 30 lbs x6-8, Hip Thrust toward 40 lbs x8, all at 2-3 RIR. Overhead Press showing genuine week-over-week pain-free ROM expansion (not a fixed load target). Scapular block criteria (band pull-apart 3x15, 20s controlled dead hang) consistently clean — first checkpoint toward reduced pull-up assistance. Left-leg single-leg RDL/stance-squat loads matched toward parity with the right within 10%. Week 4 closes with the strength check; Week 5 that follows is the planned deload week — same exercises, reduced sets, loads held (see the deload note above) — before Weeks 6-8 rebuild.</w:t>
       </w:r>
     </w:p>
     <w:p>
@@ -22684,7 +22809,7 @@
           <w:sz w:val="17"/>
           <w:szCs w:val="17"/>
         </w:rPr>
-        <w:t xml:space="preserve">Hex Bar Deadlift, Squat, and Hip Thrust progressed from current tested baselines. Overhead Press fully pain-free through an expanded range, no sharp/pinching flags logged. Assisted Pull-Ups showing real reduced-assistance progression, gated release confirmed by scapular criteria being met. Plank hold past 1:30. Left/right leg and right/left arm LST gaps reduced from 0.8 lbs.</w:t>
+        <w:t xml:space="preserve">Hex Bar Deadlift, Squat, and Hip Thrust progressed from current tested baselines — through the Week 4 check, the planned Week 5 deload (loads held, sets reduced), and the Weeks 6-8 rebuild toward the retest. Overhead Press fully pain-free through an expanded range, no sharp/pinching flags logged. Assisted Pull-Ups showing real reduced-assistance progression, gated release confirmed by scapular criteria being met. Plank hold past 1:30. Left/right leg and right/left arm LST gaps reduced from 0.8 lbs.</w:t>
       </w:r>
     </w:p>
     <w:p>
@@ -22709,7 +22834,7 @@
           <w:sz w:val="17"/>
           <w:szCs w:val="17"/>
         </w:rPr>
-        <w:t xml:space="preserve">Rebook Styku scan at 8 weeks. Track: ALST Index trend (currently 4.66 kg/m², At-Risk — the top clinical priority), BMI trend (currently 17.4, Underweight), VFA (currently 70.8 cm², tracked as a trend indicator rather than a fixed risk band), left/right leg and right/left arm LST gaps (baseline 0.8 lbs each on both sides — right arm ~11% relative, left leg ~6% relative to the larger side; watch both directionally), lean mass (currently 76.9 lbs — build), and continued shoulder/scapular progress.</w:t>
+        <w:t xml:space="preserve">Rebook Styku scan at 8 weeks — it lands at the end of the Weeks 6-8 rebuild that follows the planned Week 5 deload, so the scan reads a fully rebuilt, consolidated block rather than a mid-deload dip. Track: ALST Index trend (currently 4.66 kg/m², At-Risk — the top clinical priority), BMI trend (currently 17.4, Underweight — read alongside the energy-surplus note above: the goal is lean-mass-driven weight gain, not weight loss), VFA (currently 70.8 cm², tracked as a trend indicator rather than a fixed risk band), left/right leg and right/left arm LST gaps (baseline 0.8 lbs each on both sides — right arm ~11% relative, left leg ~6% relative to the larger side; watch both directionally), lean mass (currently 76.9 lbs — build), and continued shoulder/scapular progress.</w:t>
       </w:r>
     </w:p>
     <w:p>

</xml_diff>

<commit_message>
Add compound-slot expert options menus to the Block Method pilot
</commit_message>
<xml_diff>
--- a/clients/siobhan_hansen/Siobhan_Hansen_3Day_Training_Plan.docx
+++ b/clients/siobhan_hansen/Siobhan_Hansen_3Day_Training_Plan.docx
@@ -3227,6 +3227,31 @@
           <w:sz w:val="17"/>
           <w:szCs w:val="17"/>
         </w:rPr>
+        <w:t xml:space="preserve">Compound-Slot Exercise Options — Selection Record (8/19/2026):  </w:t>
+      </w:r>
+      <w:r>
+        <w:rPr>
+          <w:rFonts w:ascii="Arial" w:cs="Arial" w:eastAsia="Arial" w:hAnsi="Arial"/>
+          <w:color w:val="2C2C2C"/>
+          <w:sz w:val="17"/>
+          <w:szCs w:val="17"/>
+        </w:rPr>
+        <w:t xml:space="preserve">Per CLAUDE.md's compound-slot expert-options rule (Block Method, added 8/18/2026), every compound slot in this program now carries a 2-4 option same-pattern rotation in its block intro (the Day 3 power block uses an exercise insight instead), coach-selectable by equipment, tolerance, and day readiness. All menus were filtered against her record before listing: every hip-loaded option carries the same sharp/pinching stop rule and none raises hip-loading frequency beyond what is already programmed (options substitute within a session, never add sessions); every press option sits inside the pain-free-ROM reintroduction protocol (landmine press is the standard scap-friendly first alternate; the high-incline DB press option is conditional on a clean range check that day); the band-assisted pull-up option is explicitly conditional on Block B's scapular criteria — the gate is not bypassed. Options considered and REJECTED on constraint grounds, not to be added without a record change: overhead/waiter's carry (new overhead loading outside the current reintroduction protocol), kettlebell swing as a hinge or power alternate (ballistic hip extension during active severity-4 tendinitis rehab), broad/depth-jump power alternates (impact escalation on the rehabbing hip — the useful direction is the listed no-jump step-up regression). Index-tested movements (Seated DB OHP, Squat, Single-Leg RDL, Hex Bar Deadlift, DB Hip Thrust) all remain the tracked/retested progression anchors, stated in each intro — options are per-session substitutions, never a fork in the progression.</w:t>
+      </w:r>
+    </w:p>
+    <w:p>
+      <w:pPr>
+        <w:spacing w:after="100"/>
+      </w:pPr>
+      <w:r>
+        <w:rPr>
+          <w:rFonts w:ascii="Arial" w:cs="Arial" w:eastAsia="Arial" w:hAnsi="Arial"/>
+          <w:b/>
+          <w:bCs/>
+          <w:color w:val="C9A227"/>
+          <w:sz w:val="17"/>
+          <w:szCs w:val="17"/>
+        </w:rPr>
         <w:t xml:space="preserve">Clinical Question for Jason Bethea — Graded vs. Binary Hip Pain Rule (Pending, 8/18/2026):  </w:t>
       </w:r>
       <w:r>
@@ -7097,7 +7122,7 @@
           <w:sz w:val="17"/>
           <w:szCs w:val="17"/>
         </w:rPr>
-        <w:t xml:space="preserve">Never load-tested, so there is no 1RM to build a percentage table from. Progression is autoregulated entirely by pain-free range of motion and RIR — start light, add load only when full pain-free range and 2 RIR are both met with clean form.</w:t>
+        <w:t xml:space="preserve">Never load-tested, so there is no 1RM to build a percentage table from. Progression is autoregulated entirely by pain-free range of motion and RIR — start light, add load only when full pain-free range and 2 RIR are both met with clean form. If the day calls for a variation, rotate between: a landmine press (the shoulder-friendly arc — the natural first alternate when the fully vertical line isn't clean yet), a half-kneeling single-arm DB press (light, one side at a time — right arm leads), or a high-incline DB press on a day the range check is clean. Every option lives inside the same rule as the press itself — pain-free range only, sharp or pinching pain ends the set — and the seated press stays the lift we track and retest. Whichever press runs, the plank shoulder taps that follow stay.</w:t>
       </w:r>
     </w:p>
     <w:tbl>
@@ -8462,7 +8487,7 @@
           <w:sz w:val="17"/>
           <w:szCs w:val="17"/>
         </w:rPr>
-        <w:t xml:space="preserve">The day's second compound pattern — pulling, rotating away from the pressing work above. Kieser Pulldown is her active pull-strength pathway exercise while pull-up loading stays gated — track progression in Kieser units on the same machine, not converted to a free-weight number. Single-Arm Row is led by the right arm (weaker side, per Styku LST).</w:t>
+        <w:t xml:space="preserve">The day's second compound pattern — pulling, rotating away from the pressing work above. Kieser Pulldown is her active pull-strength pathway exercise while pull-up loading stays gated — track progression in Kieser units on the same machine, not converted to a free-weight number. Single-Arm Row is led by the right arm (weaker side, per Styku LST). If the day calls for a pull variation, rotate between: a chest-supported row (torso fully supported, strict pattern), a single-arm landmine row (right arm leads, same as the DB row), or — only once Block B's scapular criteria are consistently met — a band-assisted pull-up; until then the gate governs and the Kieser Pulldown stays the vertical-pull pathway. The Kieser number remains what we track session to session.</w:t>
       </w:r>
     </w:p>
     <w:tbl>
@@ -9270,7 +9295,7 @@
           <w:sz w:val="17"/>
           <w:szCs w:val="17"/>
         </w:rPr>
-        <w:t xml:space="preserve">The session's closing compound — one movement that pulls today's work together: the scapular setting built in Blocks A-B, the grip and pulling strength from Block E, and the tall pressing posture from Block C, all held at once under gait. The weaker (right) hand holds the load, the same rule as Day 3's suitcase carry. Distance and movement quality govern this work, not an RIR target — add load only when every yard stays tall and level.</w:t>
+        <w:t xml:space="preserve">The session's closing compound — one movement that pulls today's work together: the scapular setting built in Blocks A-B, the grip and pulling strength from Block E, and the tall pressing posture from Block C, all held at once under gait. The weaker (right) hand holds the load, the same rule as Day 3's suitcase carry. Distance and movement quality govern this work, not an RIR target — add load only when every yard stays tall and level. If the day calls for a variation, a bilateral farmer carry (both hands loaded) or a goblet carry (one DB held at the chest — lighter, with an upright-posture bias) covers the same ground; any time the carry is one-sided, the right hand holds the load.</w:t>
       </w:r>
     </w:p>
     <w:tbl>
@@ -11997,7 +12022,7 @@
           <w:sz w:val="17"/>
           <w:szCs w:val="17"/>
         </w:rPr>
-        <w:t xml:space="preserve">Tested at 25 lbs x5 (Epley 1RM ≈29 lbs) — Week 1 trains at 20 lbs, climbing to 25 lbs by Week 4.</w:t>
+        <w:t xml:space="preserve">Tested at 25 lbs x5 (Epley 1RM ≈29 lbs) — Week 1 trains at 20 lbs, climbing to 25 lbs by Week 4. If the day calls for a variation — equipment, or how the hip is presenting — rotate between: a goblet squat (DB held at the chest, the easiest to keep upright), a box squat (depth set by the box — a genuinely useful choice on a day the hip is more vocal), or a supported split-stance squat (left leg leads). Every option carries the same hip rule as the squat itself — sharp or pinching pain stops the set, ordinary fatigue does not — and the squat above stays the lift we track and retest.</w:t>
       </w:r>
     </w:p>
     <w:tbl>
@@ -13677,7 +13702,7 @@
           <w:sz w:val="17"/>
           <w:szCs w:val="17"/>
         </w:rPr>
-        <w:t xml:space="preserve">The day's second compound pattern — a hip hinge, rotating off the knee-dominant squat work above. Tested at 25 lbs x5 (Epley 1RM ≈29 lbs) — Week 1 trains at 22.5 lbs/side, climbing to 25 lbs/side by Week 4. Left leg leads every set.</w:t>
+        <w:t xml:space="preserve">The day's second compound pattern — a hip hinge, rotating off the knee-dominant squat work above. Tested at 25 lbs x5 (Epley 1RM ≈29 lbs) — Week 1 trains at 22.5 lbs/side, climbing to 25 lbs/side by Week 4. Left leg leads every set. If the day calls for a variation, rotate between: a B-stance RDL (rear foot down for balance — halfway between single-leg and two-leg, left leg still does the working share), a hip hinge to a bench or target (shortened range — useful when the hip wants a smaller day), or a cable or band pull-through where available. Same hip rule on every option — sharp or pinching pain stops the set — and the single-leg RDL stays the lift we track and retest.</w:t>
       </w:r>
     </w:p>
     <w:tbl>
@@ -14245,7 +14270,7 @@
           <w:sz w:val="17"/>
           <w:szCs w:val="17"/>
         </w:rPr>
-        <w:t xml:space="preserve">The session's closing compound complex — a light hip hinge flowing straight into a loaded walk, integrating today's squat and hinge patterns into upright, braced gait. Loads stay deliberately light: this closes the session with quality movement, not more heavy hip-extension volume on a day that already carries plenty of it, out of respect for the left-hip rehab. Distance and movement quality govern this work, not an RIR target.</w:t>
+        <w:t xml:space="preserve">The session's closing compound complex — a light hip hinge flowing straight into a loaded walk, integrating today's squat and hinge patterns into upright, braced gait. Loads stay deliberately light: this closes the session with quality movement, not more heavy hip-extension volume on a day that already carries plenty of it, out of respect for the left-hip rehab. Distance and movement quality govern this work, not an RIR target. If a variation suits the day better, a goblet-squat-to-carry or a deadlift-to-suitcase-carry (right hand holds the load) closes the session the same way — always at the same deliberately light loads, same hip rule throughout.</w:t>
       </w:r>
     </w:p>
     <w:tbl>
@@ -16730,7 +16755,7 @@
           <w:sz w:val="17"/>
           <w:szCs w:val="17"/>
         </w:rPr>
-        <w:t xml:space="preserve">Her strongest tested lift. Tested at 85 lbs x5 (Epley 1RM ≈99 lbs) — Week 1 trains at 75 lbs, climbing to 85 lbs by Week 4.</w:t>
+        <w:t xml:space="preserve">Her strongest tested lift. Tested at 85 lbs x5 (Epley 1RM ≈99 lbs) — Week 1 trains at 75 lbs, climbing to 85 lbs by Week 4. If the day calls for a variation, rotate between: a conventional DB deadlift, a block or elevated pull (bar or DBs raised — a shorter range that genuinely earns its place on a day the hip is more vocal), or a sumo-stance DB deadlift (wider base, more upright torso). Same hip rule on every option — sharp or pinching pain stops the set — and the hex bar lift stays the anchor: its Week 1 → Week 4 line is what gets tracked and retested.</w:t>
       </w:r>
     </w:p>
     <w:tbl>
@@ -17298,7 +17323,7 @@
           <w:sz w:val="17"/>
           <w:szCs w:val="17"/>
         </w:rPr>
-        <w:t xml:space="preserve">The glute-building accessory directly behind the deadlift — same posterior chain, isolated harder at the hip. Tested at 35 lbs x5 (Epley 1RM ≈41 lbs) — Week 1 trains at 30 lbs, climbing to 35 lbs by Week 4. Held at 2 reps in reserve — the left-hip rehab governs how hard this is pushed, not a hypertrophy default.</w:t>
+        <w:t xml:space="preserve">The glute-building accessory directly behind the deadlift — same posterior chain, isolated harder at the hip. Tested at 35 lbs x5 (Epley 1RM ≈41 lbs) — Week 1 trains at 30 lbs, climbing to 35 lbs by Week 4. Held at 2 reps in reserve — the left-hip rehab governs how hard this is pushed, not a hypertrophy default. If the day calls for a variation, rotate between: a floor glute bridge (the simplest regression), a single-leg glute bridge (left leg leads), or a B-stance hip thrust (left leg takes the working share). Same hip monitoring on every option, and the DB hip thrust stays the lift we track and retest.</w:t>
       </w:r>
     </w:p>
     <w:tbl>
@@ -19231,7 +19256,7 @@
           <w:sz w:val="17"/>
           <w:szCs w:val="17"/>
         </w:rPr>
-        <w:t xml:space="preserve">The session's closing compound work begins here — the carries pull the day's hinge and hip-extension strength into upright, braced gait. Farmers Carry tested bilaterally at 25 lbs/hand. Suitcase Carry adds the Asymmetry Protocol's single-hand rule directly — the weaker (right) hand holds the load, training anti-lateral-flexion through the opposite side. Distance and movement quality govern the carries, not an RIR target.</w:t>
+        <w:t xml:space="preserve">The session's closing compound work begins here — the carries pull the day's hinge and hip-extension strength into upright, braced gait. Farmers Carry tested bilaterally at 25 lbs/hand. Suitcase Carry adds the Asymmetry Protocol's single-hand rule directly — the weaker (right) hand holds the load, training anti-lateral-flexion through the opposite side. Distance and movement quality govern the carries, not an RIR target. A front-rack carry (DBs held at the chest) is a third option here — it trades grip demand for an upright-posture bias; same distance-and-quality rules, and any one-sided carry stays in the right hand.</w:t>
       </w:r>
     </w:p>
     <w:tbl>
@@ -21115,6 +21140,19 @@
                 <w:szCs w:val="14"/>
               </w:rPr>
               <w:t xml:space="preserve">Left hip — active tendinitis rehab; stop at sharp/pinching pain, not fatigue</w:t>
+            </w:r>
+          </w:p>
+          <w:p>
+            <w:r>
+              <w:rPr>
+                <w:rFonts w:ascii="Arial" w:cs="Arial" w:eastAsia="Arial" w:hAnsi="Arial"/>
+                <w:i/>
+                <w:iCs/>
+                <w:color w:val="6B6B6B"/>
+                <w:sz w:val="14"/>
+                <w:szCs w:val="14"/>
+              </w:rPr>
+              <w:t xml:space="preserve">On a day the hip is more vocal, run the same box as a brisk step-up without the jump — same drive-with-intent cue, none of the landing impact. The intent is the exercise; the jump is optional.</w:t>
             </w:r>
           </w:p>
         </w:tc>

</xml_diff>

<commit_message>
Codify confirmed studio equipment inventory + reconcile Siobhan pilot
- CLAUDE.md: new STUDIO EQUIPMENT section (Xolokan's verbatim 8/19 list) with
  binding implications (no cable machine; 60 lb DB / 25 lb KB ceilings; virtual
  clients exempt), open questions (hex bar, Total Gym, landmine, cardio, incline
  bench), and roster reconciliation status from the repo-wide sweep
- icons-expert.md: inventory added as a binding build/options-menu constraint
- Siobhan Hansen: cable references removed (band pull-through option; Glute
  Kickback renamed Total Gym/Banded matching Jason's actual prescription);
  both trainer + Client View docx regenerated and verified cable-free

Co-Authored-By: Claude Fable 5 <noreply@anthropic.com>
Claude-Session: https://claude.ai/code/session_01VTRA12TAy4P16NRVKS4SK5
</commit_message>
<xml_diff>
--- a/clients/siobhan_hansen/Siobhan_Hansen_3Day_Training_Plan.docx
+++ b/clients/siobhan_hansen/Siobhan_Hansen_3Day_Training_Plan.docx
@@ -11778,7 +11778,7 @@
                 <w:sz w:val="18"/>
                 <w:szCs w:val="18"/>
               </w:rPr>
-              <w:t xml:space="preserve">Glute Kickback (Cable/Banded)</w:t>
+              <w:t xml:space="preserve">Glute Kickback (Total Gym/Banded)</w:t>
             </w:r>
           </w:p>
         </w:tc>
@@ -13702,7 +13702,7 @@
           <w:sz w:val="17"/>
           <w:szCs w:val="17"/>
         </w:rPr>
-        <w:t xml:space="preserve">The day's second compound pattern — a hip hinge, rotating off the knee-dominant squat work above. Tested at 25 lbs x5 (Epley 1RM ≈29 lbs) — Week 1 trains at 22.5 lbs/side, climbing to 25 lbs/side by Week 4. Left leg leads every set. If the day calls for a variation, rotate between: a B-stance RDL (rear foot down for balance — halfway between single-leg and two-leg, left leg still does the working share), a hip hinge to a bench or target (shortened range — useful when the hip wants a smaller day), or a cable or band pull-through where available. Same hip rule on every option — sharp or pinching pain stops the set — and the single-leg RDL stays the lift we track and retest.</w:t>
+        <w:t xml:space="preserve">The day's second compound pattern — a hip hinge, rotating off the knee-dominant squat work above. Tested at 25 lbs x5 (Epley 1RM ≈29 lbs) — Week 1 trains at 22.5 lbs/side, climbing to 25 lbs/side by Week 4. Left leg leads every set. If the day calls for a variation, rotate between: a B-stance RDL (rear foot down for balance — halfway between single-leg and two-leg, left leg still does the working share), a hip hinge to a bench or target (shortened range — useful when the hip wants a smaller day), or a band pull-through. Same hip rule on every option — sharp or pinching pain stops the set — and the single-leg RDL stays the lift we track and retest.</w:t>
       </w:r>
     </w:p>
     <w:tbl>
@@ -16511,7 +16511,7 @@
                 <w:sz w:val="18"/>
                 <w:szCs w:val="18"/>
               </w:rPr>
-              <w:t xml:space="preserve">Glute Kickback (Cable/Banded)</w:t>
+              <w:t xml:space="preserve">Glute Kickback (Total Gym/Banded)</w:t>
             </w:r>
           </w:p>
         </w:tc>

</xml_diff>